<commit_message>
Update: Methods + Tuning
Cleaned up SARIMAX and GB method descriptions
	•	Added hyperparameter tuning section with justification of parameter choices
	•	Included discussion of performance vs runtime trade-offs
	•	Updated GB parameters to match final model (max_depth = 5)
</commit_message>
<xml_diff>
--- a/report/unsw-ZZSC9020-report-2026 Group A.docx
+++ b/report/unsw-ZZSC9020-report-2026 Group A.docx
@@ -299,7 +299,7 @@
     <w:p>
       <w:pPr>
         <w:pStyle w:val="BodyText"/>
-        <w:ind w:right="289" w:firstLineChars="1020" w:firstLine="2692"/>
+        <w:ind w:right="289" w:firstLineChars="1020" w:firstLine="2678"/>
         <w:rPr>
           <w:w w:val="110"/>
         </w:rPr>
@@ -332,7 +332,7 @@
     <w:p>
       <w:pPr>
         <w:pStyle w:val="BodyText"/>
-        <w:ind w:right="289" w:firstLineChars="1020" w:firstLine="2692"/>
+        <w:ind w:right="289" w:firstLineChars="1020" w:firstLine="2678"/>
         <w:rPr>
           <w:w w:val="110"/>
         </w:rPr>
@@ -341,34 +341,20 @@
         <w:rPr>
           <w:w w:val="110"/>
         </w:rPr>
-        <w:t>Daniel Heath-</w:t>
-      </w:r>
-      <w:proofErr w:type="gramStart"/>
+        <w:t xml:space="preserve">Daniel Heath-Ogden </w:t>
+      </w:r>
       <w:r>
         <w:rPr>
           <w:w w:val="110"/>
         </w:rPr>
-        <w:t xml:space="preserve">Ogden </w:t>
-      </w:r>
-      <w:r>
-        <w:rPr>
-          <w:w w:val="110"/>
-        </w:rPr>
         <w:tab/>
-        <w:t>(</w:t>
-      </w:r>
-      <w:proofErr w:type="gramEnd"/>
-      <w:r>
-        <w:rPr>
-          <w:w w:val="110"/>
-        </w:rPr>
-        <w:t>z5623647)</w:t>
-      </w:r>
-    </w:p>
-    <w:p>
-      <w:pPr>
-        <w:pStyle w:val="BodyText"/>
-        <w:ind w:right="289" w:firstLineChars="1020" w:firstLine="2692"/>
+        <w:t>(z5623647)</w:t>
+      </w:r>
+    </w:p>
+    <w:p>
+      <w:pPr>
+        <w:pStyle w:val="BodyText"/>
+        <w:ind w:right="289" w:firstLineChars="1020" w:firstLine="2678"/>
         <w:rPr>
           <w:w w:val="110"/>
         </w:rPr>
@@ -396,7 +382,7 @@
     <w:p>
       <w:pPr>
         <w:pStyle w:val="BodyText"/>
-        <w:ind w:right="289" w:firstLineChars="1020" w:firstLine="2692"/>
+        <w:ind w:right="289" w:firstLineChars="1020" w:firstLine="2678"/>
       </w:pPr>
       <w:r>
         <w:rPr>
@@ -1502,23 +1488,7 @@
       </w:r>
       <w:proofErr w:type="gramEnd"/>
       <w:r>
-        <w:t xml:space="preserve"> I </w:t>
-      </w:r>
-      <w:proofErr w:type="gramStart"/>
-      <w:r>
-        <w:t>am agreeing</w:t>
-      </w:r>
-      <w:proofErr w:type="gramEnd"/>
-      <w:r>
-        <w:t xml:space="preserve"> </w:t>
-      </w:r>
-      <w:proofErr w:type="gramStart"/>
-      <w:r>
-        <w:t>to</w:t>
-      </w:r>
-      <w:proofErr w:type="gramEnd"/>
-      <w:r>
-        <w:t xml:space="preserve"> the statements and conditions above. </w:t>
+        <w:t xml:space="preserve"> I am agreeing to the statements and conditions above. </w:t>
       </w:r>
     </w:p>
     <w:p>
@@ -5101,21 +5071,7 @@
             <w:rStyle w:val="Hyperlink"/>
             <w:noProof/>
           </w:rPr>
-          <w:t>Why the provided ope</w:t>
-        </w:r>
-        <w:r>
-          <w:rPr>
-            <w:rStyle w:val="Hyperlink"/>
-            <w:noProof/>
-          </w:rPr>
-          <w:t>r</w:t>
-        </w:r>
-        <w:r>
-          <w:rPr>
-            <w:rStyle w:val="Hyperlink"/>
-            <w:noProof/>
-          </w:rPr>
-          <w:t>ational forecast outperforms the developed models</w:t>
+          <w:t>Why the provided operational forecast outperforms the developed models</w:t>
         </w:r>
         <w:r>
           <w:rPr>
@@ -6133,27 +6089,63 @@
         <w:jc w:val="both"/>
         <w:rPr>
           <w:w w:val="105"/>
+          <w:lang w:val="en-AU"/>
         </w:rPr>
       </w:pPr>
       <w:r>
         <w:rPr>
           <w:w w:val="105"/>
-        </w:rPr>
-        <w:t xml:space="preserve">More recently, deep learning approaches have been introduced to better capture nonlinear relationships and complex temporal dependencies in electricity demand data. Long Short-Term Memory (LSTM) networks, a type of recurrent neural network, are particularly well suited to time series forecasting due to their ability to retain information over long sequences using gated memory cells (Hochreiter &amp; </w:t>
+          <w:lang w:val="en-AU"/>
+        </w:rPr>
+        <w:t xml:space="preserve">While traditional statistical models provide a strong baseline for electricity demand forecasting, more flexible machine learning approaches have been introduced to better capture complex, non-linear relationships in the data. One such approach is gradient boosting, an ensemble learning technique that builds models sequentially by fitting decision trees to the residual errors of previous models (Friedman, 2001). This iterative process allows gradient boosting to minimise prediction errors effectively and achieve high accuracy. Compared to individual models, ensemble methods such as gradient boosting improve robustness and generalisation performance (Hastie, </w:t>
       </w:r>
       <w:proofErr w:type="spellStart"/>
       <w:r>
         <w:rPr>
           <w:w w:val="105"/>
-        </w:rPr>
-        <w:t>Schmidhuber</w:t>
+          <w:lang w:val="en-AU"/>
+        </w:rPr>
+        <w:t>Tibshirani</w:t>
       </w:r>
       <w:proofErr w:type="spellEnd"/>
       <w:r>
         <w:rPr>
           <w:w w:val="105"/>
-        </w:rPr>
-        <w:t>, 1997). In the context of electricity demand, LSTM models have shown strong performance when incorporating exogenous variables such as temperature, as well as lagged demand and calendar features. Studies such as Kong et al. (2017) and Marino et al. (2016) demonstrate that LSTMs can outperform traditional statistical models in short-term forecasting by effectively learning nonlinear demand patterns and temporal dependencies.</w:t>
+          <w:lang w:val="en-AU"/>
+        </w:rPr>
+        <w:t xml:space="preserve"> and Friedman, 2009). Modern implementations, including </w:t>
+      </w:r>
+      <w:proofErr w:type="spellStart"/>
+      <w:r>
+        <w:rPr>
+          <w:w w:val="105"/>
+          <w:lang w:val="en-AU"/>
+        </w:rPr>
+        <w:t>XGBoost</w:t>
+      </w:r>
+      <w:proofErr w:type="spellEnd"/>
+      <w:r>
+        <w:rPr>
+          <w:w w:val="105"/>
+          <w:lang w:val="en-AU"/>
+        </w:rPr>
+        <w:t xml:space="preserve"> and </w:t>
+      </w:r>
+      <w:proofErr w:type="spellStart"/>
+      <w:r>
+        <w:rPr>
+          <w:w w:val="105"/>
+          <w:lang w:val="en-AU"/>
+        </w:rPr>
+        <w:t>LightGBM</w:t>
+      </w:r>
+      <w:proofErr w:type="spellEnd"/>
+      <w:r>
+        <w:rPr>
+          <w:w w:val="105"/>
+          <w:lang w:val="en-AU"/>
+        </w:rPr>
+        <w:t>, further enhance performance through regularisation and computational efficiency, making them suitable for large-scale forecasting problems (Chen and Guestrin, 2016; Ke et al., 2017).</w:t>
       </w:r>
     </w:p>
     <w:p>
@@ -6164,41 +6156,47 @@
         <w:jc w:val="both"/>
         <w:rPr>
           <w:w w:val="105"/>
+          <w:lang w:val="en-AU"/>
         </w:rPr>
       </w:pPr>
       <w:r>
         <w:rPr>
           <w:w w:val="105"/>
-        </w:rPr>
-        <w:t xml:space="preserve">Despite their advantages, LSTM models have limitations when applied to medium- and long-term forecasting horizons. While they </w:t>
-      </w:r>
-      <w:proofErr w:type="gramStart"/>
+          <w:lang w:val="en-AU"/>
+        </w:rPr>
+        <w:t>In time series forecasting applications such as electricity demand prediction, gradient boosting models are particularly effective when combined with feature engineering techniques such as lagged variables and exogenous inputs like temperature. Unlike traditional statistical approaches, these models do not rely on assumptions of linearity or stationarity, allowing them to capture more complex patterns in the data. Empirical studies have shown that tree-based ensemble methods can outperform classical models when sufficient data and relevant features are available (</w:t>
+      </w:r>
+      <w:proofErr w:type="spellStart"/>
       <w:r>
         <w:rPr>
           <w:w w:val="105"/>
-        </w:rPr>
-        <w:t>are capable of modelling</w:t>
-      </w:r>
-      <w:proofErr w:type="gramEnd"/>
+          <w:lang w:val="en-AU"/>
+        </w:rPr>
+        <w:t>Makridakis</w:t>
+      </w:r>
+      <w:proofErr w:type="spellEnd"/>
       <w:r>
         <w:rPr>
           <w:w w:val="105"/>
-        </w:rPr>
-        <w:t xml:space="preserve"> long sequences, their predictive accuracy tends to decrease as the forecast horizon increases, as longer-term forecasts depend more heavily on stable trends and seasonal structures rather than short-term temporal relationships. Research such as </w:t>
+          <w:lang w:val="en-AU"/>
+        </w:rPr>
+        <w:t xml:space="preserve"> et al., 2018; </w:t>
       </w:r>
       <w:proofErr w:type="spellStart"/>
       <w:r>
         <w:rPr>
           <w:w w:val="105"/>
-        </w:rPr>
-        <w:t>Pełka</w:t>
+          <w:lang w:val="en-AU"/>
+        </w:rPr>
+        <w:t>Taieb</w:t>
       </w:r>
       <w:proofErr w:type="spellEnd"/>
       <w:r>
         <w:rPr>
           <w:w w:val="105"/>
-        </w:rPr>
-        <w:t xml:space="preserve"> and Dudek (2020) shows that hybrid or decomposition-based approaches, which combine statistical models with neural networks, can improve performance in these cases. This highlights the continued importance of classical methods and feature engineering when addressing forecasting horizons beyond short-term applications.</w:t>
+          <w:lang w:val="en-AU"/>
+        </w:rPr>
+        <w:t xml:space="preserve"> and Hyndman, 2014). However, while gradient boosting provides strong predictive performance, it may require careful tuning and feature design to achieve optimal results.</w:t>
       </w:r>
     </w:p>
     <w:p>
@@ -6215,35 +6213,21 @@
         <w:rPr>
           <w:w w:val="105"/>
         </w:rPr>
-        <w:t xml:space="preserve">Transformer-based </w:t>
-      </w:r>
-      <w:proofErr w:type="gramStart"/>
+        <w:t xml:space="preserve">More recently, deep learning approaches have been introduced to better capture nonlinear relationships and complex temporal dependencies in electricity demand data. Long Short-Term Memory (LSTM) networks, a type of recurrent neural network, are particularly well suited to time series forecasting due to their ability to retain information over long sequences using gated memory cells (Hochreiter &amp; </w:t>
+      </w:r>
+      <w:proofErr w:type="spellStart"/>
       <w:r>
         <w:rPr>
           <w:w w:val="105"/>
         </w:rPr>
-        <w:t>architectures have</w:t>
-      </w:r>
-      <w:proofErr w:type="gramEnd"/>
+        <w:t>Schmidhuber</w:t>
+      </w:r>
+      <w:proofErr w:type="spellEnd"/>
       <w:r>
         <w:rPr>
           <w:w w:val="105"/>
         </w:rPr>
-        <w:t xml:space="preserve"> emerged as a newer approach for time series forecasting, offering an alternative to recurrent models by leveraging attention mechanisms to capture dependencies across long sequences. However, early work questioned their effectiveness in this domain, with studies showing that simpler statistical and machine learning models could outperform transformer-based approaches for long-term forecasting tasks (Li et al., 2022; Zeng et al., 2022). More recent developments, such as </w:t>
-      </w:r>
-      <w:proofErr w:type="spellStart"/>
-      <w:r>
-        <w:rPr>
-          <w:w w:val="105"/>
-        </w:rPr>
-        <w:t>PatchTST</w:t>
-      </w:r>
-      <w:proofErr w:type="spellEnd"/>
-      <w:r>
-        <w:rPr>
-          <w:w w:val="105"/>
-        </w:rPr>
-        <w:t xml:space="preserve"> (Nie et al., 2023), have addressed some of these limitations by introducing techniques such as patching and channel independence, improving performance on long-horizon forecasting benchmarks. These advancements suggest that transformer-based models may be more competitive when appropriately adapted for time series data.</w:t>
+        <w:t>, 1997). In the context of electricity demand, LSTM models have shown strong performance when incorporating exogenous variables such as temperature, as well as lagged demand and calendar features. Studies such as Kong et al. (2017) and Marino et al. (2016) demonstrate that LSTMs can outperform traditional statistical models in short-term forecasting by effectively learning nonlinear demand patterns and temporal dependencies.</w:t>
       </w:r>
     </w:p>
     <w:p>
@@ -6260,28 +6244,42 @@
         <w:rPr>
           <w:w w:val="105"/>
         </w:rPr>
-        <w:t xml:space="preserve">While prior studies show LSTM performs well in short-term forecasting, its performance degrades over longer horizons. Although transformer-based models have shown mixed </w:t>
-      </w:r>
+        <w:t xml:space="preserve">Despite their advantages, LSTM models have limitations when applied to medium- and long-term forecasting horizons. While they </w:t>
+      </w:r>
+      <w:proofErr w:type="gramStart"/>
       <w:r>
         <w:rPr>
           <w:w w:val="105"/>
         </w:rPr>
+        <w:t>are capable of modelling</w:t>
+      </w:r>
+      <w:proofErr w:type="gramEnd"/>
+      <w:r>
+        <w:rPr>
+          <w:w w:val="105"/>
+        </w:rPr>
+        <w:t xml:space="preserve"> long sequences, their </w:t>
+      </w:r>
+      <w:r>
+        <w:rPr>
+          <w:w w:val="105"/>
+        </w:rPr>
         <w:lastRenderedPageBreak/>
-        <w:t xml:space="preserve">results, recent architectures such as </w:t>
+        <w:t xml:space="preserve">predictive accuracy tends to decrease as the forecast horizon increases, as longer-term forecasts depend more heavily on stable trends and seasonal structures rather than short-term temporal relationships. Research such as </w:t>
       </w:r>
       <w:proofErr w:type="spellStart"/>
       <w:r>
         <w:rPr>
           <w:w w:val="105"/>
         </w:rPr>
-        <w:t>PatchTST</w:t>
+        <w:t>Pełka</w:t>
       </w:r>
       <w:proofErr w:type="spellEnd"/>
       <w:r>
         <w:rPr>
           <w:w w:val="105"/>
         </w:rPr>
-        <w:t xml:space="preserve"> suggest improvements in long-horizon forecasting. However, empirical comparisons across short-to-medium horizons (48–720 hours) remain limited, particularly in the Australian electricity market context.</w:t>
+        <w:t xml:space="preserve"> and Dudek (2020) shows that hybrid or decomposition-based approaches, which combine statistical models with neural networks, can improve performance in these cases. This highlights the continued importance of classical methods and feature engineering when addressing forecasting horizons beyond short-term applications.</w:t>
       </w:r>
     </w:p>
     <w:p>
@@ -6290,26 +6288,74 @@
         <w:spacing w:before="237" w:line="237" w:lineRule="auto"/>
         <w:ind w:right="882"/>
         <w:jc w:val="both"/>
-      </w:pPr>
-      <w:r>
         <w:rPr>
           <w:w w:val="105"/>
         </w:rPr>
-        <w:t xml:space="preserve">Overall, the literature suggests that model performance in electricity demand forecasting is strongly dependent on the forecast horizon. Statistical models remain highly effective for short-term and structured seasonal forecasting, while LSTM models provide advantages in capturing nonlinear and short-term temporal dependencies. Transformer-based models show </w:t>
-      </w:r>
-      <w:proofErr w:type="gramStart"/>
+      </w:pPr>
       <w:r>
         <w:rPr>
           <w:w w:val="105"/>
         </w:rPr>
-        <w:t>promise</w:t>
-      </w:r>
-      <w:proofErr w:type="gramEnd"/>
+        <w:t xml:space="preserve">Transformer-based architectures have emerged as a newer approach for time series forecasting, offering an alternative to recurrent models by leveraging attention mechanisms to capture dependencies across long sequences. However, early work questioned their effectiveness in this domain, with studies showing that simpler statistical and machine learning models could outperform transformer-based approaches for long-term forecasting tasks (Li et al., 2022; Zeng et al., 2022). More recent developments, such as </w:t>
+      </w:r>
+      <w:proofErr w:type="spellStart"/>
       <w:r>
         <w:rPr>
           <w:w w:val="105"/>
         </w:rPr>
-        <w:t xml:space="preserve"> for long-term forecasting but require careful design and sufficient data to outperform simpler approaches. </w:t>
+        <w:t>PatchTST</w:t>
+      </w:r>
+      <w:proofErr w:type="spellEnd"/>
+      <w:r>
+        <w:rPr>
+          <w:w w:val="105"/>
+        </w:rPr>
+        <w:t xml:space="preserve"> (Nie et al., 2023), have addressed some of these limitations by introducing techniques such as patching and channel independence, improving performance on long-horizon forecasting benchmarks. These advancements suggest that transformer-based models may be more competitive when appropriately adapted for time series data.</w:t>
+      </w:r>
+    </w:p>
+    <w:p>
+      <w:pPr>
+        <w:pStyle w:val="BodyText"/>
+        <w:spacing w:before="237" w:line="237" w:lineRule="auto"/>
+        <w:ind w:right="882"/>
+        <w:jc w:val="both"/>
+        <w:rPr>
+          <w:w w:val="105"/>
+        </w:rPr>
+      </w:pPr>
+      <w:r>
+        <w:rPr>
+          <w:w w:val="105"/>
+        </w:rPr>
+        <w:t xml:space="preserve">While prior studies show LSTM performs well in short-term forecasting, its performance degrades over longer horizons. Although transformer-based models have shown mixed results, recent architectures such as </w:t>
+      </w:r>
+      <w:proofErr w:type="spellStart"/>
+      <w:r>
+        <w:rPr>
+          <w:w w:val="105"/>
+        </w:rPr>
+        <w:t>PatchTST</w:t>
+      </w:r>
+      <w:proofErr w:type="spellEnd"/>
+      <w:r>
+        <w:rPr>
+          <w:w w:val="105"/>
+        </w:rPr>
+        <w:t xml:space="preserve"> suggest improvements in long-horizon forecasting. However, empirical comparisons across short-to-medium horizons (48–720 hours) remain limited, particularly in the Australian electricity market context.</w:t>
+      </w:r>
+    </w:p>
+    <w:p>
+      <w:pPr>
+        <w:pStyle w:val="BodyText"/>
+        <w:spacing w:before="237" w:line="237" w:lineRule="auto"/>
+        <w:ind w:right="882"/>
+        <w:jc w:val="both"/>
+      </w:pPr>
+      <w:r>
+        <w:rPr>
+          <w:w w:val="105"/>
+        </w:rPr>
+        <w:t xml:space="preserve">Overall, the literature suggests that model performance in electricity demand forecasting is strongly dependent on the forecast horizon. Statistical models remain highly effective for short-term and structured seasonal forecasting, while LSTM models provide advantages in capturing nonlinear and short-term temporal dependencies. Transformer-based models show promise for long-term forecasting but require careful design and sufficient data to outperform simpler approaches. </w:t>
       </w:r>
       <w:proofErr w:type="spellStart"/>
       <w:r>
@@ -7065,61 +7111,33 @@
         <w:rPr>
           <w:spacing w:val="-2"/>
         </w:rPr>
-        <w:t xml:space="preserve">The forecast dataset originally contained multiple forecast entries for each timestamp. To reduce redundancy and ensure consistency, the data was aggregated by computing the mean FORECASTDEMAND for each DATETIME value. This transformation </w:t>
-      </w:r>
-      <w:proofErr w:type="gramStart"/>
-      <w:r>
+        <w:t>The forecast dataset originally contained multiple forecast entries for each timestamp. To reduce redundancy and ensure consistency, the data was aggregated by computing the mean FORECASTDEMAND for each DATETIME value. This transformation simplified the dataset while preserving its overall forecasting signal.</w:t>
+      </w:r>
+    </w:p>
+    <w:p>
+      <w:pPr>
+        <w:pStyle w:val="BodyText"/>
+        <w:spacing w:before="67"/>
+        <w:jc w:val="both"/>
         <w:rPr>
           <w:spacing w:val="-2"/>
         </w:rPr>
-        <w:t>simplified</w:t>
-      </w:r>
-      <w:proofErr w:type="gramEnd"/>
-      <w:r>
+      </w:pPr>
+    </w:p>
+    <w:p>
+      <w:pPr>
+        <w:pStyle w:val="BodyText"/>
+        <w:spacing w:before="67"/>
+        <w:jc w:val="both"/>
         <w:rPr>
           <w:spacing w:val="-2"/>
         </w:rPr>
-        <w:t xml:space="preserve"> the dataset while preserving its overall forecasting signal.</w:t>
-      </w:r>
-    </w:p>
-    <w:p>
-      <w:pPr>
-        <w:pStyle w:val="BodyText"/>
-        <w:spacing w:before="67"/>
-        <w:jc w:val="both"/>
+      </w:pPr>
+      <w:r>
         <w:rPr>
           <w:spacing w:val="-2"/>
         </w:rPr>
-      </w:pPr>
-    </w:p>
-    <w:p>
-      <w:pPr>
-        <w:pStyle w:val="BodyText"/>
-        <w:spacing w:before="67"/>
-        <w:jc w:val="both"/>
-        <w:rPr>
-          <w:spacing w:val="-2"/>
-        </w:rPr>
-      </w:pPr>
-      <w:r>
-        <w:rPr>
-          <w:spacing w:val="-2"/>
-        </w:rPr>
-        <w:t xml:space="preserve">The datasets were then merged using an inner </w:t>
-      </w:r>
-      <w:proofErr w:type="gramStart"/>
-      <w:r>
-        <w:rPr>
-          <w:spacing w:val="-2"/>
-        </w:rPr>
-        <w:t>join</w:t>
-      </w:r>
-      <w:proofErr w:type="gramEnd"/>
-      <w:r>
-        <w:rPr>
-          <w:spacing w:val="-2"/>
-        </w:rPr>
-        <w:t xml:space="preserve"> on the DATETIME variable. This ensured that only observations with complete information across all datasets were retained. The resulting dataset contains 195,947 aligned observations.</w:t>
+        <w:t>The datasets were then merged using an inner join on the DATETIME variable. This ensured that only observations with complete information across all datasets were retained. The resulting dataset contains 195,947 aligned observations.</w:t>
       </w:r>
     </w:p>
     <w:p>
@@ -7278,21 +7296,7 @@
         <w:rPr>
           <w:w w:val="105"/>
         </w:rPr>
-        <w:t xml:space="preserve">Furthermore, the use of an inner </w:t>
-      </w:r>
-      <w:proofErr w:type="gramStart"/>
-      <w:r>
-        <w:rPr>
-          <w:w w:val="105"/>
-        </w:rPr>
-        <w:t>join</w:t>
-      </w:r>
-      <w:proofErr w:type="gramEnd"/>
-      <w:r>
-        <w:rPr>
-          <w:w w:val="105"/>
-        </w:rPr>
-        <w:t xml:space="preserve"> during dataset merging inherently removed any observations with missing values across the datasets. As a result, the final merged dataset contains no missing values in the key variables TOTALDEMAND, TEMPERATURE, and FORECASTDEMAND.</w:t>
+        <w:t>Furthermore, the use of an inner join during dataset merging inherently removed any observations with missing values across the datasets. As a result, the final merged dataset contains no missing values in the key variables TOTALDEMAND, TEMPERATURE, and FORECASTDEMAND.</w:t>
       </w:r>
     </w:p>
     <w:p>
@@ -7665,52 +7669,56 @@
         <w:rPr>
           <w:sz w:val="24"/>
           <w:szCs w:val="24"/>
+          <w:lang w:val="en-AU"/>
         </w:rPr>
       </w:pPr>
       <w:r>
         <w:rPr>
           <w:sz w:val="24"/>
           <w:szCs w:val="24"/>
-        </w:rPr>
-        <w:t>The SARIMAX model was used as a classical statistical baseline.</w:t>
-      </w:r>
-      <w:r>
+          <w:lang w:val="en-AU"/>
+        </w:rPr>
+        <w:t>The SARIMAX model was used as a classical statistical baseline, representing traditional linear time-series forecasting methods. It incorporates both autoregressive and seasonal components, with temperature included as an exogenous variable to capture external influences on electricity demand. Unlike machine learning approaches, SARIMAX does not rely on explicitly engineered lag features, as temporal dependencies are inherently modelled through its autoregressive structure. Model parameters were selected based on standard time-series modelling practices, including identification of seasonal patterns and optimisation of model fit</w:t>
+      </w:r>
+    </w:p>
+    <w:p>
+      <w:pPr>
+        <w:jc w:val="both"/>
         <w:rPr>
           <w:sz w:val="24"/>
           <w:szCs w:val="24"/>
         </w:rPr>
-        <w:t xml:space="preserve"> Its role is to provide a benchmark representing traditional linear time-series forecasting methods.</w:t>
-      </w:r>
-      <w:r>
+      </w:pPr>
+    </w:p>
+    <w:p>
+      <w:pPr>
+        <w:jc w:val="both"/>
         <w:rPr>
           <w:sz w:val="24"/>
           <w:szCs w:val="24"/>
         </w:rPr>
-        <w:t xml:space="preserve"> It incorporates both autoregressive and seasonal components, with temperature included as an exogenous variable to capture external influences on electricity demand. Unlike machine learning models, SARIMAX does not </w:t>
-      </w:r>
+      </w:pPr>
       <w:r>
         <w:rPr>
           <w:sz w:val="24"/>
           <w:szCs w:val="24"/>
         </w:rPr>
-        <w:t xml:space="preserve">incorporate </w:t>
+        <w:t>3.6.</w:t>
       </w:r>
       <w:r>
         <w:rPr>
           <w:sz w:val="24"/>
           <w:szCs w:val="24"/>
         </w:rPr>
-        <w:t>explicitly engineered lag features, as temporal dependencies are inherently modelled through its autoregressive structure.</w:t>
-      </w:r>
-    </w:p>
-    <w:p>
-      <w:pPr>
-        <w:jc w:val="both"/>
+        <w:t>2</w:t>
+      </w:r>
+      <w:r>
         <w:rPr>
           <w:sz w:val="24"/>
           <w:szCs w:val="24"/>
         </w:rPr>
-      </w:pPr>
+        <w:t xml:space="preserve"> Gradient Boosting model</w:t>
+      </w:r>
     </w:p>
     <w:p>
       <w:pPr>
@@ -7718,90 +7726,127 @@
         <w:rPr>
           <w:sz w:val="24"/>
           <w:szCs w:val="24"/>
+          <w:lang w:val="en-AU"/>
         </w:rPr>
       </w:pPr>
       <w:r>
         <w:rPr>
           <w:sz w:val="24"/>
           <w:szCs w:val="24"/>
-        </w:rPr>
-        <w:t>3.6.</w:t>
-      </w:r>
-      <w:r>
+          <w:lang w:val="en-AU"/>
+        </w:rPr>
+        <w:t>To enhance predictive performance, a Gradient Boosting (GB) model was implemented as a representative machine learning approach capable of capturing non-linear relationships in the data. This model serves as a strong non-linear baseline commonly used for tabular time-series features. In contrast to SARIMAX, explicit lag features (e.g. previous demand values at different time intervals) were constructed and used as inputs, enabling the model to learn complex interactions between past demand and exogenous variables such as temperature. The model was implemented using a tree-based ensemble method, with key hyperparameters including the number of estimators, learning rate, and maximum tree depth tuned to balance model complexity and predictive performance.</w:t>
+      </w:r>
+    </w:p>
+    <w:p>
+      <w:pPr>
+        <w:jc w:val="both"/>
         <w:rPr>
           <w:sz w:val="24"/>
           <w:szCs w:val="24"/>
         </w:rPr>
-        <w:t>2</w:t>
-      </w:r>
-      <w:r>
+      </w:pPr>
+    </w:p>
+    <w:p>
+      <w:pPr>
+        <w:jc w:val="both"/>
         <w:rPr>
           <w:sz w:val="24"/>
           <w:szCs w:val="24"/>
         </w:rPr>
-        <w:t xml:space="preserve"> Gradient Boosting model</w:t>
-      </w:r>
-    </w:p>
-    <w:p>
-      <w:pPr>
-        <w:jc w:val="both"/>
+      </w:pPr>
+      <w:r>
         <w:rPr>
           <w:sz w:val="24"/>
           <w:szCs w:val="24"/>
         </w:rPr>
-      </w:pPr>
-      <w:r>
-        <w:rPr>
+        <w:t>3.6.3 Long Short</w:t>
+      </w:r>
+      <w:r>
+        <w:rPr>
+          <w:rFonts w:ascii="Cambria Math" w:hAnsi="Cambria Math" w:cs="Cambria Math"/>
           <w:sz w:val="24"/>
           <w:szCs w:val="24"/>
         </w:rPr>
-        <w:t xml:space="preserve">To enhance predictive performance, a Gradient Boosting model was implemented as a representative traditional machine learning approach. </w:t>
+        <w:t>‑</w:t>
       </w:r>
       <w:r>
         <w:rPr>
           <w:sz w:val="24"/>
           <w:szCs w:val="24"/>
         </w:rPr>
-        <w:t xml:space="preserve">This model serves as a strong non-linear baseline commonly used for tabular time-series features.  </w:t>
-      </w:r>
-      <w:r>
+        <w:t>Term Memory (LSTM) network</w:t>
+      </w:r>
+    </w:p>
+    <w:p>
+      <w:pPr>
+        <w:jc w:val="both"/>
         <w:rPr>
           <w:sz w:val="24"/>
           <w:szCs w:val="24"/>
         </w:rPr>
-        <w:t>In contrast to SARIMAX, explicit lag features (e.g., previous demand values at different time intervals) were constructed and used as inputs. This allows the model to learn nonlinear relationships and interactions between past demand and exogenous variables.</w:t>
-      </w:r>
-    </w:p>
-    <w:p>
-      <w:pPr>
-        <w:jc w:val="both"/>
+      </w:pPr>
+      <w:r>
         <w:rPr>
           <w:sz w:val="24"/>
           <w:szCs w:val="24"/>
         </w:rPr>
-      </w:pPr>
-    </w:p>
-    <w:p>
-      <w:pPr>
-        <w:jc w:val="both"/>
-        <w:rPr>
+        <w:t>A Long Short</w:t>
+      </w:r>
+      <w:r>
+        <w:rPr>
+          <w:rFonts w:ascii="Cambria Math" w:hAnsi="Cambria Math" w:cs="Cambria Math"/>
           <w:sz w:val="24"/>
           <w:szCs w:val="24"/>
         </w:rPr>
-      </w:pPr>
+        <w:t>‑</w:t>
+      </w:r>
       <w:r>
         <w:rPr>
           <w:sz w:val="24"/>
           <w:szCs w:val="24"/>
         </w:rPr>
-        <w:t xml:space="preserve">3.6.3 </w:t>
-      </w:r>
-      <w:r>
-        <w:rPr>
+        <w:t>Term Memory (LSTM) network was employed to capture sequential dependencies in the electricity demand time series. LSTM models are particularly suitable for time series forecasting due to their ability to retain long</w:t>
+      </w:r>
+      <w:r>
+        <w:rPr>
+          <w:rFonts w:ascii="Cambria Math" w:hAnsi="Cambria Math" w:cs="Cambria Math"/>
           <w:sz w:val="24"/>
           <w:szCs w:val="24"/>
         </w:rPr>
-        <w:t>Long Short</w:t>
+        <w:t>‑</w:t>
+      </w:r>
+      <w:r>
+        <w:rPr>
+          <w:sz w:val="24"/>
+          <w:szCs w:val="24"/>
+        </w:rPr>
+        <w:t>term temporal information through gated recurrent structures, allowing them to model complex temporal dynamics more effectively than traditional recurrent neural networks.</w:t>
+      </w:r>
+    </w:p>
+    <w:p>
+      <w:pPr>
+        <w:jc w:val="both"/>
+        <w:rPr>
+          <w:sz w:val="24"/>
+          <w:szCs w:val="24"/>
+        </w:rPr>
+      </w:pPr>
+    </w:p>
+    <w:p>
+      <w:pPr>
+        <w:jc w:val="both"/>
+        <w:rPr>
+          <w:sz w:val="24"/>
+          <w:szCs w:val="24"/>
+        </w:rPr>
+      </w:pPr>
+      <w:r>
+        <w:rPr>
+          <w:sz w:val="24"/>
+          <w:szCs w:val="24"/>
+        </w:rPr>
+        <w:t>To examine the impact of increasing model complexity within deep learning approaches, multiple LSTM</w:t>
       </w:r>
       <w:r>
         <w:rPr>
@@ -7816,23 +7861,29 @@
           <w:sz w:val="24"/>
           <w:szCs w:val="24"/>
         </w:rPr>
-        <w:t>Term Memory (LSTM) network</w:t>
-      </w:r>
-    </w:p>
-    <w:p>
-      <w:pPr>
-        <w:jc w:val="both"/>
+        <w:t>based architectures were evaluated</w:t>
+      </w:r>
+      <w:r>
         <w:rPr>
           <w:sz w:val="24"/>
           <w:szCs w:val="24"/>
         </w:rPr>
-      </w:pPr>
-      <w:r>
-        <w:rPr>
+        <w:t>: a standard unidirectional LSTM, a Bidirectional LSTM (Bi</w:t>
+      </w:r>
+      <w:r>
+        <w:rPr>
+          <w:rFonts w:ascii="Cambria Math" w:hAnsi="Cambria Math" w:cs="Cambria Math"/>
           <w:sz w:val="24"/>
           <w:szCs w:val="24"/>
         </w:rPr>
-        <w:t>A Long Short</w:t>
+        <w:t>‑</w:t>
+      </w:r>
+      <w:r>
+        <w:rPr>
+          <w:sz w:val="24"/>
+          <w:szCs w:val="24"/>
+        </w:rPr>
+        <w:t>LSTM), and a Bi</w:t>
       </w:r>
       <w:r>
         <w:rPr>
@@ -7847,7 +7898,7 @@
           <w:sz w:val="24"/>
           <w:szCs w:val="24"/>
         </w:rPr>
-        <w:t>Term Memory (LSTM) network was employed to capture sequential dependencies in the electricity demand time series. LSTM models are particularly suitable for time series forecasting due to their ability to retain long</w:t>
+        <w:t>LSTM augmented with an attention mechanism. The standard LSTM processes the input sequence in a forward temporal direction and serves as a baseline deep learning sequence model. The Bi</w:t>
       </w:r>
       <w:r>
         <w:rPr>
@@ -7862,7 +7913,7 @@
           <w:sz w:val="24"/>
           <w:szCs w:val="24"/>
         </w:rPr>
-        <w:t>term temporal information through gated recurrent structures, allowing them to model complex temporal dynamics more effectively than traditional recurrent neural networks.</w:t>
+        <w:t>LSTM extends this architecture by processing the sequence in both forward and backward directions, enabling the model to capture richer contextual information from the input window.</w:t>
       </w:r>
     </w:p>
     <w:p>
@@ -7887,7 +7938,8 @@
           <w:sz w:val="24"/>
           <w:szCs w:val="24"/>
         </w:rPr>
-        <w:t>To examine the impact of increasing model complexity within deep learning approaches, multiple LSTM</w:t>
+        <w:lastRenderedPageBreak/>
+        <w:t>To further enhance the model’s ability to focus on the most relevant time steps, an attention mechanism was applied to the Bi</w:t>
       </w:r>
       <w:r>
         <w:rPr>
@@ -7902,14 +7954,86 @@
           <w:sz w:val="24"/>
           <w:szCs w:val="24"/>
         </w:rPr>
-        <w:t>based architectures were evaluated</w:t>
-      </w:r>
-      <w:r>
-        <w:rPr>
+        <w:t>LSTM. This allows the model to assign different weights to historical observations when generating forecasts, improving its capacity to model non</w:t>
+      </w:r>
+      <w:r>
+        <w:rPr>
+          <w:rFonts w:ascii="Cambria Math" w:hAnsi="Cambria Math" w:cs="Cambria Math"/>
           <w:sz w:val="24"/>
           <w:szCs w:val="24"/>
         </w:rPr>
-        <w:t>: a standard unidirectional LSTM, a Bidirectional LSTM (Bi</w:t>
+        <w:t>‑</w:t>
+      </w:r>
+      <w:r>
+        <w:rPr>
+          <w:sz w:val="24"/>
+          <w:szCs w:val="24"/>
+        </w:rPr>
+        <w:t>uniform temporal dependencies. All LSTM variants were trained using sequences constructed from historical demand and exogenous variables, and their performance was evaluated to assess the impact of architectural complexity on forecasting accuracy across different horizons</w:t>
+      </w:r>
+      <w:r>
+        <w:rPr>
+          <w:sz w:val="24"/>
+          <w:szCs w:val="24"/>
+        </w:rPr>
+        <w:t>.</w:t>
+      </w:r>
+    </w:p>
+    <w:p>
+      <w:pPr>
+        <w:jc w:val="both"/>
+        <w:rPr>
+          <w:sz w:val="24"/>
+          <w:szCs w:val="24"/>
+        </w:rPr>
+      </w:pPr>
+    </w:p>
+    <w:p>
+      <w:pPr>
+        <w:jc w:val="both"/>
+        <w:rPr>
+          <w:sz w:val="24"/>
+          <w:szCs w:val="24"/>
+        </w:rPr>
+      </w:pPr>
+      <w:r>
+        <w:rPr>
+          <w:sz w:val="24"/>
+          <w:szCs w:val="24"/>
+        </w:rPr>
+        <w:t xml:space="preserve">3.6.4 Transformer-based </w:t>
+      </w:r>
+      <w:proofErr w:type="spellStart"/>
+      <w:r>
+        <w:rPr>
+          <w:sz w:val="24"/>
+          <w:szCs w:val="24"/>
+        </w:rPr>
+        <w:t>PatchTST</w:t>
+      </w:r>
+      <w:proofErr w:type="spellEnd"/>
+      <w:r>
+        <w:rPr>
+          <w:sz w:val="24"/>
+          <w:szCs w:val="24"/>
+        </w:rPr>
+        <w:t xml:space="preserve"> model</w:t>
+      </w:r>
+    </w:p>
+    <w:p>
+      <w:pPr>
+        <w:jc w:val="both"/>
+        <w:rPr>
+          <w:sz w:val="24"/>
+          <w:szCs w:val="24"/>
+        </w:rPr>
+      </w:pPr>
+      <w:r>
+        <w:rPr>
+          <w:sz w:val="24"/>
+          <w:szCs w:val="24"/>
+        </w:rPr>
+        <w:t>Finally, a transformer</w:t>
       </w:r>
       <w:r>
         <w:rPr>
@@ -7924,7 +8048,39 @@
           <w:sz w:val="24"/>
           <w:szCs w:val="24"/>
         </w:rPr>
-        <w:t>LSTM), and a Bi</w:t>
+        <w:t xml:space="preserve">based model, </w:t>
+      </w:r>
+      <w:proofErr w:type="spellStart"/>
+      <w:r>
+        <w:rPr>
+          <w:sz w:val="24"/>
+          <w:szCs w:val="24"/>
+        </w:rPr>
+        <w:t>PatchTST</w:t>
+      </w:r>
+      <w:proofErr w:type="spellEnd"/>
+      <w:r>
+        <w:rPr>
+          <w:sz w:val="24"/>
+          <w:szCs w:val="24"/>
+        </w:rPr>
+        <w:t xml:space="preserve">, was implemented to leverage recent advances in time series forecasting. </w:t>
+      </w:r>
+      <w:proofErr w:type="spellStart"/>
+      <w:r>
+        <w:rPr>
+          <w:sz w:val="24"/>
+          <w:szCs w:val="24"/>
+        </w:rPr>
+        <w:t>PatchTST</w:t>
+      </w:r>
+      <w:proofErr w:type="spellEnd"/>
+      <w:r>
+        <w:rPr>
+          <w:sz w:val="24"/>
+          <w:szCs w:val="24"/>
+        </w:rPr>
+        <w:t xml:space="preserve"> represents a state</w:t>
       </w:r>
       <w:r>
         <w:rPr>
@@ -7939,7 +8095,7 @@
           <w:sz w:val="24"/>
           <w:szCs w:val="24"/>
         </w:rPr>
-        <w:t>LSTM augmented with an attention mechanism. The standard LSTM processes the input sequence in a forward temporal direction and serves as a baseline deep learning sequence model. The Bi</w:t>
+        <w:t>of</w:t>
       </w:r>
       <w:r>
         <w:rPr>
@@ -7954,32 +8110,37 @@
           <w:sz w:val="24"/>
           <w:szCs w:val="24"/>
         </w:rPr>
-        <w:t>LSTM extends this architecture by processing the sequence in both forward and backward directions, enabling the model to capture richer contextual information from the input window.</w:t>
-      </w:r>
-    </w:p>
-    <w:p>
-      <w:pPr>
-        <w:jc w:val="both"/>
-        <w:rPr>
+        <w:t>the</w:t>
+      </w:r>
+      <w:r>
+        <w:rPr>
+          <w:rFonts w:ascii="Cambria Math" w:hAnsi="Cambria Math" w:cs="Cambria Math"/>
           <w:sz w:val="24"/>
           <w:szCs w:val="24"/>
         </w:rPr>
-      </w:pPr>
-    </w:p>
-    <w:p>
-      <w:pPr>
-        <w:jc w:val="both"/>
+        <w:t>‑</w:t>
+      </w:r>
+      <w:r>
         <w:rPr>
           <w:sz w:val="24"/>
           <w:szCs w:val="24"/>
         </w:rPr>
-      </w:pPr>
-      <w:r>
-        <w:rPr>
+        <w:t>art transformer architecture designed specifically for long</w:t>
+      </w:r>
+      <w:r>
+        <w:rPr>
+          <w:rFonts w:ascii="Cambria Math" w:hAnsi="Cambria Math" w:cs="Cambria Math"/>
           <w:sz w:val="24"/>
           <w:szCs w:val="24"/>
         </w:rPr>
-        <w:t>To further enhance the model’s ability to focus on the most relevant time steps, an attention mechanism was applied to the Bi</w:t>
+        <w:t>‑</w:t>
+      </w:r>
+      <w:r>
+        <w:rPr>
+          <w:sz w:val="24"/>
+          <w:szCs w:val="24"/>
+        </w:rPr>
+        <w:t>horizon forecasting. It segments the input time series into fixed</w:t>
       </w:r>
       <w:r>
         <w:rPr>
@@ -7994,7 +8155,7 @@
           <w:sz w:val="24"/>
           <w:szCs w:val="24"/>
         </w:rPr>
-        <w:t>LSTM. This allows the model to assign different weights to historical observations when generating forecasts, improving its capacity to model non</w:t>
+        <w:t>length patches and applies self</w:t>
       </w:r>
       <w:r>
         <w:rPr>
@@ -8009,21 +8170,136 @@
           <w:sz w:val="24"/>
           <w:szCs w:val="24"/>
         </w:rPr>
-        <w:t xml:space="preserve">uniform temporal dependencies. All LSTM variants were trained using sequences constructed from historical demand and exogenous variables, and their performance was </w:t>
-      </w:r>
-      <w:r>
-        <w:rPr>
+        <w:t>attention mechanisms to capture long</w:t>
+      </w:r>
+      <w:r>
+        <w:rPr>
+          <w:rFonts w:ascii="Cambria Math" w:hAnsi="Cambria Math" w:cs="Cambria Math"/>
           <w:sz w:val="24"/>
           <w:szCs w:val="24"/>
         </w:rPr>
-        <w:lastRenderedPageBreak/>
-        <w:t>evaluated to assess the impact of architectural complexity on forecasting accuracy across different horizons</w:t>
+        <w:t>‑</w:t>
       </w:r>
       <w:r>
         <w:rPr>
           <w:sz w:val="24"/>
           <w:szCs w:val="24"/>
         </w:rPr>
+        <w:t>range temporal dependencies efficiently, addressing limitations commonly observed in traditional statistical and recurrent models.</w:t>
+      </w:r>
+    </w:p>
+    <w:p>
+      <w:pPr>
+        <w:jc w:val="both"/>
+        <w:rPr>
+          <w:sz w:val="24"/>
+          <w:szCs w:val="24"/>
+        </w:rPr>
+      </w:pPr>
+      <w:r>
+        <w:rPr>
+          <w:sz w:val="24"/>
+          <w:szCs w:val="24"/>
+        </w:rPr>
+        <w:t>To examine the impact of exogenous information on transformer</w:t>
+      </w:r>
+      <w:r>
+        <w:rPr>
+          <w:rFonts w:ascii="Cambria Math" w:hAnsi="Cambria Math" w:cs="Cambria Math"/>
+          <w:sz w:val="24"/>
+          <w:szCs w:val="24"/>
+        </w:rPr>
+        <w:t>‑</w:t>
+      </w:r>
+      <w:r>
+        <w:rPr>
+          <w:sz w:val="24"/>
+          <w:szCs w:val="24"/>
+        </w:rPr>
+        <w:t xml:space="preserve">based forecasting performance, </w:t>
+      </w:r>
+      <w:proofErr w:type="spellStart"/>
+      <w:r>
+        <w:rPr>
+          <w:sz w:val="24"/>
+          <w:szCs w:val="24"/>
+        </w:rPr>
+        <w:t>PatchTST</w:t>
+      </w:r>
+      <w:proofErr w:type="spellEnd"/>
+      <w:r>
+        <w:rPr>
+          <w:sz w:val="24"/>
+          <w:szCs w:val="24"/>
+        </w:rPr>
+        <w:t xml:space="preserve"> was evaluated under two configurations: a univariate setting using only historical electricity demand, and a multivariate setting incorporating temperature as an exogenous variable. This comparison enables assessment of whether explicit inclusion of temperature provides additional predictive benefit beyond the temporal patterns learned directly from demand data. By </w:t>
+      </w:r>
+      <w:proofErr w:type="spellStart"/>
+      <w:r>
+        <w:rPr>
+          <w:sz w:val="24"/>
+          <w:szCs w:val="24"/>
+        </w:rPr>
+        <w:t>analysing</w:t>
+      </w:r>
+      <w:proofErr w:type="spellEnd"/>
+      <w:r>
+        <w:rPr>
+          <w:sz w:val="24"/>
+          <w:szCs w:val="24"/>
+        </w:rPr>
+        <w:t xml:space="preserve"> both configurations across multiple forecasting horizons, the study evaluates the extent to which transformer</w:t>
+      </w:r>
+      <w:r>
+        <w:rPr>
+          <w:rFonts w:ascii="Cambria Math" w:hAnsi="Cambria Math" w:cs="Cambria Math"/>
+          <w:sz w:val="24"/>
+          <w:szCs w:val="24"/>
+        </w:rPr>
+        <w:t>‑</w:t>
+      </w:r>
+      <w:r>
+        <w:rPr>
+          <w:sz w:val="24"/>
+          <w:szCs w:val="24"/>
+        </w:rPr>
+        <w:t>based models can implicitly capture demand–weather relationships versus relying on explicit external inputs. This architecture is particularly well</w:t>
+      </w:r>
+      <w:r>
+        <w:rPr>
+          <w:rFonts w:ascii="Cambria Math" w:hAnsi="Cambria Math" w:cs="Cambria Math"/>
+          <w:sz w:val="24"/>
+          <w:szCs w:val="24"/>
+        </w:rPr>
+        <w:t>‑</w:t>
+      </w:r>
+      <w:r>
+        <w:rPr>
+          <w:sz w:val="24"/>
+          <w:szCs w:val="24"/>
+        </w:rPr>
+        <w:t>suited for long</w:t>
+      </w:r>
+      <w:r>
+        <w:rPr>
+          <w:rFonts w:ascii="Cambria Math" w:hAnsi="Cambria Math" w:cs="Cambria Math"/>
+          <w:sz w:val="24"/>
+          <w:szCs w:val="24"/>
+        </w:rPr>
+        <w:t>‑</w:t>
+      </w:r>
+      <w:r>
+        <w:rPr>
+          <w:sz w:val="24"/>
+          <w:szCs w:val="24"/>
+        </w:rPr>
+        <w:t>horizon forecasting tasks, where traditional models often struggle to maintain predictive accuracy</w:t>
+      </w:r>
+      <w:r>
+        <w:rPr>
+          <w:sz w:val="24"/>
+          <w:szCs w:val="24"/>
+        </w:rPr>
         <w:t>.</w:t>
       </w:r>
     </w:p>
@@ -8049,368 +8325,14 @@
           <w:sz w:val="24"/>
           <w:szCs w:val="24"/>
         </w:rPr>
-        <w:t xml:space="preserve">3.6.4 Transformer-based </w:t>
-      </w:r>
-      <w:proofErr w:type="spellStart"/>
+        <w:t>All models were evaluated using RMSE and MAE metrics under a consistent experimental setup. In addition, model performance was compared against the provided forecast to assess whether data-driven approaches can offer improvements over existing operational forecasting methods.</w:t>
+      </w:r>
       <w:r>
         <w:rPr>
           <w:sz w:val="24"/>
           <w:szCs w:val="24"/>
         </w:rPr>
-        <w:t>PatchTST</w:t>
-      </w:r>
-      <w:proofErr w:type="spellEnd"/>
-      <w:r>
-        <w:rPr>
-          <w:sz w:val="24"/>
-          <w:szCs w:val="24"/>
-        </w:rPr>
-        <w:t xml:space="preserve"> model</w:t>
-      </w:r>
-    </w:p>
-    <w:p>
-      <w:pPr>
-        <w:jc w:val="both"/>
-        <w:rPr>
-          <w:sz w:val="24"/>
-          <w:szCs w:val="24"/>
-        </w:rPr>
-      </w:pPr>
-      <w:r>
-        <w:rPr>
-          <w:sz w:val="24"/>
-          <w:szCs w:val="24"/>
-        </w:rPr>
-        <w:t>Finally, a transformer</w:t>
-      </w:r>
-      <w:r>
-        <w:rPr>
-          <w:rFonts w:ascii="Cambria Math" w:hAnsi="Cambria Math" w:cs="Cambria Math"/>
-          <w:sz w:val="24"/>
-          <w:szCs w:val="24"/>
-        </w:rPr>
-        <w:t>‑</w:t>
-      </w:r>
-      <w:r>
-        <w:rPr>
-          <w:sz w:val="24"/>
-          <w:szCs w:val="24"/>
-        </w:rPr>
-        <w:t xml:space="preserve">based model, </w:t>
-      </w:r>
-      <w:proofErr w:type="spellStart"/>
-      <w:r>
-        <w:rPr>
-          <w:sz w:val="24"/>
-          <w:szCs w:val="24"/>
-        </w:rPr>
-        <w:t>PatchTST</w:t>
-      </w:r>
-      <w:proofErr w:type="spellEnd"/>
-      <w:r>
-        <w:rPr>
-          <w:sz w:val="24"/>
-          <w:szCs w:val="24"/>
-        </w:rPr>
-        <w:t xml:space="preserve">, was implemented to leverage recent advances in time series forecasting. </w:t>
-      </w:r>
-      <w:proofErr w:type="spellStart"/>
-      <w:r>
-        <w:rPr>
-          <w:sz w:val="24"/>
-          <w:szCs w:val="24"/>
-        </w:rPr>
-        <w:t>PatchTST</w:t>
-      </w:r>
-      <w:proofErr w:type="spellEnd"/>
-      <w:r>
-        <w:rPr>
-          <w:sz w:val="24"/>
-          <w:szCs w:val="24"/>
-        </w:rPr>
-        <w:t xml:space="preserve"> represents a state</w:t>
-      </w:r>
-      <w:r>
-        <w:rPr>
-          <w:rFonts w:ascii="Cambria Math" w:hAnsi="Cambria Math" w:cs="Cambria Math"/>
-          <w:sz w:val="24"/>
-          <w:szCs w:val="24"/>
-        </w:rPr>
-        <w:t>‑</w:t>
-      </w:r>
-      <w:r>
-        <w:rPr>
-          <w:sz w:val="24"/>
-          <w:szCs w:val="24"/>
-        </w:rPr>
-        <w:t>of</w:t>
-      </w:r>
-      <w:r>
-        <w:rPr>
-          <w:rFonts w:ascii="Cambria Math" w:hAnsi="Cambria Math" w:cs="Cambria Math"/>
-          <w:sz w:val="24"/>
-          <w:szCs w:val="24"/>
-        </w:rPr>
-        <w:t>‑</w:t>
-      </w:r>
-      <w:r>
-        <w:rPr>
-          <w:sz w:val="24"/>
-          <w:szCs w:val="24"/>
-        </w:rPr>
-        <w:t>the</w:t>
-      </w:r>
-      <w:r>
-        <w:rPr>
-          <w:rFonts w:ascii="Cambria Math" w:hAnsi="Cambria Math" w:cs="Cambria Math"/>
-          <w:sz w:val="24"/>
-          <w:szCs w:val="24"/>
-        </w:rPr>
-        <w:t>‑</w:t>
-      </w:r>
-      <w:r>
-        <w:rPr>
-          <w:sz w:val="24"/>
-          <w:szCs w:val="24"/>
-        </w:rPr>
-        <w:t>art transformer architecture designed specifically for long</w:t>
-      </w:r>
-      <w:r>
-        <w:rPr>
-          <w:rFonts w:ascii="Cambria Math" w:hAnsi="Cambria Math" w:cs="Cambria Math"/>
-          <w:sz w:val="24"/>
-          <w:szCs w:val="24"/>
-        </w:rPr>
-        <w:t>‑</w:t>
-      </w:r>
-      <w:r>
-        <w:rPr>
-          <w:sz w:val="24"/>
-          <w:szCs w:val="24"/>
-        </w:rPr>
-        <w:t>horizon forecasting. It segments the input time series into fixed</w:t>
-      </w:r>
-      <w:r>
-        <w:rPr>
-          <w:rFonts w:ascii="Cambria Math" w:hAnsi="Cambria Math" w:cs="Cambria Math"/>
-          <w:sz w:val="24"/>
-          <w:szCs w:val="24"/>
-        </w:rPr>
-        <w:t>‑</w:t>
-      </w:r>
-      <w:r>
-        <w:rPr>
-          <w:sz w:val="24"/>
-          <w:szCs w:val="24"/>
-        </w:rPr>
-        <w:t>length patches and applies self</w:t>
-      </w:r>
-      <w:r>
-        <w:rPr>
-          <w:rFonts w:ascii="Cambria Math" w:hAnsi="Cambria Math" w:cs="Cambria Math"/>
-          <w:sz w:val="24"/>
-          <w:szCs w:val="24"/>
-        </w:rPr>
-        <w:t>‑</w:t>
-      </w:r>
-      <w:r>
-        <w:rPr>
-          <w:sz w:val="24"/>
-          <w:szCs w:val="24"/>
-        </w:rPr>
-        <w:t>attention mechanisms to capture long</w:t>
-      </w:r>
-      <w:r>
-        <w:rPr>
-          <w:rFonts w:ascii="Cambria Math" w:hAnsi="Cambria Math" w:cs="Cambria Math"/>
-          <w:sz w:val="24"/>
-          <w:szCs w:val="24"/>
-        </w:rPr>
-        <w:t>‑</w:t>
-      </w:r>
-      <w:r>
-        <w:rPr>
-          <w:sz w:val="24"/>
-          <w:szCs w:val="24"/>
-        </w:rPr>
-        <w:t>range temporal dependencies efficiently, addressing limitations commonly observed in traditional statistical and recurrent models.</w:t>
-      </w:r>
-    </w:p>
-    <w:p>
-      <w:pPr>
-        <w:jc w:val="both"/>
-        <w:rPr>
-          <w:sz w:val="24"/>
-          <w:szCs w:val="24"/>
-        </w:rPr>
-      </w:pPr>
-      <w:r>
-        <w:rPr>
-          <w:sz w:val="24"/>
-          <w:szCs w:val="24"/>
-        </w:rPr>
-        <w:t>To examine the impact of exogenous information on transformer</w:t>
-      </w:r>
-      <w:r>
-        <w:rPr>
-          <w:rFonts w:ascii="Cambria Math" w:hAnsi="Cambria Math" w:cs="Cambria Math"/>
-          <w:sz w:val="24"/>
-          <w:szCs w:val="24"/>
-        </w:rPr>
-        <w:t>‑</w:t>
-      </w:r>
-      <w:r>
-        <w:rPr>
-          <w:sz w:val="24"/>
-          <w:szCs w:val="24"/>
-        </w:rPr>
-        <w:t xml:space="preserve">based forecasting performance, </w:t>
-      </w:r>
-      <w:proofErr w:type="spellStart"/>
-      <w:r>
-        <w:rPr>
-          <w:sz w:val="24"/>
-          <w:szCs w:val="24"/>
-        </w:rPr>
-        <w:t>PatchTST</w:t>
-      </w:r>
-      <w:proofErr w:type="spellEnd"/>
-      <w:r>
-        <w:rPr>
-          <w:sz w:val="24"/>
-          <w:szCs w:val="24"/>
-        </w:rPr>
-        <w:t xml:space="preserve"> was evaluated under two configurations: a univariate setting using only historical electricity demand, and a multivariate setting incorporating temperature as an exogenous variable. This comparison enables assessment of whether explicit inclusion of temperature provides additional predictive benefit beyond the temporal patterns learned directly from demand data. By </w:t>
-      </w:r>
-      <w:proofErr w:type="spellStart"/>
-      <w:r>
-        <w:rPr>
-          <w:sz w:val="24"/>
-          <w:szCs w:val="24"/>
-        </w:rPr>
-        <w:t>analysing</w:t>
-      </w:r>
-      <w:proofErr w:type="spellEnd"/>
-      <w:r>
-        <w:rPr>
-          <w:sz w:val="24"/>
-          <w:szCs w:val="24"/>
-        </w:rPr>
-        <w:t xml:space="preserve"> both configurations across multiple forecasting horizons, the study evaluates the extent to which transformer</w:t>
-      </w:r>
-      <w:r>
-        <w:rPr>
-          <w:rFonts w:ascii="Cambria Math" w:hAnsi="Cambria Math" w:cs="Cambria Math"/>
-          <w:sz w:val="24"/>
-          <w:szCs w:val="24"/>
-        </w:rPr>
-        <w:t>‑</w:t>
-      </w:r>
-      <w:r>
-        <w:rPr>
-          <w:sz w:val="24"/>
-          <w:szCs w:val="24"/>
-        </w:rPr>
-        <w:t>based models can implicitly capture demand–weather relationships versus relying on explicit external inputs. This architecture is particularly well</w:t>
-      </w:r>
-      <w:r>
-        <w:rPr>
-          <w:rFonts w:ascii="Cambria Math" w:hAnsi="Cambria Math" w:cs="Cambria Math"/>
-          <w:sz w:val="24"/>
-          <w:szCs w:val="24"/>
-        </w:rPr>
-        <w:t>‑</w:t>
-      </w:r>
-      <w:r>
-        <w:rPr>
-          <w:sz w:val="24"/>
-          <w:szCs w:val="24"/>
-        </w:rPr>
-        <w:t>suited for long</w:t>
-      </w:r>
-      <w:r>
-        <w:rPr>
-          <w:rFonts w:ascii="Cambria Math" w:hAnsi="Cambria Math" w:cs="Cambria Math"/>
-          <w:sz w:val="24"/>
-          <w:szCs w:val="24"/>
-        </w:rPr>
-        <w:t>‑</w:t>
-      </w:r>
-      <w:r>
-        <w:rPr>
-          <w:sz w:val="24"/>
-          <w:szCs w:val="24"/>
-        </w:rPr>
-        <w:t>horizon forecasting tasks, where traditional models often struggle to maintain predictive accuracy</w:t>
-      </w:r>
-      <w:r>
-        <w:rPr>
-          <w:sz w:val="24"/>
-          <w:szCs w:val="24"/>
-        </w:rPr>
-        <w:t>.</w:t>
-      </w:r>
-    </w:p>
-    <w:p>
-      <w:pPr>
-        <w:jc w:val="both"/>
-        <w:rPr>
-          <w:sz w:val="24"/>
-          <w:szCs w:val="24"/>
-        </w:rPr>
-      </w:pPr>
-    </w:p>
-    <w:p>
-      <w:pPr>
-        <w:jc w:val="both"/>
-        <w:rPr>
-          <w:sz w:val="24"/>
-          <w:szCs w:val="24"/>
-        </w:rPr>
-      </w:pPr>
-      <w:r>
-        <w:rPr>
-          <w:sz w:val="24"/>
-          <w:szCs w:val="24"/>
-        </w:rPr>
-        <w:t xml:space="preserve">All models were evaluated using RMSE and MAE metrics under a consistent experimental setup. In addition, model performance was compared </w:t>
-      </w:r>
-      <w:proofErr w:type="gramStart"/>
-      <w:r>
-        <w:rPr>
-          <w:sz w:val="24"/>
-          <w:szCs w:val="24"/>
-        </w:rPr>
-        <w:t>against</w:t>
-      </w:r>
-      <w:proofErr w:type="gramEnd"/>
-      <w:r>
-        <w:rPr>
-          <w:sz w:val="24"/>
-          <w:szCs w:val="24"/>
-        </w:rPr>
-        <w:t xml:space="preserve"> the provided forecast to assess whether data-driven approaches can offer improvements over existing operational forecasting methods.</w:t>
-      </w:r>
-      <w:r>
-        <w:rPr>
-          <w:sz w:val="24"/>
-          <w:szCs w:val="24"/>
-        </w:rPr>
-        <w:t xml:space="preserve"> </w:t>
-      </w:r>
-      <w:r>
-        <w:rPr>
-          <w:sz w:val="24"/>
-          <w:szCs w:val="24"/>
-        </w:rPr>
-        <w:t>Together, these models provide a structured comparison across statistical, classical machine learning, and modern deep learning paradigms</w:t>
-      </w:r>
-      <w:r>
-        <w:rPr>
-          <w:sz w:val="24"/>
-          <w:szCs w:val="24"/>
-        </w:rPr>
-        <w:t>.</w:t>
+        <w:t xml:space="preserve"> Together, these models provide a structured comparison across statistical, classical machine learning, and modern deep learning paradigms.</w:t>
       </w:r>
     </w:p>
     <w:p>
@@ -8460,10 +8382,39 @@
     </w:p>
     <w:p/>
     <w:p>
-      <w:r>
-        <w:t>[TBC, explain how to choose these…]</w:t>
-      </w:r>
-    </w:p>
+      <w:pPr>
+        <w:rPr>
+          <w:lang w:val="en-AU"/>
+        </w:rPr>
+      </w:pPr>
+      <w:r>
+        <w:rPr>
+          <w:lang w:val="en-AU"/>
+        </w:rPr>
+        <w:t>For the SARIMAX model, the autoregressive and differencing terms were selected to capture the underlying trend and temporal dependencies in the data while maintaining a parsimonious model structure. The non-seasonal order (1,1,0) was chosen such that one level of differencing (d=1) was applied to address non-stationarity, while a single autoregressive term (p=1) captured short-term dependencies without overfitting. No moving average component was included (q=0), as this did not significantly improve validation performance.</w:t>
+      </w:r>
+    </w:p>
+    <w:p>
+      <w:pPr>
+        <w:rPr>
+          <w:lang w:val="en-AU"/>
+        </w:rPr>
+      </w:pPr>
+    </w:p>
+    <w:p>
+      <w:pPr>
+        <w:rPr>
+          <w:lang w:val="en-AU"/>
+        </w:rPr>
+      </w:pPr>
+      <w:r>
+        <w:rPr>
+          <w:lang w:val="en-AU"/>
+        </w:rPr>
+        <w:t>The seasonal order (0,1,0,48) was selected to model daily seasonality in the half-hourly electricity demand data, where a seasonal period of 48 corresponds to 24 hours. Seasonal differencing (D=1) was included to remove repeating daily patterns, while additional seasonal autoregressive or moving average terms were not required. Stationarity and invertibility constraints were relaxed to provide the model with greater flexibility during fitting. Overall, a simpler specification was preferred, as more complex configurations did not yield meaningful improvements in validation performance but increased computational cost and model instability.</w:t>
+      </w:r>
+    </w:p>
+    <w:p/>
     <w:p>
       <w:proofErr w:type="spellStart"/>
       <w:r>
@@ -8577,6 +8528,40 @@
     </w:p>
     <w:p/>
     <w:p>
+      <w:pPr>
+        <w:rPr>
+          <w:lang w:val="en-AU"/>
+        </w:rPr>
+      </w:pPr>
+      <w:r>
+        <w:rPr>
+          <w:lang w:val="en-AU"/>
+        </w:rPr>
+        <w:t>For the Gradient Boosting model, hyperparameters controlling model complexity and learning behaviour were selected through iterative experimentation and evaluation using validation RMSE. The number of estimators was set to 500 to allow the model to learn patterns progressively across many trees, improving predictive performance. A learning rate of 0.03 was chosen to ensure updates were applied gradually, reducing the risk of overfitting and improving model stability.</w:t>
+      </w:r>
+    </w:p>
+    <w:p>
+      <w:pPr>
+        <w:rPr>
+          <w:lang w:val="en-AU"/>
+        </w:rPr>
+      </w:pPr>
+    </w:p>
+    <w:p>
+      <w:pPr>
+        <w:rPr>
+          <w:lang w:val="en-AU"/>
+        </w:rPr>
+      </w:pPr>
+      <w:r>
+        <w:rPr>
+          <w:lang w:val="en-AU"/>
+        </w:rPr>
+        <w:t>The maximum tree depth was set to 5, allowing the model to capture more complex non-linear relationships compared to shallower trees while still maintaining reasonable generalisation performance. A fixed random state was used to ensure reproducibility of results. While more complex configurations (e.g. deeper trees or additional estimators) were explored, they resulted in only marginal improvements in performance relative to the increased training time, indicating diminishing returns from further tuning</w:t>
+      </w:r>
+    </w:p>
+    <w:p/>
+    <w:p>
       <w:proofErr w:type="spellStart"/>
       <w:r>
         <w:t>gb_model</w:t>
@@ -8606,7 +8591,13 @@
       </w:r>
       <w:proofErr w:type="spellEnd"/>
       <w:r>
-        <w:t>=300,</w:t>
+        <w:t>=</w:t>
+      </w:r>
+      <w:r>
+        <w:t>500</w:t>
+      </w:r>
+      <w:r>
+        <w:t>,</w:t>
       </w:r>
     </w:p>
     <w:p>
@@ -8632,7 +8623,13 @@
       </w:r>
       <w:proofErr w:type="spellEnd"/>
       <w:r>
-        <w:t>=4,</w:t>
+        <w:t>=</w:t>
+      </w:r>
+      <w:r>
+        <w:t>5</w:t>
+      </w:r>
+      <w:r>
+        <w:t>,</w:t>
       </w:r>
     </w:p>
     <w:p>
@@ -8713,6 +8710,7 @@
     </w:p>
     <w:p>
       <w:r>
+        <w:lastRenderedPageBreak/>
         <w:t xml:space="preserve">    </w:t>
       </w:r>
       <w:proofErr w:type="spellStart"/>
@@ -8889,28 +8887,12 @@
     </w:p>
     <w:p>
       <w:r>
-        <w:t xml:space="preserve">HORIZONS        = [48, 336, </w:t>
-      </w:r>
-      <w:proofErr w:type="gramStart"/>
-      <w:r>
-        <w:t>720]    #</w:t>
-      </w:r>
-      <w:proofErr w:type="gramEnd"/>
-      <w:r>
-        <w:t xml:space="preserve"> 1d, 7d, 15d forecast horizon</w:t>
-      </w:r>
-    </w:p>
-    <w:p>
-      <w:r>
-        <w:t xml:space="preserve">CONTEXT_LENGTHS = [144, 336, </w:t>
-      </w:r>
-      <w:proofErr w:type="gramStart"/>
-      <w:r>
-        <w:t>720]   #</w:t>
-      </w:r>
-      <w:proofErr w:type="gramEnd"/>
-      <w:r>
-        <w:t xml:space="preserve"> 3d, 7d, 15d history</w:t>
+        <w:t>HORIZONS        = [48, 336, 720]    # 1d, 7d, 15d forecast horizon</w:t>
+      </w:r>
+    </w:p>
+    <w:p>
+      <w:r>
+        <w:t>CONTEXT_LENGTHS = [144, 336, 720]   # 3d, 7d, 15d history</w:t>
       </w:r>
     </w:p>
     <w:p>
@@ -9204,7 +9186,7 @@
                 <v:stroke joinstyle="miter"/>
                 <v:path gradientshapeok="t" o:connecttype="rect"/>
               </v:shapetype>
-              <v:shape id="Text Box 2" o:spid="_x0000_s1026" type="#_x0000_t202" style="position:absolute;left:0;text-align:left;margin-left:218.6pt;margin-top:179.85pt;width:57.3pt;height:16.95pt;z-index:487608832;visibility:visible;mso-wrap-style:square;mso-width-percent:0;mso-height-percent:0;mso-wrap-distance-left:9pt;mso-wrap-distance-top:3.6pt;mso-wrap-distance-right:9pt;mso-wrap-distance-bottom:3.6pt;mso-position-horizontal:absolute;mso-position-horizontal-relative:margin;mso-position-vertical:absolute;mso-position-vertical-relative:text;mso-width-percent:0;mso-height-percent:0;mso-width-relative:margin;mso-height-relative:margin;v-text-anchor:top" o:gfxdata="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" filled="f" stroked="f">
+              <v:shape id="Text Box 2" o:spid="_x0000_s1026" type="#_x0000_t202" style="position:absolute;left:0;text-align:left;margin-left:218.6pt;margin-top:179.85pt;width:57.3pt;height:16.95pt;z-index:487608832;visibility:visible;mso-wrap-style:square;mso-width-percent:0;mso-height-percent:0;mso-wrap-distance-left:9pt;mso-wrap-distance-top:3.6pt;mso-wrap-distance-right:9pt;mso-wrap-distance-bottom:3.6pt;mso-position-horizontal:absolute;mso-position-horizontal-relative:margin;mso-position-vertical:absolute;mso-position-vertical-relative:text;mso-width-percent:0;mso-height-percent:0;mso-width-relative:margin;mso-height-relative:margin;v-text-anchor:top" o:gfxdata="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" filled="f" stroked="f">
                 <v:textbox>
                   <w:txbxContent>
                     <w:p>
@@ -9691,14 +9673,7 @@
                                 <w:sz w:val="16"/>
                                 <w:szCs w:val="16"/>
                               </w:rPr>
-                              <w:t>Figure 4.</w:t>
-                            </w:r>
-                            <w:r>
-                              <w:rPr>
-                                <w:sz w:val="16"/>
-                                <w:szCs w:val="16"/>
-                              </w:rPr>
-                              <w:t>3</w:t>
+                              <w:t>Figure 4.3</w:t>
                             </w:r>
                           </w:p>
                         </w:txbxContent>
@@ -9720,7 +9695,7 @@
           </mc:Choice>
           <mc:Fallback>
             <w:pict>
-              <v:shape w14:anchorId="2A70FACA" id="_x0000_s1027" type="#_x0000_t202" style="position:absolute;left:0;text-align:left;margin-left:216.45pt;margin-top:21.35pt;width:57.3pt;height:16.95pt;z-index:487610880;visibility:visible;mso-wrap-style:square;mso-width-percent:0;mso-height-percent:0;mso-wrap-distance-left:9pt;mso-wrap-distance-top:3.6pt;mso-wrap-distance-right:9pt;mso-wrap-distance-bottom:3.6pt;mso-position-horizontal:absolute;mso-position-horizontal-relative:margin;mso-position-vertical:absolute;mso-position-vertical-relative:text;mso-width-percent:0;mso-height-percent:0;mso-width-relative:margin;mso-height-relative:margin;v-text-anchor:top" o:gfxdata="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" filled="f" stroked="f">
+              <v:shape w14:anchorId="2A70FACA" id="_x0000_s1027" type="#_x0000_t202" style="position:absolute;left:0;text-align:left;margin-left:216.45pt;margin-top:21.35pt;width:57.3pt;height:16.95pt;z-index:487610880;visibility:visible;mso-wrap-style:square;mso-width-percent:0;mso-height-percent:0;mso-wrap-distance-left:9pt;mso-wrap-distance-top:3.6pt;mso-wrap-distance-right:9pt;mso-wrap-distance-bottom:3.6pt;mso-position-horizontal:absolute;mso-position-horizontal-relative:margin;mso-position-vertical:absolute;mso-position-vertical-relative:text;mso-width-percent:0;mso-height-percent:0;mso-width-relative:margin;mso-height-relative:margin;v-text-anchor:top" o:gfxdata="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" filled="f" stroked="f">
                 <v:textbox>
                   <w:txbxContent>
                     <w:p>
@@ -9736,14 +9711,7 @@
                           <w:sz w:val="16"/>
                           <w:szCs w:val="16"/>
                         </w:rPr>
-                        <w:t>Figure 4.</w:t>
-                      </w:r>
-                      <w:r>
-                        <w:rPr>
-                          <w:sz w:val="16"/>
-                          <w:szCs w:val="16"/>
-                        </w:rPr>
-                        <w:t>3</w:t>
+                        <w:t>Figure 4.3</w:t>
                       </w:r>
                     </w:p>
                   </w:txbxContent>
@@ -10192,14 +10160,7 @@
                                 <w:sz w:val="16"/>
                                 <w:szCs w:val="16"/>
                               </w:rPr>
-                              <w:t>Figure 4.</w:t>
-                            </w:r>
-                            <w:r>
-                              <w:rPr>
-                                <w:sz w:val="16"/>
-                                <w:szCs w:val="16"/>
-                              </w:rPr>
-                              <w:t>4</w:t>
+                              <w:t>Figure 4.4</w:t>
                             </w:r>
                           </w:p>
                         </w:txbxContent>
@@ -10221,7 +10182,7 @@
           </mc:Choice>
           <mc:Fallback>
             <w:pict>
-              <v:shape w14:anchorId="19F99277" id="_x0000_s1028" type="#_x0000_t202" style="position:absolute;left:0;text-align:left;margin-left:221.9pt;margin-top:14.6pt;width:57.3pt;height:16.95pt;z-index:487612928;visibility:visible;mso-wrap-style:square;mso-width-percent:0;mso-height-percent:0;mso-wrap-distance-left:9pt;mso-wrap-distance-top:3.6pt;mso-wrap-distance-right:9pt;mso-wrap-distance-bottom:3.6pt;mso-position-horizontal:absolute;mso-position-horizontal-relative:margin;mso-position-vertical:absolute;mso-position-vertical-relative:text;mso-width-percent:0;mso-height-percent:0;mso-width-relative:margin;mso-height-relative:margin;v-text-anchor:top" o:gfxdata="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" filled="f" stroked="f">
+              <v:shape w14:anchorId="19F99277" id="_x0000_s1028" type="#_x0000_t202" style="position:absolute;left:0;text-align:left;margin-left:221.9pt;margin-top:14.6pt;width:57.3pt;height:16.95pt;z-index:487612928;visibility:visible;mso-wrap-style:square;mso-width-percent:0;mso-height-percent:0;mso-wrap-distance-left:9pt;mso-wrap-distance-top:3.6pt;mso-wrap-distance-right:9pt;mso-wrap-distance-bottom:3.6pt;mso-position-horizontal:absolute;mso-position-horizontal-relative:margin;mso-position-vertical:absolute;mso-position-vertical-relative:text;mso-width-percent:0;mso-height-percent:0;mso-width-relative:margin;mso-height-relative:margin;v-text-anchor:top" o:gfxdata="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" filled="f" stroked="f">
                 <v:textbox>
                   <w:txbxContent>
                     <w:p>
@@ -10237,14 +10198,7 @@
                           <w:sz w:val="16"/>
                           <w:szCs w:val="16"/>
                         </w:rPr>
-                        <w:t>Figure 4.</w:t>
-                      </w:r>
-                      <w:r>
-                        <w:rPr>
-                          <w:sz w:val="16"/>
-                          <w:szCs w:val="16"/>
-                        </w:rPr>
-                        <w:t>4</w:t>
+                        <w:t>Figure 4.4</w:t>
                       </w:r>
                     </w:p>
                   </w:txbxContent>
@@ -10296,15 +10250,7 @@
         <w:jc w:val="both"/>
       </w:pPr>
       <w:r>
-        <w:t xml:space="preserve">This observation highlights potential areas for improvement in </w:t>
-      </w:r>
-      <w:proofErr w:type="gramStart"/>
-      <w:r>
-        <w:t>forecasting</w:t>
-      </w:r>
-      <w:proofErr w:type="gramEnd"/>
-      <w:r>
-        <w:t xml:space="preserve"> performance, particularly during extreme conditions.</w:t>
+        <w:t>This observation highlights potential areas for improvement in forecasting performance, particularly during extreme conditions.</w:t>
       </w:r>
     </w:p>
     <w:p>
@@ -10661,14 +10607,7 @@
                                 <w:sz w:val="16"/>
                                 <w:szCs w:val="16"/>
                               </w:rPr>
-                              <w:t>Figure 4.</w:t>
-                            </w:r>
-                            <w:r>
-                              <w:rPr>
-                                <w:sz w:val="16"/>
-                                <w:szCs w:val="16"/>
-                              </w:rPr>
-                              <w:t>5</w:t>
+                              <w:t>Figure 4.5</w:t>
                             </w:r>
                           </w:p>
                         </w:txbxContent>
@@ -10690,7 +10629,7 @@
           </mc:Choice>
           <mc:Fallback>
             <w:pict>
-              <v:shape w14:anchorId="1E84502E" id="_x0000_s1029" type="#_x0000_t202" style="position:absolute;left:0;text-align:left;margin-left:212.35pt;margin-top:8.45pt;width:57.3pt;height:16.95pt;z-index:487614976;visibility:visible;mso-wrap-style:square;mso-width-percent:0;mso-height-percent:0;mso-wrap-distance-left:9pt;mso-wrap-distance-top:3.6pt;mso-wrap-distance-right:9pt;mso-wrap-distance-bottom:3.6pt;mso-position-horizontal:absolute;mso-position-horizontal-relative:margin;mso-position-vertical:absolute;mso-position-vertical-relative:text;mso-width-percent:0;mso-height-percent:0;mso-width-relative:margin;mso-height-relative:margin;v-text-anchor:top" o:gfxdata="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" filled="f" stroked="f">
+              <v:shape w14:anchorId="1E84502E" id="_x0000_s1029" type="#_x0000_t202" style="position:absolute;left:0;text-align:left;margin-left:212.35pt;margin-top:8.45pt;width:57.3pt;height:16.95pt;z-index:487614976;visibility:visible;mso-wrap-style:square;mso-width-percent:0;mso-height-percent:0;mso-wrap-distance-left:9pt;mso-wrap-distance-top:3.6pt;mso-wrap-distance-right:9pt;mso-wrap-distance-bottom:3.6pt;mso-position-horizontal:absolute;mso-position-horizontal-relative:margin;mso-position-vertical:absolute;mso-position-vertical-relative:text;mso-width-percent:0;mso-height-percent:0;mso-width-relative:margin;mso-height-relative:margin;v-text-anchor:top" o:gfxdata="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" filled="f" stroked="f">
                 <v:textbox>
                   <w:txbxContent>
                     <w:p>
@@ -10706,14 +10645,7 @@
                           <w:sz w:val="16"/>
                           <w:szCs w:val="16"/>
                         </w:rPr>
-                        <w:t>Figure 4.</w:t>
-                      </w:r>
-                      <w:r>
-                        <w:rPr>
-                          <w:sz w:val="16"/>
-                          <w:szCs w:val="16"/>
-                        </w:rPr>
-                        <w:t>5</w:t>
+                        <w:t>Figure 4.5</w:t>
                       </w:r>
                     </w:p>
                   </w:txbxContent>
@@ -10957,7 +10889,7 @@
           </mc:Choice>
           <mc:Fallback>
             <w:pict>
-              <v:shape w14:anchorId="74790337" id="_x0000_s1030" type="#_x0000_t202" style="position:absolute;left:0;text-align:left;margin-left:-43.6pt;margin-top:87.9pt;width:54pt;height:14.45pt;rotation:-90;z-index:487603712;visibility:visible;mso-wrap-style:square;mso-width-percent:0;mso-height-percent:0;mso-wrap-distance-left:9pt;mso-wrap-distance-top:3.6pt;mso-wrap-distance-right:9pt;mso-wrap-distance-bottom:3.6pt;mso-position-horizontal:absolute;mso-position-horizontal-relative:text;mso-position-vertical:absolute;mso-position-vertical-relative:text;mso-width-percent:0;mso-height-percent:0;mso-width-relative:margin;mso-height-relative:margin;v-text-anchor:top" o:gfxdata="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" filled="f" stroked="f">
+              <v:shape w14:anchorId="74790337" id="_x0000_s1030" type="#_x0000_t202" style="position:absolute;left:0;text-align:left;margin-left:-43.6pt;margin-top:87.9pt;width:54pt;height:14.45pt;rotation:-90;z-index:487603712;visibility:visible;mso-wrap-style:square;mso-width-percent:0;mso-height-percent:0;mso-wrap-distance-left:9pt;mso-wrap-distance-top:3.6pt;mso-wrap-distance-right:9pt;mso-wrap-distance-bottom:3.6pt;mso-position-horizontal:absolute;mso-position-horizontal-relative:text;mso-position-vertical:absolute;mso-position-vertical-relative:text;mso-width-percent:0;mso-height-percent:0;mso-width-relative:margin;mso-height-relative:margin;v-text-anchor:top" o:gfxdata="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" filled="f" stroked="f">
                 <v:textbox>
                   <w:txbxContent>
                     <w:p>
@@ -11115,14 +11047,7 @@
                                       <w:sz w:val="16"/>
                                       <w:szCs w:val="16"/>
                                     </w:rPr>
-                                    <w:t>Figure 4.6</w:t>
-                                  </w:r>
-                                  <w:r>
-                                    <w:rPr>
-                                      <w:sz w:val="16"/>
-                                      <w:szCs w:val="16"/>
-                                    </w:rPr>
-                                    <w:t>A</w:t>
+                                    <w:t>Figure 4.6A</w:t>
                                   </w:r>
                                 </w:p>
                               </w:txbxContent>
@@ -11144,7 +11069,7 @@
                 </mc:Choice>
                 <mc:Fallback>
                   <w:pict>
-                    <v:shape w14:anchorId="79DA2D40" id="_x0000_s1031" type="#_x0000_t202" style="position:absolute;left:0;text-align:left;margin-left:52.45pt;margin-top:146.25pt;width:57.3pt;height:16.95pt;z-index:487621120;visibility:visible;mso-wrap-style:square;mso-width-percent:0;mso-height-percent:0;mso-wrap-distance-left:9pt;mso-wrap-distance-top:3.6pt;mso-wrap-distance-right:9pt;mso-wrap-distance-bottom:3.6pt;mso-position-horizontal:absolute;mso-position-horizontal-relative:margin;mso-position-vertical:absolute;mso-position-vertical-relative:text;mso-width-percent:0;mso-height-percent:0;mso-width-relative:margin;mso-height-relative:margin;v-text-anchor:top" o:gfxdata="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" filled="f" stroked="f">
+                    <v:shape w14:anchorId="79DA2D40" id="_x0000_s1031" type="#_x0000_t202" style="position:absolute;left:0;text-align:left;margin-left:52.45pt;margin-top:146.25pt;width:57.3pt;height:16.95pt;z-index:487621120;visibility:visible;mso-wrap-style:square;mso-width-percent:0;mso-height-percent:0;mso-wrap-distance-left:9pt;mso-wrap-distance-top:3.6pt;mso-wrap-distance-right:9pt;mso-wrap-distance-bottom:3.6pt;mso-position-horizontal:absolute;mso-position-horizontal-relative:margin;mso-position-vertical:absolute;mso-position-vertical-relative:text;mso-width-percent:0;mso-height-percent:0;mso-width-relative:margin;mso-height-relative:margin;v-text-anchor:top" o:gfxdata="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" filled="f" stroked="f">
                       <v:textbox>
                         <w:txbxContent>
                           <w:p>
@@ -11160,14 +11085,7 @@
                                 <w:sz w:val="16"/>
                                 <w:szCs w:val="16"/>
                               </w:rPr>
-                              <w:t>Figure 4.6</w:t>
-                            </w:r>
-                            <w:r>
-                              <w:rPr>
-                                <w:sz w:val="16"/>
-                                <w:szCs w:val="16"/>
-                              </w:rPr>
-                              <w:t>A</w:t>
+                              <w:t>Figure 4.6A</w:t>
                             </w:r>
                           </w:p>
                         </w:txbxContent>
@@ -11183,7 +11101,7 @@
                 <w:noProof/>
               </w:rPr>
               <w:drawing>
-                <wp:anchor distT="0" distB="0" distL="114300" distR="114300" simplePos="0" relativeHeight="487599616" behindDoc="0" locked="0" layoutInCell="1" allowOverlap="1" wp14:anchorId="2687DCBC" wp14:editId="1660BF60">
+                <wp:anchor distT="0" distB="0" distL="114300" distR="114300" simplePos="0" relativeHeight="487599616" behindDoc="0" locked="0" layoutInCell="1" allowOverlap="1" wp14:anchorId="2687DCBC" wp14:editId="4FB80FFA">
                   <wp:simplePos x="0" y="0"/>
                   <wp:positionH relativeFrom="column">
                     <wp:posOffset>26020</wp:posOffset>
@@ -11262,7 +11180,7 @@
                 <w:noProof/>
               </w:rPr>
               <w:drawing>
-                <wp:anchor distT="0" distB="0" distL="114300" distR="114300" simplePos="0" relativeHeight="487600640" behindDoc="0" locked="0" layoutInCell="1" allowOverlap="1" wp14:anchorId="1E3F83FF" wp14:editId="4FD76C40">
+                <wp:anchor distT="0" distB="0" distL="114300" distR="114300" simplePos="0" relativeHeight="487600640" behindDoc="0" locked="0" layoutInCell="1" allowOverlap="1" wp14:anchorId="1E3F83FF" wp14:editId="63B5C79F">
                   <wp:simplePos x="0" y="0"/>
                   <wp:positionH relativeFrom="column">
                     <wp:posOffset>-41771</wp:posOffset>
@@ -11341,7 +11259,7 @@
                 <w:noProof/>
               </w:rPr>
               <w:drawing>
-                <wp:anchor distT="0" distB="0" distL="114300" distR="114300" simplePos="0" relativeHeight="487604736" behindDoc="0" locked="0" layoutInCell="1" allowOverlap="1" wp14:anchorId="07B2B002" wp14:editId="79370C15">
+                <wp:anchor distT="0" distB="0" distL="114300" distR="114300" simplePos="0" relativeHeight="487604736" behindDoc="0" locked="0" layoutInCell="1" allowOverlap="1" wp14:anchorId="07B2B002" wp14:editId="07B2716B">
                   <wp:simplePos x="0" y="0"/>
                   <wp:positionH relativeFrom="column">
                     <wp:posOffset>-42669</wp:posOffset>
@@ -11537,14 +11455,7 @@
                                 <w:sz w:val="16"/>
                                 <w:szCs w:val="16"/>
                               </w:rPr>
-                              <w:t>Figure 4.</w:t>
-                            </w:r>
-                            <w:r>
-                              <w:rPr>
-                                <w:sz w:val="16"/>
-                                <w:szCs w:val="16"/>
-                              </w:rPr>
-                              <w:t>6B</w:t>
+                              <w:t>Figure 4.6B</w:t>
                             </w:r>
                           </w:p>
                         </w:txbxContent>
@@ -11566,7 +11477,7 @@
           </mc:Choice>
           <mc:Fallback>
             <w:pict>
-              <v:shape w14:anchorId="2D67F42D" id="_x0000_s1032" type="#_x0000_t202" style="position:absolute;left:0;text-align:left;margin-left:204.05pt;margin-top:.15pt;width:57.3pt;height:16.95pt;z-index:487617024;visibility:visible;mso-wrap-style:square;mso-width-percent:0;mso-height-percent:0;mso-wrap-distance-left:9pt;mso-wrap-distance-top:3.6pt;mso-wrap-distance-right:9pt;mso-wrap-distance-bottom:3.6pt;mso-position-horizontal:absolute;mso-position-horizontal-relative:margin;mso-position-vertical:absolute;mso-position-vertical-relative:text;mso-width-percent:0;mso-height-percent:0;mso-width-relative:margin;mso-height-relative:margin;v-text-anchor:top" o:gfxdata="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" filled="f" stroked="f">
+              <v:shape w14:anchorId="2D67F42D" id="_x0000_s1032" type="#_x0000_t202" style="position:absolute;left:0;text-align:left;margin-left:204.05pt;margin-top:.15pt;width:57.3pt;height:16.95pt;z-index:487617024;visibility:visible;mso-wrap-style:square;mso-width-percent:0;mso-height-percent:0;mso-wrap-distance-left:9pt;mso-wrap-distance-top:3.6pt;mso-wrap-distance-right:9pt;mso-wrap-distance-bottom:3.6pt;mso-position-horizontal:absolute;mso-position-horizontal-relative:margin;mso-position-vertical:absolute;mso-position-vertical-relative:text;mso-width-percent:0;mso-height-percent:0;mso-width-relative:margin;mso-height-relative:margin;v-text-anchor:top" o:gfxdata="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" filled="f" stroked="f">
                 <v:textbox>
                   <w:txbxContent>
                     <w:p>
@@ -11582,14 +11493,7 @@
                           <w:sz w:val="16"/>
                           <w:szCs w:val="16"/>
                         </w:rPr>
-                        <w:t>Figure 4.</w:t>
-                      </w:r>
-                      <w:r>
-                        <w:rPr>
-                          <w:sz w:val="16"/>
-                          <w:szCs w:val="16"/>
-                        </w:rPr>
-                        <w:t>6B</w:t>
+                        <w:t>Figure 4.6B</w:t>
                       </w:r>
                     </w:p>
                   </w:txbxContent>
@@ -11660,14 +11564,7 @@
                                 <w:sz w:val="16"/>
                                 <w:szCs w:val="16"/>
                               </w:rPr>
-                              <w:t>Figure 4.6</w:t>
-                            </w:r>
-                            <w:r>
-                              <w:rPr>
-                                <w:sz w:val="16"/>
-                                <w:szCs w:val="16"/>
-                              </w:rPr>
-                              <w:t>C</w:t>
+                              <w:t>Figure 4.6C</w:t>
                             </w:r>
                           </w:p>
                         </w:txbxContent>
@@ -11689,7 +11586,7 @@
           </mc:Choice>
           <mc:Fallback>
             <w:pict>
-              <v:shape w14:anchorId="700B61C8" id="_x0000_s1033" type="#_x0000_t202" style="position:absolute;left:0;text-align:left;margin-left:372.85pt;margin-top:.3pt;width:57.3pt;height:16.95pt;z-index:487619072;visibility:visible;mso-wrap-style:square;mso-width-percent:0;mso-height-percent:0;mso-wrap-distance-left:9pt;mso-wrap-distance-top:3.6pt;mso-wrap-distance-right:9pt;mso-wrap-distance-bottom:3.6pt;mso-position-horizontal:absolute;mso-position-horizontal-relative:margin;mso-position-vertical:absolute;mso-position-vertical-relative:text;mso-width-percent:0;mso-height-percent:0;mso-width-relative:margin;mso-height-relative:margin;v-text-anchor:top" o:gfxdata="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" filled="f" stroked="f">
+              <v:shape w14:anchorId="700B61C8" id="_x0000_s1033" type="#_x0000_t202" style="position:absolute;left:0;text-align:left;margin-left:372.85pt;margin-top:.3pt;width:57.3pt;height:16.95pt;z-index:487619072;visibility:visible;mso-wrap-style:square;mso-width-percent:0;mso-height-percent:0;mso-wrap-distance-left:9pt;mso-wrap-distance-top:3.6pt;mso-wrap-distance-right:9pt;mso-wrap-distance-bottom:3.6pt;mso-position-horizontal:absolute;mso-position-horizontal-relative:margin;mso-position-vertical:absolute;mso-position-vertical-relative:text;mso-width-percent:0;mso-height-percent:0;mso-width-relative:margin;mso-height-relative:margin;v-text-anchor:top" o:gfxdata="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" filled="f" stroked="f">
                 <v:textbox>
                   <w:txbxContent>
                     <w:p>
@@ -11705,14 +11602,7 @@
                           <w:sz w:val="16"/>
                           <w:szCs w:val="16"/>
                         </w:rPr>
-                        <w:t>Figure 4.6</w:t>
-                      </w:r>
-                      <w:r>
-                        <w:rPr>
-                          <w:sz w:val="16"/>
-                          <w:szCs w:val="16"/>
-                        </w:rPr>
-                        <w:t>C</w:t>
+                        <w:t>Figure 4.6C</w:t>
                       </w:r>
                     </w:p>
                   </w:txbxContent>
@@ -12245,14 +12135,7 @@
                                 <w:sz w:val="16"/>
                                 <w:szCs w:val="16"/>
                               </w:rPr>
-                              <w:t>Figure 4.</w:t>
-                            </w:r>
-                            <w:r>
-                              <w:rPr>
-                                <w:sz w:val="16"/>
-                                <w:szCs w:val="16"/>
-                              </w:rPr>
-                              <w:t>7</w:t>
+                              <w:t>Figure 4.7</w:t>
                             </w:r>
                           </w:p>
                         </w:txbxContent>
@@ -12274,7 +12157,7 @@
           </mc:Choice>
           <mc:Fallback>
             <w:pict>
-              <v:shape w14:anchorId="151C1186" id="_x0000_s1034" type="#_x0000_t202" style="position:absolute;left:0;text-align:left;margin-left:210.95pt;margin-top:9.4pt;width:57.3pt;height:16.95pt;z-index:487623168;visibility:visible;mso-wrap-style:square;mso-width-percent:0;mso-height-percent:0;mso-wrap-distance-left:9pt;mso-wrap-distance-top:3.6pt;mso-wrap-distance-right:9pt;mso-wrap-distance-bottom:3.6pt;mso-position-horizontal:absolute;mso-position-horizontal-relative:margin;mso-position-vertical:absolute;mso-position-vertical-relative:text;mso-width-percent:0;mso-height-percent:0;mso-width-relative:margin;mso-height-relative:margin;v-text-anchor:top" o:gfxdata="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" filled="f" stroked="f">
+              <v:shape w14:anchorId="151C1186" id="_x0000_s1034" type="#_x0000_t202" style="position:absolute;left:0;text-align:left;margin-left:210.95pt;margin-top:9.4pt;width:57.3pt;height:16.95pt;z-index:487623168;visibility:visible;mso-wrap-style:square;mso-width-percent:0;mso-height-percent:0;mso-wrap-distance-left:9pt;mso-wrap-distance-top:3.6pt;mso-wrap-distance-right:9pt;mso-wrap-distance-bottom:3.6pt;mso-position-horizontal:absolute;mso-position-horizontal-relative:margin;mso-position-vertical:absolute;mso-position-vertical-relative:text;mso-width-percent:0;mso-height-percent:0;mso-width-relative:margin;mso-height-relative:margin;v-text-anchor:top" o:gfxdata="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" filled="f" stroked="f">
                 <v:textbox>
                   <w:txbxContent>
                     <w:p>
@@ -12290,14 +12173,7 @@
                           <w:sz w:val="16"/>
                           <w:szCs w:val="16"/>
                         </w:rPr>
-                        <w:t>Figure 4.</w:t>
-                      </w:r>
-                      <w:r>
-                        <w:rPr>
-                          <w:sz w:val="16"/>
-                          <w:szCs w:val="16"/>
-                        </w:rPr>
-                        <w:t>7</w:t>
+                        <w:t>Figure 4.7</w:t>
                       </w:r>
                     </w:p>
                   </w:txbxContent>
@@ -12332,7 +12208,7 @@
           <w:noProof/>
         </w:rPr>
         <w:drawing>
-          <wp:anchor distT="0" distB="0" distL="114300" distR="114300" simplePos="0" relativeHeight="487606784" behindDoc="0" locked="0" layoutInCell="1" allowOverlap="1" wp14:anchorId="3E495B9D" wp14:editId="0BCE0233">
+          <wp:anchor distT="0" distB="0" distL="114300" distR="114300" simplePos="0" relativeHeight="487606784" behindDoc="0" locked="0" layoutInCell="1" allowOverlap="1" wp14:anchorId="3E495B9D" wp14:editId="1F9DE6F8">
             <wp:simplePos x="0" y="0"/>
             <wp:positionH relativeFrom="column">
               <wp:posOffset>647839</wp:posOffset>
@@ -12545,14 +12421,7 @@
                                 <w:sz w:val="16"/>
                                 <w:szCs w:val="16"/>
                               </w:rPr>
-                              <w:t>Figure 4.8</w:t>
-                            </w:r>
-                            <w:r>
-                              <w:rPr>
-                                <w:sz w:val="16"/>
-                                <w:szCs w:val="16"/>
-                              </w:rPr>
-                              <w:t>B</w:t>
+                              <w:t>Figure 4.8B</w:t>
                             </w:r>
                           </w:p>
                         </w:txbxContent>
@@ -12574,7 +12443,7 @@
           </mc:Choice>
           <mc:Fallback>
             <w:pict>
-              <v:shape w14:anchorId="159D296B" id="_x0000_s1035" type="#_x0000_t202" style="position:absolute;left:0;text-align:left;margin-left:311.25pt;margin-top:7.6pt;width:57.3pt;height:16.95pt;z-index:487627264;visibility:visible;mso-wrap-style:square;mso-width-percent:0;mso-height-percent:0;mso-wrap-distance-left:9pt;mso-wrap-distance-top:3.6pt;mso-wrap-distance-right:9pt;mso-wrap-distance-bottom:3.6pt;mso-position-horizontal:absolute;mso-position-horizontal-relative:margin;mso-position-vertical:absolute;mso-position-vertical-relative:text;mso-width-percent:0;mso-height-percent:0;mso-width-relative:margin;mso-height-relative:margin;v-text-anchor:top" o:gfxdata="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" filled="f" stroked="f">
+              <v:shape w14:anchorId="159D296B" id="_x0000_s1035" type="#_x0000_t202" style="position:absolute;left:0;text-align:left;margin-left:311.25pt;margin-top:7.6pt;width:57.3pt;height:16.95pt;z-index:487627264;visibility:visible;mso-wrap-style:square;mso-width-percent:0;mso-height-percent:0;mso-wrap-distance-left:9pt;mso-wrap-distance-top:3.6pt;mso-wrap-distance-right:9pt;mso-wrap-distance-bottom:3.6pt;mso-position-horizontal:absolute;mso-position-horizontal-relative:margin;mso-position-vertical:absolute;mso-position-vertical-relative:text;mso-width-percent:0;mso-height-percent:0;mso-width-relative:margin;mso-height-relative:margin;v-text-anchor:top" o:gfxdata="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" filled="f" stroked="f">
                 <v:textbox>
                   <w:txbxContent>
                     <w:p>
@@ -12590,14 +12459,7 @@
                           <w:sz w:val="16"/>
                           <w:szCs w:val="16"/>
                         </w:rPr>
-                        <w:t>Figure 4.8</w:t>
-                      </w:r>
-                      <w:r>
-                        <w:rPr>
-                          <w:sz w:val="16"/>
-                          <w:szCs w:val="16"/>
-                        </w:rPr>
-                        <w:t>B</w:t>
+                        <w:t>Figure 4.8B</w:t>
                       </w:r>
                     </w:p>
                   </w:txbxContent>
@@ -12668,14 +12530,7 @@
                                 <w:sz w:val="16"/>
                                 <w:szCs w:val="16"/>
                               </w:rPr>
-                              <w:t>Figure 4.</w:t>
-                            </w:r>
-                            <w:r>
-                              <w:rPr>
-                                <w:sz w:val="16"/>
-                                <w:szCs w:val="16"/>
-                              </w:rPr>
-                              <w:t>8A</w:t>
+                              <w:t>Figure 4.8A</w:t>
                             </w:r>
                           </w:p>
                         </w:txbxContent>
@@ -12697,7 +12552,7 @@
           </mc:Choice>
           <mc:Fallback>
             <w:pict>
-              <v:shape w14:anchorId="29EF2A27" id="_x0000_s1036" type="#_x0000_t202" style="position:absolute;left:0;text-align:left;margin-left:130.7pt;margin-top:9.1pt;width:57.3pt;height:16.95pt;z-index:487625216;visibility:visible;mso-wrap-style:square;mso-width-percent:0;mso-height-percent:0;mso-wrap-distance-left:9pt;mso-wrap-distance-top:3.6pt;mso-wrap-distance-right:9pt;mso-wrap-distance-bottom:3.6pt;mso-position-horizontal:absolute;mso-position-horizontal-relative:margin;mso-position-vertical:absolute;mso-position-vertical-relative:text;mso-width-percent:0;mso-height-percent:0;mso-width-relative:margin;mso-height-relative:margin;v-text-anchor:top" o:gfxdata="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" filled="f" stroked="f">
+              <v:shape w14:anchorId="29EF2A27" id="_x0000_s1036" type="#_x0000_t202" style="position:absolute;left:0;text-align:left;margin-left:130.7pt;margin-top:9.1pt;width:57.3pt;height:16.95pt;z-index:487625216;visibility:visible;mso-wrap-style:square;mso-width-percent:0;mso-height-percent:0;mso-wrap-distance-left:9pt;mso-wrap-distance-top:3.6pt;mso-wrap-distance-right:9pt;mso-wrap-distance-bottom:3.6pt;mso-position-horizontal:absolute;mso-position-horizontal-relative:margin;mso-position-vertical:absolute;mso-position-vertical-relative:text;mso-width-percent:0;mso-height-percent:0;mso-width-relative:margin;mso-height-relative:margin;v-text-anchor:top" o:gfxdata="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" filled="f" stroked="f">
                 <v:textbox>
                   <w:txbxContent>
                     <w:p>
@@ -12713,14 +12568,7 @@
                           <w:sz w:val="16"/>
                           <w:szCs w:val="16"/>
                         </w:rPr>
-                        <w:t>Figure 4.</w:t>
-                      </w:r>
-                      <w:r>
-                        <w:rPr>
-                          <w:sz w:val="16"/>
-                          <w:szCs w:val="16"/>
-                        </w:rPr>
-                        <w:t>8A</w:t>
+                        <w:t>Figure 4.8A</w:t>
                       </w:r>
                     </w:p>
                   </w:txbxContent>
@@ -12803,15 +12651,7 @@
         <w:jc w:val="both"/>
       </w:pPr>
       <w:r>
-        <w:t xml:space="preserve">The </w:t>
-      </w:r>
-      <w:proofErr w:type="gramStart"/>
-      <w:r>
-        <w:t>exploratory</w:t>
-      </w:r>
-      <w:proofErr w:type="gramEnd"/>
-      <w:r>
-        <w:t xml:space="preserve"> data analysis reveals several important insights:</w:t>
+        <w:t>The exploratory data analysis reveals several important insights:</w:t>
       </w:r>
     </w:p>
     <w:p>
@@ -12863,15 +12703,7 @@
         <w:jc w:val="both"/>
       </w:pPr>
       <w:r>
-        <w:t xml:space="preserve">Demand varies significantly </w:t>
-      </w:r>
-      <w:proofErr w:type="gramStart"/>
-      <w:r>
-        <w:t>across month</w:t>
-      </w:r>
-      <w:proofErr w:type="gramEnd"/>
-      <w:r>
-        <w:t>, day-of-week, and hour</w:t>
+        <w:t>Demand varies significantly across month, day-of-week, and hour</w:t>
       </w:r>
     </w:p>
     <w:p>
@@ -13375,7 +13207,7 @@
           <w:sz w:val="24"/>
           <w:szCs w:val="24"/>
         </w:rPr>
-        <w:t xml:space="preserve"> Integrated Moving Average with Exogenous Variables</w:t>
+        <w:t xml:space="preserve"> Integrated Moving Average with Exogenous Variables (</w:t>
       </w:r>
       <w:r>
         <w:rPr>
@@ -13384,8 +13216,40 @@
           <w:sz w:val="24"/>
           <w:szCs w:val="24"/>
         </w:rPr>
-        <w:t xml:space="preserve"> (</w:t>
-      </w:r>
+        <w:t>SARIMAX)</w:t>
+      </w:r>
+      <w:r>
+        <w:rPr>
+          <w:sz w:val="24"/>
+          <w:szCs w:val="24"/>
+        </w:rPr>
+        <w:t>:</w:t>
+      </w:r>
+      <w:r>
+        <w:rPr>
+          <w:sz w:val="24"/>
+          <w:szCs w:val="24"/>
+        </w:rPr>
+        <w:t xml:space="preserve"> </w:t>
+      </w:r>
+      <w:r>
+        <w:rPr>
+          <w:sz w:val="24"/>
+          <w:szCs w:val="24"/>
+        </w:rPr>
+        <w:t>A classical statistical model that captures linear temporal dependencies and seasonality, with temperature included as an external regressor.</w:t>
+      </w:r>
+    </w:p>
+    <w:p>
+      <w:pPr>
+        <w:spacing w:after="240"/>
+        <w:ind w:leftChars="64" w:left="141"/>
+        <w:jc w:val="both"/>
+        <w:rPr>
+          <w:sz w:val="24"/>
+          <w:szCs w:val="24"/>
+        </w:rPr>
+      </w:pPr>
       <w:r>
         <w:rPr>
           <w:b/>
@@ -13393,7 +13257,7 @@
           <w:sz w:val="24"/>
           <w:szCs w:val="24"/>
         </w:rPr>
-        <w:t>SARIMAX)</w:t>
+        <w:t>Gradient Boosting (GB)</w:t>
       </w:r>
       <w:r>
         <w:rPr>
@@ -13414,7 +13278,21 @@
           <w:sz w:val="24"/>
           <w:szCs w:val="24"/>
         </w:rPr>
-        <w:t>A classical statistical model that captures linear temporal dependencies and seasonality, with temperature included as an external regressor.</w:t>
+        <w:t>A tree-based machine learning model capable of capturing nonlinear relationships between features and demand, using engineered lag features and exogenous inputs.</w:t>
+      </w:r>
+      <w:r>
+        <w:rPr>
+          <w:sz w:val="24"/>
+          <w:szCs w:val="24"/>
+        </w:rPr>
+        <w:t xml:space="preserve">  </w:t>
+      </w:r>
+      <w:r>
+        <w:rPr>
+          <w:sz w:val="24"/>
+          <w:szCs w:val="24"/>
+        </w:rPr>
+        <w:t>In this study, lag features such as demand values from previous time steps (e.g., one day and one week prior) were explicitly constructed to provide the model with historical context, enabling it to learn temporal dependencies in the time series despite not being inherently sequential in structure.</w:t>
       </w:r>
     </w:p>
     <w:p>
@@ -13434,7 +13312,7 @@
           <w:sz w:val="24"/>
           <w:szCs w:val="24"/>
         </w:rPr>
-        <w:t>Gradient Boosting (GB)</w:t>
+        <w:t>Long Short-Term Memory (LSTM)</w:t>
       </w:r>
       <w:r>
         <w:rPr>
@@ -13455,37 +13333,21 @@
           <w:sz w:val="24"/>
           <w:szCs w:val="24"/>
         </w:rPr>
-        <w:t xml:space="preserve">A </w:t>
-      </w:r>
-      <w:proofErr w:type="gramStart"/>
+        <w:t>A recurrent neural network designed to model sequential data and long-term dependencies, particularly suitable for time series forecasting.</w:t>
+      </w:r>
       <w:r>
         <w:rPr>
           <w:sz w:val="24"/>
           <w:szCs w:val="24"/>
         </w:rPr>
-        <w:t>tree</w:t>
-      </w:r>
-      <w:proofErr w:type="gramEnd"/>
+        <w:t xml:space="preserve"> </w:t>
+      </w:r>
       <w:r>
         <w:rPr>
           <w:sz w:val="24"/>
           <w:szCs w:val="24"/>
         </w:rPr>
-        <w:t>-based machine learning model capable of capturing nonlinear relationships between features and demand, using engineered lag features and exogenous inputs.</w:t>
-      </w:r>
-      <w:r>
-        <w:rPr>
-          <w:sz w:val="24"/>
-          <w:szCs w:val="24"/>
-        </w:rPr>
-        <w:t xml:space="preserve">  </w:t>
-      </w:r>
-      <w:r>
-        <w:rPr>
-          <w:sz w:val="24"/>
-          <w:szCs w:val="24"/>
-        </w:rPr>
-        <w:t>In this study, lag features such as demand values from previous time steps (e.g., one day and one week prior) were explicitly constructed to provide the model with historical context, enabling it to learn temporal dependencies in the time series despite not being inherently sequential in structure.</w:t>
+        <w:t>In this study, three different LSTM configurations were implemented to evaluate the impact of model complexity and input settings on forecasting performance.</w:t>
       </w:r>
     </w:p>
     <w:p>
@@ -13505,8 +13367,9 @@
           <w:sz w:val="24"/>
           <w:szCs w:val="24"/>
         </w:rPr>
-        <w:t>Long Short-Term Memory</w:t>
-      </w:r>
+        <w:t>Transformer-based model (</w:t>
+      </w:r>
+      <w:proofErr w:type="spellStart"/>
       <w:r>
         <w:rPr>
           <w:b/>
@@ -13514,8 +13377,9 @@
           <w:sz w:val="24"/>
           <w:szCs w:val="24"/>
         </w:rPr>
-        <w:t xml:space="preserve"> (</w:t>
-      </w:r>
+        <w:t>PatchTST</w:t>
+      </w:r>
+      <w:proofErr w:type="spellEnd"/>
       <w:r>
         <w:rPr>
           <w:b/>
@@ -13523,7 +13387,7 @@
           <w:sz w:val="24"/>
           <w:szCs w:val="24"/>
         </w:rPr>
-        <w:t>LSTM)</w:t>
+        <w:t>)</w:t>
       </w:r>
       <w:r>
         <w:rPr>
@@ -13532,45 +13396,6 @@
         </w:rPr>
         <w:t>:</w:t>
       </w:r>
-      <w:r>
-        <w:rPr>
-          <w:sz w:val="24"/>
-          <w:szCs w:val="24"/>
-        </w:rPr>
-        <w:t xml:space="preserve"> </w:t>
-      </w:r>
-      <w:r>
-        <w:rPr>
-          <w:sz w:val="24"/>
-          <w:szCs w:val="24"/>
-        </w:rPr>
-        <w:t>A recurrent neural network designed to model sequential data and long-term dependencies, particularly suitable for time series forecasting.</w:t>
-      </w:r>
-      <w:r>
-        <w:rPr>
-          <w:sz w:val="24"/>
-          <w:szCs w:val="24"/>
-        </w:rPr>
-        <w:t xml:space="preserve"> </w:t>
-      </w:r>
-      <w:r>
-        <w:rPr>
-          <w:sz w:val="24"/>
-          <w:szCs w:val="24"/>
-        </w:rPr>
-        <w:t>In this study, three different LSTM configurations were implemented to evaluate the impact of model complexity and input settings on forecasting performance.</w:t>
-      </w:r>
-    </w:p>
-    <w:p>
-      <w:pPr>
-        <w:spacing w:after="240"/>
-        <w:ind w:leftChars="64" w:left="141"/>
-        <w:jc w:val="both"/>
-        <w:rPr>
-          <w:sz w:val="24"/>
-          <w:szCs w:val="24"/>
-        </w:rPr>
-      </w:pPr>
       <w:r>
         <w:rPr>
           <w:b/>
@@ -13578,114 +13403,44 @@
           <w:sz w:val="24"/>
           <w:szCs w:val="24"/>
         </w:rPr>
-        <w:t>Transformer-based model</w:t>
-      </w:r>
-      <w:r>
-        <w:rPr>
-          <w:b/>
-          <w:bCs/>
+        <w:t xml:space="preserve"> </w:t>
+      </w:r>
+      <w:r>
+        <w:rPr>
           <w:sz w:val="24"/>
           <w:szCs w:val="24"/>
         </w:rPr>
-        <w:t xml:space="preserve"> (</w:t>
+        <w:t>A state-of-the-art transformer architecture that processes time series in patches, enabling efficient learning of long-range dependencies and complex temporal patterns.</w:t>
+      </w:r>
+      <w:r>
+        <w:rPr>
+          <w:sz w:val="24"/>
+          <w:szCs w:val="24"/>
+        </w:rPr>
+        <w:t xml:space="preserve"> </w:t>
+      </w:r>
+      <w:r>
+        <w:rPr>
+          <w:sz w:val="24"/>
+          <w:szCs w:val="24"/>
+        </w:rPr>
+        <w:t xml:space="preserve">In this study, two variants of the </w:t>
       </w:r>
       <w:proofErr w:type="spellStart"/>
       <w:r>
         <w:rPr>
-          <w:b/>
-          <w:bCs/>
           <w:sz w:val="24"/>
           <w:szCs w:val="24"/>
         </w:rPr>
-        <w:t>P</w:t>
-      </w:r>
-      <w:r>
-        <w:rPr>
-          <w:b/>
-          <w:bCs/>
+        <w:t>PatchTST</w:t>
+      </w:r>
+      <w:proofErr w:type="spellEnd"/>
+      <w:r>
+        <w:rPr>
           <w:sz w:val="24"/>
           <w:szCs w:val="24"/>
         </w:rPr>
-        <w:t>atchTST</w:t>
-      </w:r>
-      <w:proofErr w:type="spellEnd"/>
-      <w:r>
-        <w:rPr>
-          <w:b/>
-          <w:bCs/>
-          <w:sz w:val="24"/>
-          <w:szCs w:val="24"/>
-        </w:rPr>
-        <w:t>)</w:t>
-      </w:r>
-      <w:r>
-        <w:rPr>
-          <w:sz w:val="24"/>
-          <w:szCs w:val="24"/>
-        </w:rPr>
-        <w:t>:</w:t>
-      </w:r>
-      <w:r>
-        <w:rPr>
-          <w:b/>
-          <w:bCs/>
-          <w:sz w:val="24"/>
-          <w:szCs w:val="24"/>
-        </w:rPr>
-        <w:t xml:space="preserve"> </w:t>
-      </w:r>
-      <w:r>
-        <w:rPr>
-          <w:sz w:val="24"/>
-          <w:szCs w:val="24"/>
-        </w:rPr>
-        <w:t>A state-of-the-art transformer architecture that processes time series in patches, enabling efficient learning of long-range dependencies and complex temporal patterns.</w:t>
-      </w:r>
-      <w:r>
-        <w:rPr>
-          <w:sz w:val="24"/>
-          <w:szCs w:val="24"/>
-        </w:rPr>
-        <w:t xml:space="preserve"> </w:t>
-      </w:r>
-      <w:r>
-        <w:rPr>
-          <w:sz w:val="24"/>
-          <w:szCs w:val="24"/>
-        </w:rPr>
-        <w:t xml:space="preserve">In this study, two variants of the </w:t>
-      </w:r>
-      <w:proofErr w:type="spellStart"/>
-      <w:r>
-        <w:rPr>
-          <w:sz w:val="24"/>
-          <w:szCs w:val="24"/>
-        </w:rPr>
-        <w:t>PatchTST</w:t>
-      </w:r>
-      <w:proofErr w:type="spellEnd"/>
-      <w:r>
-        <w:rPr>
-          <w:sz w:val="24"/>
-          <w:szCs w:val="24"/>
-        </w:rPr>
-        <w:t xml:space="preserve"> model were </w:t>
-      </w:r>
-      <w:proofErr w:type="gramStart"/>
-      <w:r>
-        <w:rPr>
-          <w:sz w:val="24"/>
-          <w:szCs w:val="24"/>
-        </w:rPr>
-        <w:t>implemented—</w:t>
-      </w:r>
-      <w:proofErr w:type="gramEnd"/>
-      <w:r>
-        <w:rPr>
-          <w:sz w:val="24"/>
-          <w:szCs w:val="24"/>
-        </w:rPr>
-        <w:t>one using only historical demand data and another incorporating temperature as an exogenous feature—to evaluate the impact of external variables on forecasting performance</w:t>
+        <w:t xml:space="preserve"> model were implemented—one using only historical demand data and another incorporating temperature as an exogenous feature—to evaluate the impact of external variables on forecasting performance</w:t>
       </w:r>
       <w:r>
         <w:rPr>
@@ -14086,13 +13841,7 @@
         <w:rPr>
           <w:highlight w:val="yellow"/>
         </w:rPr>
-        <w:t xml:space="preserve"> </w:t>
-      </w:r>
-      <w:r>
-        <w:rPr>
-          <w:highlight w:val="yellow"/>
-        </w:rPr>
-        <w:t>[TBC]</w:t>
+        <w:t xml:space="preserve"> [TBC]</w:t>
       </w:r>
       <w:bookmarkEnd w:id="50"/>
     </w:p>
@@ -14235,23 +13984,7 @@
           <w:sz w:val="24"/>
           <w:szCs w:val="24"/>
         </w:rPr>
-        <w:t xml:space="preserve"> the performance of all models across different </w:t>
-      </w:r>
-      <w:proofErr w:type="gramStart"/>
-      <w:r>
-        <w:rPr>
-          <w:sz w:val="24"/>
-          <w:szCs w:val="24"/>
-        </w:rPr>
-        <w:t>forecasting</w:t>
-      </w:r>
-      <w:proofErr w:type="gramEnd"/>
-      <w:r>
-        <w:rPr>
-          <w:sz w:val="24"/>
-          <w:szCs w:val="24"/>
-        </w:rPr>
-        <w:t xml:space="preserve"> horizons.</w:t>
+        <w:t xml:space="preserve"> the performance of all models across different forecasting horizons.</w:t>
       </w:r>
     </w:p>
     <w:tbl>
@@ -14836,21 +14569,7 @@
                 <w:sz w:val="18"/>
                 <w:szCs w:val="18"/>
               </w:rPr>
-              <w:t>ith lag feature</w:t>
-            </w:r>
-            <w:r>
-              <w:rPr>
-                <w:sz w:val="18"/>
-                <w:szCs w:val="18"/>
-              </w:rPr>
-              <w:t>s</w:t>
-            </w:r>
-            <w:r>
-              <w:rPr>
-                <w:sz w:val="18"/>
-                <w:szCs w:val="18"/>
-              </w:rPr>
-              <w:t>)</w:t>
+              <w:t>ith lag features)</w:t>
             </w:r>
           </w:p>
         </w:tc>
@@ -14902,21 +14621,7 @@
                 <w:sz w:val="18"/>
                 <w:szCs w:val="18"/>
               </w:rPr>
-              <w:t>ith lag feature</w:t>
-            </w:r>
-            <w:r>
-              <w:rPr>
-                <w:sz w:val="18"/>
-                <w:szCs w:val="18"/>
-              </w:rPr>
-              <w:t>s</w:t>
-            </w:r>
-            <w:r>
-              <w:rPr>
-                <w:sz w:val="18"/>
-                <w:szCs w:val="18"/>
-              </w:rPr>
-              <w:t>)</w:t>
+              <w:t>ith lag features)</w:t>
             </w:r>
           </w:p>
         </w:tc>
@@ -15688,21 +15393,12 @@
           <w:cols w:space="720"/>
         </w:sectPr>
       </w:pPr>
-      <w:proofErr w:type="gramStart"/>
       <w:r>
         <w:rPr>
           <w:sz w:val="20"/>
           <w:szCs w:val="20"/>
         </w:rPr>
-        <w:t>Remark (#</w:t>
-      </w:r>
-      <w:proofErr w:type="gramEnd"/>
-      <w:r>
-        <w:rPr>
-          <w:sz w:val="20"/>
-          <w:szCs w:val="20"/>
-        </w:rPr>
-        <w:t xml:space="preserve">): </w:t>
+        <w:t xml:space="preserve">Remark (#): </w:t>
       </w:r>
       <w:proofErr w:type="spellStart"/>
       <w:r>
@@ -16317,15 +16013,7 @@
         <w:jc w:val="both"/>
       </w:pPr>
       <w:r>
-        <w:t xml:space="preserve">The </w:t>
-      </w:r>
-      <w:proofErr w:type="gramStart"/>
-      <w:r>
-        <w:t>provided operational forecast</w:t>
-      </w:r>
-      <w:proofErr w:type="gramEnd"/>
-      <w:r>
-        <w:t xml:space="preserve"> consistently outperforms the developed models in short-term forecasting. This is likely due to its access to additional exogenous information and domain-specific knowledge that are not available to the models developed in this study.</w:t>
+        <w:t>The provided operational forecast consistently outperforms the developed models in short-term forecasting. This is likely due to its access to additional exogenous information and domain-specific knowledge that are not available to the models developed in this study.</w:t>
       </w:r>
     </w:p>
     <w:p>
@@ -16370,15 +16058,7 @@
         <w:jc w:val="both"/>
       </w:pPr>
       <w:r>
-        <w:t xml:space="preserve">Even advanced models such as LSTM and transformer-based </w:t>
-      </w:r>
-      <w:proofErr w:type="gramStart"/>
-      <w:r>
-        <w:t>architectures</w:t>
-      </w:r>
-      <w:proofErr w:type="gramEnd"/>
-      <w:r>
-        <w:t xml:space="preserve"> are constrained by the information available to them. While these models </w:t>
+        <w:t xml:space="preserve">Even advanced models such as LSTM and transformer-based architectures are constrained by the information available to them. While these models </w:t>
       </w:r>
       <w:proofErr w:type="gramStart"/>
       <w:r>
@@ -16818,23 +16498,7 @@
           <w:sz w:val="24"/>
           <w:szCs w:val="24"/>
         </w:rPr>
-        <w:t>Traditional models may be insufficient for complex, non-</w:t>
-      </w:r>
-      <w:proofErr w:type="gramStart"/>
-      <w:r>
-        <w:rPr>
-          <w:sz w:val="24"/>
-          <w:szCs w:val="24"/>
-        </w:rPr>
-        <w:t>linear time</w:t>
-      </w:r>
-      <w:proofErr w:type="gramEnd"/>
-      <w:r>
-        <w:rPr>
-          <w:sz w:val="24"/>
-          <w:szCs w:val="24"/>
-        </w:rPr>
-        <w:t xml:space="preserve"> series</w:t>
+        <w:t>Traditional models may be insufficient for complex, non-linear time series</w:t>
       </w:r>
     </w:p>
     <w:p>
@@ -16962,7 +16626,6 @@
           <w:szCs w:val="24"/>
         </w:rPr>
       </w:pPr>
-      <w:proofErr w:type="gramStart"/>
       <w:r>
         <w:rPr>
           <w:sz w:val="24"/>
@@ -16975,15 +16638,7 @@
           <w:sz w:val="24"/>
           <w:szCs w:val="24"/>
         </w:rPr>
-        <w:t>xtend</w:t>
-      </w:r>
-      <w:proofErr w:type="gramEnd"/>
-      <w:r>
-        <w:rPr>
-          <w:sz w:val="24"/>
-          <w:szCs w:val="24"/>
-        </w:rPr>
-        <w:t xml:space="preserve"> analysis to other regions or datasets</w:t>
+        <w:t>xtend analysis to other regions or datasets</w:t>
       </w:r>
     </w:p>
     <w:p>
@@ -17027,7 +16682,6 @@
         <w:t xml:space="preserve">Box, G.E.P., Jenkins, G.M., Reinsel, G.C. and Ljung, G.M. (2015), Time Series Analysis: Forecasting and Control, 5th </w:t>
       </w:r>
       <w:proofErr w:type="spellStart"/>
-      <w:proofErr w:type="gramStart"/>
       <w:r>
         <w:rPr>
           <w:w w:val="110"/>
@@ -17036,7 +16690,6 @@
         <w:t>edn</w:t>
       </w:r>
       <w:proofErr w:type="spellEnd"/>
-      <w:proofErr w:type="gramEnd"/>
       <w:r>
         <w:rPr>
           <w:w w:val="110"/>
@@ -17065,7 +16718,39 @@
           <w:w w:val="110"/>
           <w:szCs w:val="22"/>
         </w:rPr>
-        <w:t>Fan, S. and Hyndman, R.J. (2012), ‘Short-term load forecasting based on a semi-parametric additive model’, IEEE Transactions on Power Systems, 27(1), pp. 134–141.</w:t>
+        <w:t xml:space="preserve">Chen, T. and </w:t>
+      </w:r>
+      <w:proofErr w:type="spellStart"/>
+      <w:r>
+        <w:rPr>
+          <w:w w:val="110"/>
+          <w:szCs w:val="22"/>
+        </w:rPr>
+        <w:t>Guestrin</w:t>
+      </w:r>
+      <w:proofErr w:type="spellEnd"/>
+      <w:r>
+        <w:rPr>
+          <w:w w:val="110"/>
+          <w:szCs w:val="22"/>
+        </w:rPr>
+        <w:t>, C. (2016) ‘</w:t>
+      </w:r>
+      <w:proofErr w:type="spellStart"/>
+      <w:r>
+        <w:rPr>
+          <w:w w:val="110"/>
+          <w:szCs w:val="22"/>
+        </w:rPr>
+        <w:t>XGBoost</w:t>
+      </w:r>
+      <w:proofErr w:type="spellEnd"/>
+      <w:r>
+        <w:rPr>
+          <w:w w:val="110"/>
+          <w:szCs w:val="22"/>
+        </w:rPr>
+        <w:t>: A scalable tree boosting system’, Proceedings of the 22nd ACM SIGKDD International Conference on Knowledge Discovery and Data Mining, pp. 785–794.</w:t>
       </w:r>
     </w:p>
     <w:p>
@@ -17088,23 +16773,7 @@
           <w:w w:val="110"/>
           <w:szCs w:val="22"/>
         </w:rPr>
-        <w:t xml:space="preserve">Hochreiter, S. and </w:t>
-      </w:r>
-      <w:proofErr w:type="spellStart"/>
-      <w:r>
-        <w:rPr>
-          <w:w w:val="110"/>
-          <w:szCs w:val="22"/>
-        </w:rPr>
-        <w:t>Schmidhuber</w:t>
-      </w:r>
-      <w:proofErr w:type="spellEnd"/>
-      <w:r>
-        <w:rPr>
-          <w:w w:val="110"/>
-          <w:szCs w:val="22"/>
-        </w:rPr>
-        <w:t>, J. (1997), ‘Long short-term memory’, Neural Computation, 9(8), pp. 1735–1780.</w:t>
+        <w:t>Fan, S. and Hyndman, R.J. (2012), ‘Short-term load forecasting based on a semi-parametric additive model’, IEEE Transactions on Power Systems, 27(1), pp. 134–141.</w:t>
       </w:r>
     </w:p>
     <w:p>
@@ -17127,7 +16796,7 @@
           <w:w w:val="110"/>
           <w:szCs w:val="22"/>
         </w:rPr>
-        <w:t>Hippert, H.S., Pedreira, C.E. and Souza, R.C. (2001), ‘Neural networks for short-term load forecasting: A review and evaluation’, IEEE Transactions on Power Systems, 16(1), pp. 44–55.</w:t>
+        <w:t>Friedman, J.H. (2001) ‘Greedy function approximation: A gradient boosting machine’, Annals of Statistics, 29(5), pp. 1189–1232.</w:t>
       </w:r>
     </w:p>
     <w:p>
@@ -17150,7 +16819,39 @@
           <w:w w:val="110"/>
           <w:szCs w:val="22"/>
         </w:rPr>
-        <w:t>Kong, W. et al. (2017), ‘Short-term residential load forecasting based on LSTM’, IEEE Transactions on Smart Grid, 10(1), pp. 841–851.</w:t>
+        <w:t xml:space="preserve">Hastie, T., </w:t>
+      </w:r>
+      <w:proofErr w:type="spellStart"/>
+      <w:r>
+        <w:rPr>
+          <w:w w:val="110"/>
+          <w:szCs w:val="22"/>
+        </w:rPr>
+        <w:t>Tibshirani</w:t>
+      </w:r>
+      <w:proofErr w:type="spellEnd"/>
+      <w:r>
+        <w:rPr>
+          <w:w w:val="110"/>
+          <w:szCs w:val="22"/>
+        </w:rPr>
+        <w:t xml:space="preserve">, R. and Friedman, J. (2009) The Elements of Statistical Learning. 2nd </w:t>
+      </w:r>
+      <w:proofErr w:type="spellStart"/>
+      <w:r>
+        <w:rPr>
+          <w:w w:val="110"/>
+          <w:szCs w:val="22"/>
+        </w:rPr>
+        <w:t>edn</w:t>
+      </w:r>
+      <w:proofErr w:type="spellEnd"/>
+      <w:r>
+        <w:rPr>
+          <w:w w:val="110"/>
+          <w:szCs w:val="22"/>
+        </w:rPr>
+        <w:t>. New York: Springer.</w:t>
       </w:r>
     </w:p>
     <w:p>
@@ -17173,7 +16874,7 @@
           <w:w w:val="110"/>
           <w:szCs w:val="22"/>
         </w:rPr>
-        <w:t>Li, H., Shao, J., Liao, K. and Tang, M. (2022), ‘Do simpler statistical methods perform better in multivariate long sequence time-series forecasting?’, Proceedings of the 31st ACM International Conference on Information and Knowledge Management (CIKM), pp. 4168–4172.</w:t>
+        <w:t>Hippert, H.S., Pedreira, C.E. and Souza, R.C. (2001), ‘Neural networks for short-term load forecasting: A review and evaluation’, IEEE Transactions on Power Systems, 16(1), pp. 44–55.</w:t>
       </w:r>
     </w:p>
     <w:p>
@@ -17196,7 +16897,23 @@
           <w:w w:val="110"/>
           <w:szCs w:val="22"/>
         </w:rPr>
-        <w:t>Marino, D.L., Amarasinghe, K. and Manic, M. (2016), ‘Building energy load forecasting using deep neural networks’, Proceedings of the IEEE Industrial Electronics Conference (IECON), pp. 7046–7051.</w:t>
+        <w:t xml:space="preserve">Hochreiter, S. and </w:t>
+      </w:r>
+      <w:proofErr w:type="spellStart"/>
+      <w:r>
+        <w:rPr>
+          <w:w w:val="110"/>
+          <w:szCs w:val="22"/>
+        </w:rPr>
+        <w:t>Schmidhuber</w:t>
+      </w:r>
+      <w:proofErr w:type="spellEnd"/>
+      <w:r>
+        <w:rPr>
+          <w:w w:val="110"/>
+          <w:szCs w:val="22"/>
+        </w:rPr>
+        <w:t>, J. (1997), ‘Long short-term memory’, Neural Computation, 9(8), pp. 1735–1780.</w:t>
       </w:r>
     </w:p>
     <w:p>
@@ -17219,23 +16936,23 @@
           <w:w w:val="110"/>
           <w:szCs w:val="22"/>
         </w:rPr>
-        <w:t>Nie, Y. et al. (2023</w:t>
-      </w:r>
-      <w:proofErr w:type="gramStart"/>
+        <w:t>Ke, G. et al. (2017) ‘</w:t>
+      </w:r>
+      <w:proofErr w:type="spellStart"/>
       <w:r>
         <w:rPr>
           <w:w w:val="110"/>
           <w:szCs w:val="22"/>
         </w:rPr>
-        <w:t>), ‘</w:t>
-      </w:r>
-      <w:proofErr w:type="gramEnd"/>
+        <w:t>LightGBM</w:t>
+      </w:r>
+      <w:proofErr w:type="spellEnd"/>
       <w:r>
         <w:rPr>
           <w:w w:val="110"/>
           <w:szCs w:val="22"/>
         </w:rPr>
-        <w:t>A time series is worth 64 words: Long-term forecasting with transformers’, Proceedings of the International Conference on Learning Representations (ICLR).</w:t>
+        <w:t>: A highly efficient gradient boosting decision tree’, Advances in Neural Information Processing Systems, 30.</w:t>
       </w:r>
     </w:p>
     <w:p>
@@ -17253,37 +16970,12 @@
           <w:szCs w:val="22"/>
         </w:rPr>
       </w:pPr>
-      <w:proofErr w:type="spellStart"/>
       <w:r>
         <w:rPr>
           <w:w w:val="110"/>
           <w:szCs w:val="22"/>
         </w:rPr>
-        <w:t>Pełka</w:t>
-      </w:r>
-      <w:proofErr w:type="spellEnd"/>
-      <w:r>
-        <w:rPr>
-          <w:w w:val="110"/>
-          <w:szCs w:val="22"/>
-        </w:rPr>
-        <w:t xml:space="preserve">, P. and Dudek, G. (2020), ‘Pattern-based LSTM for mid-term electrical load forecasting’, </w:t>
-      </w:r>
-      <w:proofErr w:type="spellStart"/>
-      <w:r>
-        <w:rPr>
-          <w:w w:val="110"/>
-          <w:szCs w:val="22"/>
-        </w:rPr>
-        <w:t>arXiv</w:t>
-      </w:r>
-      <w:proofErr w:type="spellEnd"/>
-      <w:r>
-        <w:rPr>
-          <w:w w:val="110"/>
-          <w:szCs w:val="22"/>
-        </w:rPr>
-        <w:t xml:space="preserve"> [online]. Available at: https://arxiv.org/abs/2004.11834 (Accessed: 23 March 2026).</w:t>
+        <w:t>Kong, W. et al. (2017), ‘Short-term residential load forecasting based on LSTM’, IEEE Transactions on Smart Grid, 10(1), pp. 841–851.</w:t>
       </w:r>
     </w:p>
     <w:p>
@@ -17306,7 +16998,202 @@
           <w:w w:val="110"/>
           <w:szCs w:val="22"/>
         </w:rPr>
-        <w:t>Taylor, J.W. (2003), ‘Short-term electricity demand forecasting using double seasonal exponential smoothing’, Journal of the Operational Research Society, 54(8), pp. 799–805.</w:t>
+        <w:t>Li, H., Shao, J., Liao, K. and Tang, M. (2022), ‘Do simpler statistical methods perform better in multivariate long sequence time-series forecasting?’, Proceedings of the 31st ACM International Conference on Information and Knowledge Management (CIKM), pp. 4168–4172.</w:t>
+      </w:r>
+    </w:p>
+    <w:p>
+      <w:pPr>
+        <w:pStyle w:val="BodyText"/>
+        <w:numPr>
+          <w:ilvl w:val="0"/>
+          <w:numId w:val="10"/>
+        </w:numPr>
+        <w:spacing w:line="287" w:lineRule="exact"/>
+        <w:ind w:rightChars="388" w:right="854"/>
+        <w:jc w:val="both"/>
+        <w:rPr>
+          <w:w w:val="110"/>
+          <w:szCs w:val="22"/>
+        </w:rPr>
+      </w:pPr>
+      <w:proofErr w:type="spellStart"/>
+      <w:r>
+        <w:rPr>
+          <w:w w:val="110"/>
+          <w:szCs w:val="22"/>
+        </w:rPr>
+        <w:t>Makridakis</w:t>
+      </w:r>
+      <w:proofErr w:type="spellEnd"/>
+      <w:r>
+        <w:rPr>
+          <w:w w:val="110"/>
+          <w:szCs w:val="22"/>
+        </w:rPr>
+        <w:t xml:space="preserve">, S., Spiliotis, E. and </w:t>
+      </w:r>
+      <w:proofErr w:type="spellStart"/>
+      <w:r>
+        <w:rPr>
+          <w:w w:val="110"/>
+          <w:szCs w:val="22"/>
+        </w:rPr>
+        <w:t>Assimakopoulos</w:t>
+      </w:r>
+      <w:proofErr w:type="spellEnd"/>
+      <w:r>
+        <w:rPr>
+          <w:w w:val="110"/>
+          <w:szCs w:val="22"/>
+        </w:rPr>
+        <w:t>, V. (2018) ‘The M4 Competition: Results, findings, conclusion and way forward’, International Journal of Forecasting, 34(4), pp. 802–808.</w:t>
+      </w:r>
+    </w:p>
+    <w:p>
+      <w:pPr>
+        <w:pStyle w:val="BodyText"/>
+        <w:numPr>
+          <w:ilvl w:val="0"/>
+          <w:numId w:val="10"/>
+        </w:numPr>
+        <w:spacing w:line="287" w:lineRule="exact"/>
+        <w:ind w:rightChars="388" w:right="854"/>
+        <w:jc w:val="both"/>
+        <w:rPr>
+          <w:w w:val="110"/>
+          <w:szCs w:val="22"/>
+        </w:rPr>
+      </w:pPr>
+      <w:r>
+        <w:rPr>
+          <w:w w:val="110"/>
+          <w:szCs w:val="22"/>
+        </w:rPr>
+        <w:t>Marino, D.L., Amarasinghe, K. and Manic, M. (2016), ‘Building energy load forecasting using deep neural networks’, Proceedings of the IEEE Industrial Electronics Conference (IECON), pp. 7046–7051.</w:t>
+      </w:r>
+    </w:p>
+    <w:p>
+      <w:pPr>
+        <w:pStyle w:val="BodyText"/>
+        <w:numPr>
+          <w:ilvl w:val="0"/>
+          <w:numId w:val="10"/>
+        </w:numPr>
+        <w:spacing w:line="287" w:lineRule="exact"/>
+        <w:ind w:rightChars="388" w:right="854"/>
+        <w:jc w:val="both"/>
+        <w:rPr>
+          <w:w w:val="110"/>
+          <w:szCs w:val="22"/>
+        </w:rPr>
+      </w:pPr>
+      <w:r>
+        <w:rPr>
+          <w:w w:val="110"/>
+          <w:szCs w:val="22"/>
+        </w:rPr>
+        <w:t>Nie, Y. et al. (2023), ‘A time series is worth 64 words: Long-term forecasting with transformers’, Proceedings of the International Conference on Learning Representations (ICLR).</w:t>
+      </w:r>
+    </w:p>
+    <w:p>
+      <w:pPr>
+        <w:pStyle w:val="BodyText"/>
+        <w:numPr>
+          <w:ilvl w:val="0"/>
+          <w:numId w:val="10"/>
+        </w:numPr>
+        <w:spacing w:line="287" w:lineRule="exact"/>
+        <w:ind w:rightChars="388" w:right="854"/>
+        <w:jc w:val="both"/>
+        <w:rPr>
+          <w:w w:val="110"/>
+          <w:szCs w:val="22"/>
+        </w:rPr>
+      </w:pPr>
+      <w:proofErr w:type="spellStart"/>
+      <w:r>
+        <w:rPr>
+          <w:w w:val="110"/>
+          <w:szCs w:val="22"/>
+        </w:rPr>
+        <w:t>Pełka</w:t>
+      </w:r>
+      <w:proofErr w:type="spellEnd"/>
+      <w:r>
+        <w:rPr>
+          <w:w w:val="110"/>
+          <w:szCs w:val="22"/>
+        </w:rPr>
+        <w:t xml:space="preserve">, P. and Dudek, G. (2020), ‘Pattern-based LSTM for mid-term electrical load forecasting’, </w:t>
+      </w:r>
+      <w:proofErr w:type="spellStart"/>
+      <w:r>
+        <w:rPr>
+          <w:w w:val="110"/>
+          <w:szCs w:val="22"/>
+        </w:rPr>
+        <w:t>arXiv</w:t>
+      </w:r>
+      <w:proofErr w:type="spellEnd"/>
+      <w:r>
+        <w:rPr>
+          <w:w w:val="110"/>
+          <w:szCs w:val="22"/>
+        </w:rPr>
+        <w:t xml:space="preserve"> [online]. Available at: https://arxiv.org/abs/2004.11834 (Accessed: 23 March 2026).</w:t>
+      </w:r>
+    </w:p>
+    <w:p>
+      <w:pPr>
+        <w:pStyle w:val="BodyText"/>
+        <w:numPr>
+          <w:ilvl w:val="0"/>
+          <w:numId w:val="10"/>
+        </w:numPr>
+        <w:spacing w:line="287" w:lineRule="exact"/>
+        <w:ind w:rightChars="388" w:right="854"/>
+        <w:jc w:val="both"/>
+      </w:pPr>
+      <w:r>
+        <w:rPr>
+          <w:w w:val="110"/>
+          <w:szCs w:val="22"/>
+        </w:rPr>
+        <w:t>Taieb, S.B. and Hyndman, R.J. (2014) ‘A gradient boosting approach to the Kaggle load forecasting competition’, International Journal of Forecasting, 30(2), pp. 382–394</w:t>
+      </w:r>
+      <w:r>
+        <w:t>.</w:t>
+      </w:r>
+    </w:p>
+    <w:p>
+      <w:pPr>
+        <w:pStyle w:val="BodyText"/>
+        <w:numPr>
+          <w:ilvl w:val="0"/>
+          <w:numId w:val="10"/>
+        </w:numPr>
+        <w:spacing w:line="287" w:lineRule="exact"/>
+        <w:ind w:rightChars="388" w:right="854"/>
+        <w:jc w:val="both"/>
+        <w:rPr>
+          <w:w w:val="110"/>
+          <w:szCs w:val="22"/>
+        </w:rPr>
+      </w:pPr>
+      <w:r>
+        <w:rPr>
+          <w:w w:val="110"/>
+          <w:szCs w:val="22"/>
+        </w:rPr>
+        <w:t xml:space="preserve">Taylor, J.W. (2003), ‘Short-term electricity demand forecasting using double </w:t>
+      </w:r>
+      <w:r>
+        <w:rPr>
+          <w:w w:val="110"/>
+          <w:szCs w:val="22"/>
+        </w:rPr>
+        <w:lastRenderedPageBreak/>
+        <w:t>seasonal exponential smoothing’, Journal of the Operational Research Society, 54(8), pp. 799–805.</w:t>
       </w:r>
     </w:p>
     <w:p>
@@ -17643,19 +17530,11 @@
         </w:rPr>
         <w:t xml:space="preserve"> </w:t>
       </w:r>
-      <w:proofErr w:type="spellStart"/>
       <w:r>
         <w:rPr>
           <w:w w:val="110"/>
         </w:rPr>
-        <w:t>sim</w:t>
-      </w:r>
-      <w:proofErr w:type="spellEnd"/>
-      <w:r>
-        <w:rPr>
-          <w:w w:val="110"/>
-        </w:rPr>
-        <w:t>-</w:t>
+        <w:t>sim-</w:t>
       </w:r>
       <w:proofErr w:type="spellStart"/>
       <w:r>
@@ -17687,7 +17566,6 @@
         </w:rPr>
         <w:t xml:space="preserve"> </w:t>
       </w:r>
-      <w:proofErr w:type="gramStart"/>
       <w:r>
         <w:rPr>
           <w:spacing w:val="-2"/>
@@ -17768,7 +17646,6 @@
         </w:rPr>
         <w:t>X.</w:t>
       </w:r>
-      <w:proofErr w:type="gramEnd"/>
     </w:p>
     <w:p>
       <w:pPr>
@@ -18337,7 +18214,6 @@
                             </w:rPr>
                             <w:fldChar w:fldCharType="separate"/>
                           </w:r>
-                          <w:proofErr w:type="spellStart"/>
                           <w:r>
                             <w:rPr>
                               <w:spacing w:val="-10"/>
@@ -18345,7 +18221,6 @@
                             </w:rPr>
                             <w:t>i</w:t>
                           </w:r>
-                          <w:proofErr w:type="spellEnd"/>
                           <w:r>
                             <w:rPr>
                               <w:spacing w:val="-10"/>
@@ -18371,7 +18246,7 @@
               <v:stroke joinstyle="miter"/>
               <v:path gradientshapeok="t" o:connecttype="rect"/>
             </v:shapetype>
-            <v:shape id="Textbox 5" o:spid="_x0000_s1038" type="#_x0000_t202" style="position:absolute;margin-left:321.05pt;margin-top:780.5pt;width:10.25pt;height:14pt;z-index:-251663360;visibility:visible;mso-wrap-style:square;mso-wrap-distance-left:0;mso-wrap-distance-top:0;mso-wrap-distance-right:0;mso-wrap-distance-bottom:0;mso-position-horizontal:absolute;mso-position-horizontal-relative:page;mso-position-vertical:absolute;mso-position-vertical-relative:page;v-text-anchor:top" o:gfxdata="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" filled="f" stroked="f">
+            <v:shape id="Textbox 5" o:spid="_x0000_s1038" type="#_x0000_t202" style="position:absolute;margin-left:321.05pt;margin-top:780.5pt;width:10.25pt;height:14pt;z-index:-251663360;visibility:visible;mso-wrap-style:square;mso-wrap-distance-left:0;mso-wrap-distance-top:0;mso-wrap-distance-right:0;mso-wrap-distance-bottom:0;mso-position-horizontal:absolute;mso-position-horizontal-relative:page;mso-position-vertical:absolute;mso-position-vertical-relative:page;v-text-anchor:top" o:gfxdata="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" filled="f" stroked="f">
               <v:textbox inset="0,0,0,0">
                 <w:txbxContent>
                   <w:p>
@@ -18401,7 +18276,6 @@
                       </w:rPr>
                       <w:fldChar w:fldCharType="separate"/>
                     </w:r>
-                    <w:proofErr w:type="spellStart"/>
                     <w:r>
                       <w:rPr>
                         <w:spacing w:val="-10"/>
@@ -18409,7 +18283,6 @@
                       </w:rPr>
                       <w:t>i</w:t>
                     </w:r>
-                    <w:proofErr w:type="spellEnd"/>
                     <w:r>
                       <w:rPr>
                         <w:spacing w:val="-10"/>
@@ -18534,7 +18407,7 @@
               <v:stroke joinstyle="miter"/>
               <v:path gradientshapeok="t" o:connecttype="rect"/>
             </v:shapetype>
-            <v:shape id="Textbox 125" o:spid="_x0000_s1049" type="#_x0000_t202" style="position:absolute;margin-left:319.75pt;margin-top:780.5pt;width:12.85pt;height:14pt;z-index:-16058880;visibility:visible;mso-wrap-style:square;mso-wrap-distance-left:0;mso-wrap-distance-top:0;mso-wrap-distance-right:0;mso-wrap-distance-bottom:0;mso-position-horizontal:absolute;mso-position-horizontal-relative:page;mso-position-vertical:absolute;mso-position-vertical-relative:page;v-text-anchor:top" o:gfxdata="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" filled="f" stroked="f">
+            <v:shape id="Textbox 125" o:spid="_x0000_s1049" type="#_x0000_t202" style="position:absolute;margin-left:319.75pt;margin-top:780.5pt;width:12.85pt;height:14pt;z-index:-16058880;visibility:visible;mso-wrap-style:square;mso-wrap-distance-left:0;mso-wrap-distance-top:0;mso-wrap-distance-right:0;mso-wrap-distance-bottom:0;mso-position-horizontal:absolute;mso-position-horizontal-relative:page;mso-position-vertical:absolute;mso-position-vertical-relative:page;v-text-anchor:top" o:gfxdata="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" filled="f" stroked="f">
               <v:textbox inset="0,0,0,0">
                 <w:txbxContent>
                   <w:p>
@@ -18690,7 +18563,7 @@
               <v:stroke joinstyle="miter"/>
               <v:path gradientshapeok="t" o:connecttype="rect"/>
             </v:shapetype>
-            <v:shape id="Textbox 132" o:spid="_x0000_s1051" type="#_x0000_t202" style="position:absolute;margin-left:319.75pt;margin-top:780.5pt;width:12.85pt;height:14pt;z-index:-16056832;visibility:visible;mso-wrap-style:square;mso-wrap-distance-left:0;mso-wrap-distance-top:0;mso-wrap-distance-right:0;mso-wrap-distance-bottom:0;mso-position-horizontal:absolute;mso-position-horizontal-relative:page;mso-position-vertical:absolute;mso-position-vertical-relative:page;v-text-anchor:top" o:gfxdata="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" filled="f" stroked="f">
+            <v:shape id="Textbox 132" o:spid="_x0000_s1051" type="#_x0000_t202" style="position:absolute;margin-left:319.75pt;margin-top:780.5pt;width:12.85pt;height:14pt;z-index:-16056832;visibility:visible;mso-wrap-style:square;mso-wrap-distance-left:0;mso-wrap-distance-top:0;mso-wrap-distance-right:0;mso-wrap-distance-bottom:0;mso-position-horizontal:absolute;mso-position-horizontal-relative:page;mso-position-vertical:absolute;mso-position-vertical-relative:page;v-text-anchor:top" o:gfxdata="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" filled="f" stroked="f">
               <v:textbox inset="0,0,0,0">
                 <w:txbxContent>
                   <w:p>
@@ -18846,7 +18719,7 @@
               <v:stroke joinstyle="miter"/>
               <v:path gradientshapeok="t" o:connecttype="rect"/>
             </v:shapetype>
-            <v:shape id="Textbox 136" o:spid="_x0000_s1053" type="#_x0000_t202" style="position:absolute;margin-left:316.85pt;margin-top:780.5pt;width:18.75pt;height:14pt;z-index:-16054784;visibility:visible;mso-wrap-style:square;mso-wrap-distance-left:0;mso-wrap-distance-top:0;mso-wrap-distance-right:0;mso-wrap-distance-bottom:0;mso-position-horizontal:absolute;mso-position-horizontal-relative:page;mso-position-vertical:absolute;mso-position-vertical-relative:page;v-text-anchor:top" o:gfxdata="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" filled="f" stroked="f">
+            <v:shape id="Textbox 136" o:spid="_x0000_s1053" type="#_x0000_t202" style="position:absolute;margin-left:316.85pt;margin-top:780.5pt;width:18.75pt;height:14pt;z-index:-16054784;visibility:visible;mso-wrap-style:square;mso-wrap-distance-left:0;mso-wrap-distance-top:0;mso-wrap-distance-right:0;mso-wrap-distance-bottom:0;mso-position-horizontal:absolute;mso-position-horizontal-relative:page;mso-position-vertical:absolute;mso-position-vertical-relative:page;v-text-anchor:top" o:gfxdata="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" filled="f" stroked="f">
               <v:textbox inset="0,0,0,0">
                 <w:txbxContent>
                   <w:p>
@@ -18980,17 +18853,8 @@
                               <w:spacing w:val="-5"/>
                               <w:w w:val="115"/>
                             </w:rPr>
-                            <w:t>ii</w:t>
+                            <w:t>iii</w:t>
                           </w:r>
-                          <w:proofErr w:type="spellStart"/>
-                          <w:r>
-                            <w:rPr>
-                              <w:spacing w:val="-5"/>
-                              <w:w w:val="115"/>
-                            </w:rPr>
-                            <w:t>i</w:t>
-                          </w:r>
-                          <w:proofErr w:type="spellEnd"/>
                           <w:r>
                             <w:rPr>
                               <w:spacing w:val="-5"/>
@@ -19016,7 +18880,7 @@
               <v:stroke joinstyle="miter"/>
               <v:path gradientshapeok="t" o:connecttype="rect"/>
             </v:shapetype>
-            <v:shape id="Textbox 13" o:spid="_x0000_s1040" type="#_x0000_t202" style="position:absolute;margin-left:317.8pt;margin-top:780.5pt;width:16.8pt;height:14pt;z-index:-251642880;visibility:visible;mso-wrap-style:square;mso-wrap-distance-left:0;mso-wrap-distance-top:0;mso-wrap-distance-right:0;mso-wrap-distance-bottom:0;mso-position-horizontal:absolute;mso-position-horizontal-relative:page;mso-position-vertical:absolute;mso-position-vertical-relative:page;v-text-anchor:top" o:gfxdata="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" filled="f" stroked="f">
+            <v:shape id="Textbox 13" o:spid="_x0000_s1040" type="#_x0000_t202" style="position:absolute;margin-left:317.8pt;margin-top:780.5pt;width:16.8pt;height:14pt;z-index:-251642880;visibility:visible;mso-wrap-style:square;mso-wrap-distance-left:0;mso-wrap-distance-top:0;mso-wrap-distance-right:0;mso-wrap-distance-bottom:0;mso-position-horizontal:absolute;mso-position-horizontal-relative:page;mso-position-vertical:absolute;mso-position-vertical-relative:page;v-text-anchor:top" o:gfxdata="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" filled="f" stroked="f">
               <v:textbox inset="0,0,0,0">
                 <w:txbxContent>
                   <w:p>
@@ -19051,17 +18915,8 @@
                         <w:spacing w:val="-5"/>
                         <w:w w:val="115"/>
                       </w:rPr>
-                      <w:t>ii</w:t>
+                      <w:t>iii</w:t>
                     </w:r>
-                    <w:proofErr w:type="spellStart"/>
-                    <w:r>
-                      <w:rPr>
-                        <w:spacing w:val="-5"/>
-                        <w:w w:val="115"/>
-                      </w:rPr>
-                      <w:t>i</w:t>
-                    </w:r>
-                    <w:proofErr w:type="spellEnd"/>
                     <w:r>
                       <w:rPr>
                         <w:spacing w:val="-5"/>
@@ -19191,7 +19046,7 @@
               <v:stroke joinstyle="miter"/>
               <v:path gradientshapeok="t" o:connecttype="rect"/>
             </v:shapetype>
-            <v:shape id="Textbox 18" o:spid="_x0000_s1042" type="#_x0000_t202" style="position:absolute;margin-left:318pt;margin-top:780.5pt;width:16.45pt;height:14pt;z-index:-16073728;visibility:visible;mso-wrap-style:square;mso-wrap-distance-left:0;mso-wrap-distance-top:0;mso-wrap-distance-right:0;mso-wrap-distance-bottom:0;mso-position-horizontal:absolute;mso-position-horizontal-relative:page;mso-position-vertical:absolute;mso-position-vertical-relative:page;v-text-anchor:top" o:gfxdata="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" filled="f" stroked="f">
+            <v:shape id="Textbox 18" o:spid="_x0000_s1042" type="#_x0000_t202" style="position:absolute;margin-left:318pt;margin-top:780.5pt;width:16.45pt;height:14pt;z-index:-16073728;visibility:visible;mso-wrap-style:square;mso-wrap-distance-left:0;mso-wrap-distance-top:0;mso-wrap-distance-right:0;mso-wrap-distance-bottom:0;mso-position-horizontal:absolute;mso-position-horizontal-relative:page;mso-position-vertical:absolute;mso-position-vertical-relative:page;v-text-anchor:top" o:gfxdata="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" filled="f" stroked="f">
               <v:textbox inset="0,0,0,0">
                 <w:txbxContent>
                   <w:p>
@@ -19352,7 +19207,7 @@
               <v:stroke joinstyle="miter"/>
               <v:path gradientshapeok="t" o:connecttype="rect"/>
             </v:shapetype>
-            <v:shape id="Textbox 22" o:spid="_x0000_s1043" type="#_x0000_t202" style="position:absolute;margin-left:319.75pt;margin-top:780.5pt;width:12.85pt;height:14pt;z-index:-16071680;visibility:visible;mso-wrap-style:square;mso-wrap-distance-left:0;mso-wrap-distance-top:0;mso-wrap-distance-right:0;mso-wrap-distance-bottom:0;mso-position-horizontal:absolute;mso-position-horizontal-relative:page;mso-position-vertical:absolute;mso-position-vertical-relative:page;v-text-anchor:top" o:gfxdata="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" filled="f" stroked="f">
+            <v:shape id="Textbox 22" o:spid="_x0000_s1043" type="#_x0000_t202" style="position:absolute;margin-left:319.75pt;margin-top:780.5pt;width:12.85pt;height:14pt;z-index:-16071680;visibility:visible;mso-wrap-style:square;mso-wrap-distance-left:0;mso-wrap-distance-top:0;mso-wrap-distance-right:0;mso-wrap-distance-bottom:0;mso-position-horizontal:absolute;mso-position-horizontal-relative:page;mso-position-vertical:absolute;mso-position-vertical-relative:page;v-text-anchor:top" o:gfxdata="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" filled="f" stroked="f">
               <v:textbox inset="0,0,0,0">
                 <w:txbxContent>
                   <w:p>
@@ -19508,7 +19363,7 @@
               <v:stroke joinstyle="miter"/>
               <v:path gradientshapeok="t" o:connecttype="rect"/>
             </v:shapetype>
-            <v:shape id="Textbox 26" o:spid="_x0000_s1044" type="#_x0000_t202" style="position:absolute;margin-left:319.75pt;margin-top:780.5pt;width:12.85pt;height:14pt;z-index:-16069632;visibility:visible;mso-wrap-style:square;mso-wrap-distance-left:0;mso-wrap-distance-top:0;mso-wrap-distance-right:0;mso-wrap-distance-bottom:0;mso-position-horizontal:absolute;mso-position-horizontal-relative:page;mso-position-vertical:absolute;mso-position-vertical-relative:page;v-text-anchor:top" o:gfxdata="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" filled="f" stroked="f">
+            <v:shape id="Textbox 26" o:spid="_x0000_s1044" type="#_x0000_t202" style="position:absolute;margin-left:319.75pt;margin-top:780.5pt;width:12.85pt;height:14pt;z-index:-16069632;visibility:visible;mso-wrap-style:square;mso-wrap-distance-left:0;mso-wrap-distance-top:0;mso-wrap-distance-right:0;mso-wrap-distance-bottom:0;mso-position-horizontal:absolute;mso-position-horizontal-relative:page;mso-position-vertical:absolute;mso-position-vertical-relative:page;v-text-anchor:top" o:gfxdata="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" filled="f" stroked="f">
               <v:textbox inset="0,0,0,0">
                 <w:txbxContent>
                   <w:p>
@@ -19664,7 +19519,7 @@
               <v:stroke joinstyle="miter"/>
               <v:path gradientshapeok="t" o:connecttype="rect"/>
             </v:shapetype>
-            <v:shape id="Textbox 30" o:spid="_x0000_s1045" type="#_x0000_t202" style="position:absolute;margin-left:319.75pt;margin-top:780.5pt;width:12.85pt;height:14pt;z-index:-16067584;visibility:visible;mso-wrap-style:square;mso-wrap-distance-left:0;mso-wrap-distance-top:0;mso-wrap-distance-right:0;mso-wrap-distance-bottom:0;mso-position-horizontal:absolute;mso-position-horizontal-relative:page;mso-position-vertical:absolute;mso-position-vertical-relative:page;v-text-anchor:top" o:gfxdata="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" filled="f" stroked="f">
+            <v:shape id="Textbox 30" o:spid="_x0000_s1045" type="#_x0000_t202" style="position:absolute;margin-left:319.75pt;margin-top:780.5pt;width:12.85pt;height:14pt;z-index:-16067584;visibility:visible;mso-wrap-style:square;mso-wrap-distance-left:0;mso-wrap-distance-top:0;mso-wrap-distance-right:0;mso-wrap-distance-bottom:0;mso-position-horizontal:absolute;mso-position-horizontal-relative:page;mso-position-vertical:absolute;mso-position-vertical-relative:page;v-text-anchor:top" o:gfxdata="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" filled="f" stroked="f">
               <v:textbox inset="0,0,0,0">
                 <w:txbxContent>
                   <w:p>
@@ -19820,7 +19675,7 @@
               <v:stroke joinstyle="miter"/>
               <v:path gradientshapeok="t" o:connecttype="rect"/>
             </v:shapetype>
-            <v:shape id="Textbox 34" o:spid="_x0000_s1046" type="#_x0000_t202" style="position:absolute;margin-left:319.75pt;margin-top:780.5pt;width:12.85pt;height:14pt;z-index:-16065536;visibility:visible;mso-wrap-style:square;mso-wrap-distance-left:0;mso-wrap-distance-top:0;mso-wrap-distance-right:0;mso-wrap-distance-bottom:0;mso-position-horizontal:absolute;mso-position-horizontal-relative:page;mso-position-vertical:absolute;mso-position-vertical-relative:page;v-text-anchor:top" o:gfxdata="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" filled="f" stroked="f">
+            <v:shape id="Textbox 34" o:spid="_x0000_s1046" type="#_x0000_t202" style="position:absolute;margin-left:319.75pt;margin-top:780.5pt;width:12.85pt;height:14pt;z-index:-16065536;visibility:visible;mso-wrap-style:square;mso-wrap-distance-left:0;mso-wrap-distance-top:0;mso-wrap-distance-right:0;mso-wrap-distance-bottom:0;mso-position-horizontal:absolute;mso-position-horizontal-relative:page;mso-position-vertical:absolute;mso-position-vertical-relative:page;v-text-anchor:top" o:gfxdata="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" filled="f" stroked="f">
               <v:textbox inset="0,0,0,0">
                 <w:txbxContent>
                   <w:p>
@@ -19976,7 +19831,7 @@
               <v:stroke joinstyle="miter"/>
               <v:path gradientshapeok="t" o:connecttype="rect"/>
             </v:shapetype>
-            <v:shape id="Textbox 117" o:spid="_x0000_s1047" type="#_x0000_t202" style="position:absolute;margin-left:319.75pt;margin-top:780.5pt;width:12.85pt;height:14pt;z-index:-16062976;visibility:visible;mso-wrap-style:square;mso-wrap-distance-left:0;mso-wrap-distance-top:0;mso-wrap-distance-right:0;mso-wrap-distance-bottom:0;mso-position-horizontal:absolute;mso-position-horizontal-relative:page;mso-position-vertical:absolute;mso-position-vertical-relative:page;v-text-anchor:top" o:gfxdata="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" filled="f" stroked="f">
+            <v:shape id="Textbox 117" o:spid="_x0000_s1047" type="#_x0000_t202" style="position:absolute;margin-left:319.75pt;margin-top:780.5pt;width:12.85pt;height:14pt;z-index:-16062976;visibility:visible;mso-wrap-style:square;mso-wrap-distance-left:0;mso-wrap-distance-top:0;mso-wrap-distance-right:0;mso-wrap-distance-bottom:0;mso-position-horizontal:absolute;mso-position-horizontal-relative:page;mso-position-vertical:absolute;mso-position-vertical-relative:page;v-text-anchor:top" o:gfxdata="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" filled="f" stroked="f">
               <v:textbox inset="0,0,0,0">
                 <w:txbxContent>
                   <w:p>
@@ -20132,7 +19987,7 @@
               <v:stroke joinstyle="miter"/>
               <v:path gradientshapeok="t" o:connecttype="rect"/>
             </v:shapetype>
-            <v:shape id="Textbox 121" o:spid="_x0000_s1048" type="#_x0000_t202" style="position:absolute;margin-left:319.75pt;margin-top:780.5pt;width:12.85pt;height:14pt;z-index:-16060928;visibility:visible;mso-wrap-style:square;mso-wrap-distance-left:0;mso-wrap-distance-top:0;mso-wrap-distance-right:0;mso-wrap-distance-bottom:0;mso-position-horizontal:absolute;mso-position-horizontal-relative:page;mso-position-vertical:absolute;mso-position-vertical-relative:page;v-text-anchor:top" o:gfxdata="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" filled="f" stroked="f">
+            <v:shape id="Textbox 121" o:spid="_x0000_s1048" type="#_x0000_t202" style="position:absolute;margin-left:319.75pt;margin-top:780.5pt;width:12.85pt;height:14pt;z-index:-16060928;visibility:visible;mso-wrap-style:square;mso-wrap-distance-left:0;mso-wrap-distance-top:0;mso-wrap-distance-right:0;mso-wrap-distance-bottom:0;mso-position-horizontal:absolute;mso-position-horizontal-relative:page;mso-position-vertical:absolute;mso-position-vertical-relative:page;v-text-anchor:top" o:gfxdata="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" filled="f" stroked="f">
               <v:textbox inset="0,0,0,0">
                 <w:txbxContent>
                   <w:p>
@@ -20459,7 +20314,7 @@
               <v:stroke joinstyle="miter"/>
               <v:path gradientshapeok="t" o:connecttype="rect"/>
             </v:shapetype>
-            <v:shape id="Textbox 4" o:spid="_x0000_s1037" type="#_x0000_t202" style="position:absolute;margin-left:251.6pt;margin-top:138.05pt;width:148.2pt;height:19.25pt;z-index:-251666432;visibility:visible;mso-wrap-style:square;mso-wrap-distance-left:0;mso-wrap-distance-top:0;mso-wrap-distance-right:0;mso-wrap-distance-bottom:0;mso-position-horizontal:absolute;mso-position-horizontal-relative:page;mso-position-vertical:absolute;mso-position-vertical-relative:page;v-text-anchor:top" o:gfxdata="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" filled="f" stroked="f">
+            <v:shape id="Textbox 4" o:spid="_x0000_s1037" type="#_x0000_t202" style="position:absolute;margin-left:251.6pt;margin-top:138.05pt;width:148.2pt;height:19.25pt;z-index:-251666432;visibility:visible;mso-wrap-style:square;mso-wrap-distance-left:0;mso-wrap-distance-top:0;mso-wrap-distance-right:0;mso-wrap-distance-bottom:0;mso-position-horizontal:absolute;mso-position-horizontal-relative:page;mso-position-vertical:absolute;mso-position-vertical-relative:page;v-text-anchor:top" o:gfxdata="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" filled="f" stroked="f">
               <v:textbox inset="0,0,0,0">
                 <w:txbxContent>
                   <w:p>
@@ -20760,7 +20615,7 @@
               <v:stroke joinstyle="miter"/>
               <v:path gradientshapeok="t" o:connecttype="rect"/>
             </v:shapetype>
-            <v:shape id="Textbox 131" o:spid="_x0000_s1050" type="#_x0000_t202" style="position:absolute;margin-left:288.45pt;margin-top:138.05pt;width:74.55pt;height:19.25pt;z-index:-16057344;visibility:visible;mso-wrap-style:square;mso-wrap-distance-left:0;mso-wrap-distance-top:0;mso-wrap-distance-right:0;mso-wrap-distance-bottom:0;mso-position-horizontal:absolute;mso-position-horizontal-relative:page;mso-position-vertical:absolute;mso-position-vertical-relative:page;v-text-anchor:top" o:gfxdata="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" filled="f" stroked="f">
+            <v:shape id="Textbox 131" o:spid="_x0000_s1050" type="#_x0000_t202" style="position:absolute;margin-left:288.45pt;margin-top:138.05pt;width:74.55pt;height:19.25pt;z-index:-16057344;visibility:visible;mso-wrap-style:square;mso-wrap-distance-left:0;mso-wrap-distance-top:0;mso-wrap-distance-right:0;mso-wrap-distance-bottom:0;mso-position-horizontal:absolute;mso-position-horizontal-relative:page;mso-position-vertical:absolute;mso-position-vertical-relative:page;v-text-anchor:top" o:gfxdata="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" filled="f" stroked="f">
               <v:textbox inset="0,0,0,0">
                 <w:txbxContent>
                   <w:p>
@@ -21034,7 +20889,7 @@
               <v:stroke joinstyle="miter"/>
               <v:path gradientshapeok="t" o:connecttype="rect"/>
             </v:shapetype>
-            <v:shape id="Textbox 135" o:spid="_x0000_s1052" type="#_x0000_t202" style="position:absolute;margin-left:291.1pt;margin-top:138.05pt;width:69.25pt;height:19.25pt;z-index:-16055296;visibility:visible;mso-wrap-style:square;mso-wrap-distance-left:0;mso-wrap-distance-top:0;mso-wrap-distance-right:0;mso-wrap-distance-bottom:0;mso-position-horizontal:absolute;mso-position-horizontal-relative:page;mso-position-vertical:absolute;mso-position-vertical-relative:page;v-text-anchor:top" o:gfxdata="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" filled="f" stroked="f">
+            <v:shape id="Textbox 135" o:spid="_x0000_s1052" type="#_x0000_t202" style="position:absolute;margin-left:291.1pt;margin-top:138.05pt;width:69.25pt;height:19.25pt;z-index:-16055296;visibility:visible;mso-wrap-style:square;mso-wrap-distance-left:0;mso-wrap-distance-top:0;mso-wrap-distance-right:0;mso-wrap-distance-bottom:0;mso-position-horizontal:absolute;mso-position-horizontal-relative:page;mso-position-vertical:absolute;mso-position-vertical-relative:page;v-text-anchor:top" o:gfxdata="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" filled="f" stroked="f">
               <v:textbox inset="0,0,0,0">
                 <w:txbxContent>
                   <w:p>
@@ -21309,7 +21164,7 @@
               <v:stroke joinstyle="miter"/>
               <v:path gradientshapeok="t" o:connecttype="rect"/>
             </v:shapetype>
-            <v:shape id="Textbox 12" o:spid="_x0000_s1039" type="#_x0000_t202" style="position:absolute;margin-left:294.65pt;margin-top:138.05pt;width:62.1pt;height:19.25pt;z-index:-251644928;visibility:visible;mso-wrap-style:square;mso-wrap-distance-left:0;mso-wrap-distance-top:0;mso-wrap-distance-right:0;mso-wrap-distance-bottom:0;mso-position-horizontal:absolute;mso-position-horizontal-relative:page;mso-position-vertical:absolute;mso-position-vertical-relative:page;v-text-anchor:top" o:gfxdata="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" filled="f" stroked="f">
+            <v:shape id="Textbox 12" o:spid="_x0000_s1039" type="#_x0000_t202" style="position:absolute;margin-left:294.65pt;margin-top:138.05pt;width:62.1pt;height:19.25pt;z-index:-251644928;visibility:visible;mso-wrap-style:square;mso-wrap-distance-left:0;mso-wrap-distance-top:0;mso-wrap-distance-right:0;mso-wrap-distance-bottom:0;mso-position-horizontal:absolute;mso-position-horizontal-relative:page;mso-position-vertical:absolute;mso-position-vertical-relative:page;v-text-anchor:top" o:gfxdata="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" filled="f" stroked="f">
               <v:textbox inset="0,0,0,0">
                 <w:txbxContent>
                   <w:p>
@@ -21584,7 +21439,7 @@
               <v:stroke joinstyle="miter"/>
               <v:path gradientshapeok="t" o:connecttype="rect"/>
             </v:shapetype>
-            <v:shape id="Textbox 17" o:spid="_x0000_s1041" type="#_x0000_t202" style="position:absolute;margin-left:293.95pt;margin-top:138.05pt;width:63.5pt;height:19.25pt;z-index:-16074240;visibility:visible;mso-wrap-style:square;mso-wrap-distance-left:0;mso-wrap-distance-top:0;mso-wrap-distance-right:0;mso-wrap-distance-bottom:0;mso-position-horizontal:absolute;mso-position-horizontal-relative:page;mso-position-vertical:absolute;mso-position-vertical-relative:page;v-text-anchor:top" o:gfxdata="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" filled="f" stroked="f">
+            <v:shape id="Textbox 17" o:spid="_x0000_s1041" type="#_x0000_t202" style="position:absolute;margin-left:293.95pt;margin-top:138.05pt;width:63.5pt;height:19.25pt;z-index:-16074240;visibility:visible;mso-wrap-style:square;mso-wrap-distance-left:0;mso-wrap-distance-top:0;mso-wrap-distance-right:0;mso-wrap-distance-bottom:0;mso-position-horizontal:absolute;mso-position-horizontal-relative:page;mso-position-vertical:absolute;mso-position-vertical-relative:page;v-text-anchor:top" o:gfxdata="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" filled="f" stroked="f">
               <v:textbox inset="0,0,0,0">
                 <w:txbxContent>
                   <w:p>
@@ -24914,6 +24769,7 @@
   <w:style w:type="paragraph" w:default="1" w:styleId="Normal">
     <w:name w:val="Normal"/>
     <w:qFormat/>
+    <w:rsid w:val="002E244B"/>
     <w:rPr>
       <w:rFonts w:ascii="Calibri" w:eastAsia="Calibri" w:hAnsi="Calibri" w:cs="Calibri"/>
     </w:rPr>
@@ -25312,6 +25168,40 @@
       <w:shd w:val="clear" w:color="auto" w:fill="E1DFDD"/>
     </w:rPr>
   </w:style>
+  <w:style w:type="paragraph" w:customStyle="1" w:styleId="p1">
+    <w:name w:val="p1"/>
+    <w:basedOn w:val="Normal"/>
+    <w:rsid w:val="00EF76C4"/>
+    <w:pPr>
+      <w:widowControl/>
+      <w:autoSpaceDE/>
+      <w:autoSpaceDN/>
+      <w:spacing w:before="100" w:beforeAutospacing="1" w:after="100" w:afterAutospacing="1"/>
+    </w:pPr>
+    <w:rPr>
+      <w:rFonts w:ascii="Times New Roman" w:eastAsia="Times New Roman" w:hAnsi="Times New Roman" w:cs="Times New Roman"/>
+      <w:sz w:val="24"/>
+      <w:szCs w:val="24"/>
+      <w:lang w:val="en-AU" w:eastAsia="en-GB"/>
+    </w:rPr>
+  </w:style>
+  <w:style w:type="paragraph" w:customStyle="1" w:styleId="p2">
+    <w:name w:val="p2"/>
+    <w:basedOn w:val="Normal"/>
+    <w:rsid w:val="00EF76C4"/>
+    <w:pPr>
+      <w:widowControl/>
+      <w:autoSpaceDE/>
+      <w:autoSpaceDN/>
+      <w:spacing w:before="100" w:beforeAutospacing="1" w:after="100" w:afterAutospacing="1"/>
+    </w:pPr>
+    <w:rPr>
+      <w:rFonts w:ascii="Times New Roman" w:eastAsia="Times New Roman" w:hAnsi="Times New Roman" w:cs="Times New Roman"/>
+      <w:sz w:val="24"/>
+      <w:szCs w:val="24"/>
+      <w:lang w:val="en-AU" w:eastAsia="en-GB"/>
+    </w:rPr>
+  </w:style>
 </w:styles>
 </file>
 

</xml_diff>

<commit_message>
Corrected references to Harvard style
</commit_message>
<xml_diff>
--- a/report/unsw-ZZSC9020-report-2026 Group A.docx
+++ b/report/unsw-ZZSC9020-report-2026 Group A.docx
@@ -299,7 +299,7 @@
     <w:p>
       <w:pPr>
         <w:pStyle w:val="BodyText"/>
-        <w:ind w:right="289" w:firstLineChars="1020" w:firstLine="2678"/>
+        <w:ind w:right="289" w:firstLineChars="1020" w:firstLine="2692"/>
         <w:rPr>
           <w:w w:val="110"/>
         </w:rPr>
@@ -332,7 +332,7 @@
     <w:p>
       <w:pPr>
         <w:pStyle w:val="BodyText"/>
-        <w:ind w:right="289" w:firstLineChars="1020" w:firstLine="2678"/>
+        <w:ind w:right="289" w:firstLineChars="1020" w:firstLine="2692"/>
         <w:rPr>
           <w:w w:val="110"/>
         </w:rPr>
@@ -354,7 +354,7 @@
     <w:p>
       <w:pPr>
         <w:pStyle w:val="BodyText"/>
-        <w:ind w:right="289" w:firstLineChars="1020" w:firstLine="2678"/>
+        <w:ind w:right="289" w:firstLineChars="1020" w:firstLine="2692"/>
         <w:rPr>
           <w:w w:val="110"/>
         </w:rPr>
@@ -382,7 +382,7 @@
     <w:p>
       <w:pPr>
         <w:pStyle w:val="BodyText"/>
-        <w:ind w:right="289" w:firstLineChars="1020" w:firstLine="2678"/>
+        <w:ind w:right="289" w:firstLineChars="1020" w:firstLine="2692"/>
       </w:pPr>
       <w:r>
         <w:rPr>
@@ -1369,23 +1369,13 @@
         </w:rPr>
         <w:t>check-</w:t>
       </w:r>
-      <w:proofErr w:type="spellStart"/>
       <w:r>
         <w:rPr>
           <w:spacing w:val="-4"/>
           <w:w w:val="105"/>
           <w:sz w:val="24"/>
         </w:rPr>
-        <w:t>ing</w:t>
-      </w:r>
-      <w:proofErr w:type="spellEnd"/>
-      <w:r>
-        <w:rPr>
-          <w:spacing w:val="-4"/>
-          <w:w w:val="105"/>
-          <w:sz w:val="24"/>
-        </w:rPr>
-        <w:t>).</w:t>
+        <w:t>ing).</w:t>
       </w:r>
     </w:p>
     <w:p>
@@ -1408,11 +1398,7 @@
         <w:jc w:val="both"/>
       </w:pPr>
       <w:r>
-        <w:t xml:space="preserve">I certify that I have read and understood the University Rules in respect of Student Academic </w:t>
-      </w:r>
-      <w:proofErr w:type="gramStart"/>
-      <w:r>
-        <w:t>Misconduct,</w:t>
+        <w:t>I certify that I have read and understood the University Rules in respect of Student Academic Misconduct,</w:t>
       </w:r>
       <w:r>
         <w:rPr>
@@ -1421,11 +1407,7 @@
         <w:t xml:space="preserve"> </w:t>
       </w:r>
       <w:r>
-        <w:t>and</w:t>
-      </w:r>
-      <w:proofErr w:type="gramEnd"/>
-      <w:r>
-        <w:t xml:space="preserve"> am aware of any potential plagiarism penalties which</w:t>
+        <w:t>and am aware of any potential plagiarism penalties which</w:t>
       </w:r>
       <w:r>
         <w:rPr>
@@ -1480,15 +1462,7 @@
         <w:jc w:val="both"/>
       </w:pPr>
       <w:r>
-        <w:t xml:space="preserve">By signing this </w:t>
-      </w:r>
-      <w:proofErr w:type="gramStart"/>
-      <w:r>
-        <w:t>declaration</w:t>
-      </w:r>
-      <w:proofErr w:type="gramEnd"/>
-      <w:r>
-        <w:t xml:space="preserve"> I am agreeing to the statements and conditions above. </w:t>
+        <w:t xml:space="preserve">By signing this declaration I am agreeing to the statements and conditions above. </w:t>
       </w:r>
     </w:p>
     <w:p>
@@ -1818,21 +1792,7 @@
           <w:w w:val="105"/>
         </w:rPr>
         <w:lastRenderedPageBreak/>
-        <w:t xml:space="preserve">Accurate electricity demand forecasting is critical for efficient energy management, cost </w:t>
-      </w:r>
-      <w:proofErr w:type="spellStart"/>
-      <w:r>
-        <w:rPr>
-          <w:w w:val="105"/>
-        </w:rPr>
-        <w:t>optimisation</w:t>
-      </w:r>
-      <w:proofErr w:type="spellEnd"/>
-      <w:r>
-        <w:rPr>
-          <w:w w:val="105"/>
-        </w:rPr>
-        <w:t>, and grid stability. Traditional statistical approaches such as SARIMAX have been widely used for short-term forecasting, while machine learning and transformer-based models have emerged as promising alternatives for capturing complex temporal dependencies. However, their relative performance across different forecasting horizons remains unclear, particularly when compared against operational provided forecasts.</w:t>
+        <w:t>Accurate electricity demand forecasting is critical for efficient energy management, cost optimisation, and grid stability. Traditional statistical approaches such as SARIMAX have been widely used for short-term forecasting, while machine learning and transformer-based models have emerged as promising alternatives for capturing complex temporal dependencies. However, their relative performance across different forecasting horizons remains unclear, particularly when compared against operational provided forecasts.</w:t>
       </w:r>
     </w:p>
     <w:p>
@@ -1849,21 +1809,7 @@
         <w:rPr>
           <w:w w:val="105"/>
         </w:rPr>
-        <w:t>This study evaluates the performance of SARIMAX, Gradient Boosting (GB), LSTM, and a transformer-based model (</w:t>
-      </w:r>
-      <w:proofErr w:type="spellStart"/>
-      <w:r>
-        <w:rPr>
-          <w:w w:val="105"/>
-        </w:rPr>
-        <w:t>PatchTST</w:t>
-      </w:r>
-      <w:proofErr w:type="spellEnd"/>
-      <w:r>
-        <w:rPr>
-          <w:w w:val="105"/>
-        </w:rPr>
-        <w:t>) using half-hourly electricity demand data from New South Wales, Australia. Models are assessed across multiple forecasting horizons (48, 336, and 720 steps) using RMSE and MAE under a consistent rolling-window evaluation framework.</w:t>
+        <w:t>This study evaluates the performance of SARIMAX, Gradient Boosting (GB), LSTM, and a transformer-based model (PatchTST) using half-hourly electricity demand data from New South Wales, Australia. Models are assessed across multiple forecasting horizons (48, 336, and 720 steps) using RMSE and MAE under a consistent rolling-window evaluation framework.</w:t>
       </w:r>
     </w:p>
     <w:p>
@@ -1880,35 +1826,7 @@
         <w:rPr>
           <w:w w:val="105"/>
         </w:rPr>
-        <w:t xml:space="preserve">For the 48-step horizon, the provided operational forecast achieves the lowest error (RMSE ≈ 271), significantly outperforming both SARIMAX (RMSE ≈ 1591) and </w:t>
-      </w:r>
-      <w:proofErr w:type="spellStart"/>
-      <w:r>
-        <w:rPr>
-          <w:w w:val="105"/>
-        </w:rPr>
-        <w:t>PatchTST</w:t>
-      </w:r>
-      <w:proofErr w:type="spellEnd"/>
-      <w:r>
-        <w:rPr>
-          <w:w w:val="105"/>
-        </w:rPr>
-        <w:t xml:space="preserve"> (RMSE ≈ 472). Gradient Boosting improves substantially over SARIMAX (RMSE ≈ 643), while LSTM achieves an RMSE of approximately [xxx]. For longer horizons, SARIMAX performance deteriorates considerably (RMSE ≈ 1829 for 336 steps and ≈ 2352 for 720 steps), whereas </w:t>
-      </w:r>
-      <w:proofErr w:type="spellStart"/>
-      <w:r>
-        <w:rPr>
-          <w:w w:val="105"/>
-        </w:rPr>
-        <w:t>PatchTST</w:t>
-      </w:r>
-      <w:proofErr w:type="spellEnd"/>
-      <w:r>
-        <w:rPr>
-          <w:w w:val="105"/>
-        </w:rPr>
-        <w:t xml:space="preserve"> demonstrates stronger scalability, achieving RMSE values of approximately 660 (336 steps) and 737 (720 steps). The performance of Gradient Boosting and LSTM at these horizons is [xxx] and [xxx], respectively.</w:t>
+        <w:t>For the 48-step horizon, the provided operational forecast achieves the lowest error (RMSE ≈ 271), significantly outperforming both SARIMAX (RMSE ≈ 1591) and PatchTST (RMSE ≈ 472). Gradient Boosting improves substantially over SARIMAX (RMSE ≈ 643), while LSTM achieves an RMSE of approximately [xxx]. For longer horizons, SARIMAX performance deteriorates considerably (RMSE ≈ 1829 for 336 steps and ≈ 2352 for 720 steps), whereas PatchTST demonstrates stronger scalability, achieving RMSE values of approximately 660 (336 steps) and 737 (720 steps). The performance of Gradient Boosting and LSTM at these horizons is [xxx] and [xxx], respectively.</w:t>
       </w:r>
     </w:p>
     <w:p>
@@ -1925,21 +1843,7 @@
         <w:rPr>
           <w:w w:val="105"/>
         </w:rPr>
-        <w:t xml:space="preserve">These results indicate that operational forecasts remain highly effective for short-term prediction due to their incorporation of real-time system information and domain-specific features. However, transformer-based models such as </w:t>
-      </w:r>
-      <w:proofErr w:type="spellStart"/>
-      <w:r>
-        <w:rPr>
-          <w:w w:val="105"/>
-        </w:rPr>
-        <w:t>PatchTST</w:t>
-      </w:r>
-      <w:proofErr w:type="spellEnd"/>
-      <w:r>
-        <w:rPr>
-          <w:w w:val="105"/>
-        </w:rPr>
-        <w:t xml:space="preserve"> show clear advantages in longer-horizon forecasting, where traditional methods struggle to capture extended temporal dependencies.</w:t>
+        <w:t>These results indicate that operational forecasts remain highly effective for short-term prediction due to their incorporation of real-time system information and domain-specific features. However, transformer-based models such as PatchTST show clear advantages in longer-horizon forecasting, where traditional methods struggle to capture extended temporal dependencies.</w:t>
       </w:r>
     </w:p>
     <w:p>
@@ -1953,14 +1857,7 @@
         <w:rPr>
           <w:w w:val="105"/>
         </w:rPr>
-        <w:t xml:space="preserve">Overall, the findings highlight a key trade-off between short-term accuracy and long-term forecasting capability, suggesting that transformer-based models are best positioned as complementary tools rather than direct replacements for existing operational forecasting </w:t>
-      </w:r>
-      <w:proofErr w:type="gramStart"/>
-      <w:r>
-        <w:rPr>
-          <w:w w:val="105"/>
-        </w:rPr>
-        <w:t>systems.</w:t>
+        <w:t>Overall, the findings highlight a key trade-off between short-term accuracy and long-term forecasting capability, suggesting that transformer-based models are best positioned as complementary tools rather than direct replacements for existing operational forecasting systems.</w:t>
       </w:r>
       <w:r>
         <w:rPr>
@@ -1969,7 +1866,6 @@
         </w:rPr>
         <w:t>.</w:t>
       </w:r>
-      <w:proofErr w:type="gramEnd"/>
     </w:p>
     <w:p>
       <w:pPr>
@@ -5872,21 +5768,7 @@
         <w:rPr>
           <w:w w:val="105"/>
         </w:rPr>
-        <w:t xml:space="preserve">Electricity demand forecasting plays a critical role in the efficient operation and planning of power systems. Accurate forecasts enable energy providers to </w:t>
-      </w:r>
-      <w:proofErr w:type="spellStart"/>
-      <w:r>
-        <w:rPr>
-          <w:w w:val="105"/>
-        </w:rPr>
-        <w:t>optimise</w:t>
-      </w:r>
-      <w:proofErr w:type="spellEnd"/>
-      <w:r>
-        <w:rPr>
-          <w:w w:val="105"/>
-        </w:rPr>
-        <w:t xml:space="preserve"> generation, reduce operational costs, and maintain system reliability. Inaccurate predictions, particularly during peak demand periods, can lead to significant economic losses or supply disruptions. As a result, developing robust and reliable forecasting models is of substantial importance in modern energy management.</w:t>
+        <w:t>Electricity demand forecasting plays a critical role in the efficient operation and planning of power systems. Accurate forecasts enable energy providers to optimise generation, reduce operational costs, and maintain system reliability. Inaccurate predictions, particularly during peak demand periods, can lead to significant economic losses or supply disruptions. As a result, developing robust and reliable forecasting models is of substantial importance in modern energy management.</w:t>
       </w:r>
     </w:p>
     <w:p>
@@ -5903,21 +5785,7 @@
         <w:rPr>
           <w:w w:val="105"/>
         </w:rPr>
-        <w:t xml:space="preserve">This project focuses on forecasting electricity demand in New South Wales (NSW), Australia, using historical demand, temperature, and forecast data. Electricity demand is influenced by a range of factors, including weather conditions, seasonal patterns, and human activity. </w:t>
-      </w:r>
-      <w:proofErr w:type="gramStart"/>
-      <w:r>
-        <w:rPr>
-          <w:w w:val="105"/>
-        </w:rPr>
-        <w:t>In particular, temperature</w:t>
-      </w:r>
-      <w:proofErr w:type="gramEnd"/>
-      <w:r>
-        <w:rPr>
-          <w:w w:val="105"/>
-        </w:rPr>
-        <w:t xml:space="preserve"> is known to have a strong impact on demand due to heating and cooling requirements, making it an important variable in predictive modelling.</w:t>
+        <w:t>This project focuses on forecasting electricity demand in New South Wales (NSW), Australia, using historical demand, temperature, and forecast data. Electricity demand is influenced by a range of factors, including weather conditions, seasonal patterns, and human activity. In particular, temperature is known to have a strong impact on demand due to heating and cooling requirements, making it an important variable in predictive modelling.</w:t>
       </w:r>
     </w:p>
     <w:p>
@@ -5934,21 +5802,7 @@
         <w:rPr>
           <w:w w:val="105"/>
         </w:rPr>
-        <w:t>To address this problem, a range of modelling approaches are explored, including traditional statistical methods and modern machine learning techniques. Specifically, the study implements a Seasonal Autoregressive Integrated Moving Average with exogenous variables (SARIMAX) model, a Gradient Boosting model, and a deep learning-based Patch Time Series Transformer (</w:t>
-      </w:r>
-      <w:proofErr w:type="spellStart"/>
-      <w:r>
-        <w:rPr>
-          <w:w w:val="105"/>
-        </w:rPr>
-        <w:t>PatchTST</w:t>
-      </w:r>
-      <w:proofErr w:type="spellEnd"/>
-      <w:r>
-        <w:rPr>
-          <w:w w:val="105"/>
-        </w:rPr>
-        <w:t>). These models are evaluated and compared in terms of their forecasting accuracy and ability to capture complex temporal patterns.</w:t>
+        <w:t>To address this problem, a range of modelling approaches are explored, including traditional statistical methods and modern machine learning techniques. Specifically, the study implements a Seasonal Autoregressive Integrated Moving Average with exogenous variables (SARIMAX) model, a Gradient Boosting model, and a deep learning-based Patch Time Series Transformer (PatchTST). These models are evaluated and compared in terms of their forecasting accuracy and ability to capture complex temporal patterns.</w:t>
       </w:r>
     </w:p>
     <w:p>
@@ -5965,21 +5819,7 @@
         <w:rPr>
           <w:w w:val="105"/>
         </w:rPr>
-        <w:t xml:space="preserve">The objectives of this study are threefold. First, to </w:t>
-      </w:r>
-      <w:proofErr w:type="spellStart"/>
-      <w:r>
-        <w:rPr>
-          <w:w w:val="105"/>
-        </w:rPr>
-        <w:t>analyse</w:t>
-      </w:r>
-      <w:proofErr w:type="spellEnd"/>
-      <w:r>
-        <w:rPr>
-          <w:w w:val="105"/>
-        </w:rPr>
-        <w:t xml:space="preserve"> the characteristics and relationships within the electricity demand dataset through exploratory data analysis. Second, to develop and evaluate multiple forecasting models using different methodological approaches. Third, to compare model performance and identify the most effective approach for electricity demand prediction in this context.</w:t>
+        <w:t>The objectives of this study are threefold. First, to analyse the characteristics and relationships within the electricity demand dataset through exploratory data analysis. Second, to develop and evaluate multiple forecasting models using different methodological approaches. Third, to compare model performance and identify the most effective approach for electricity demand prediction in this context.</w:t>
       </w:r>
     </w:p>
     <w:p>
@@ -6097,55 +5937,26 @@
           <w:w w:val="105"/>
           <w:lang w:val="en-AU"/>
         </w:rPr>
-        <w:t xml:space="preserve">While traditional statistical models provide a strong baseline for electricity demand forecasting, more flexible machine learning approaches have been introduced to better capture complex, non-linear relationships in the data. One such approach is gradient boosting, an ensemble learning technique that builds models sequentially by fitting decision trees to the residual errors of previous models (Friedman, 2001). This iterative process allows gradient boosting to minimise prediction errors effectively and achieve high accuracy. Compared to individual models, ensemble methods such as gradient boosting improve robustness and generalisation performance (Hastie, </w:t>
-      </w:r>
-      <w:proofErr w:type="spellStart"/>
-      <w:r>
+        <w:t>While traditional statistical models provide a strong baseline for electricity demand forecasting, more flexible machine learning approaches have been introduced to better capture complex, non-linear relationships in the data. One such approach is gradient boosting, an ensemble learning technique that builds models sequentially by fitting decision trees to the residual errors of previous models (Friedman, 2001). This iterative process allows gradient boosting to minimise prediction errors effectively and achieve high accuracy. Compared to individual models, ensemble methods such as gradient boosting improve robustness and generalisation performance (Hastie, Tibshirani and Friedman, 2009). Modern implementations, including XGBoost and LightGBM, further enhance performance through regularisation and computational efficiency, making them suitable for large-scale forecasting problems (Chen and Guestrin, 2016; Ke et al., 2017).</w:t>
+      </w:r>
+    </w:p>
+    <w:p>
+      <w:pPr>
+        <w:pStyle w:val="BodyText"/>
+        <w:spacing w:before="237" w:line="237" w:lineRule="auto"/>
+        <w:ind w:right="882"/>
+        <w:jc w:val="both"/>
         <w:rPr>
           <w:w w:val="105"/>
           <w:lang w:val="en-AU"/>
         </w:rPr>
-        <w:t>Tibshirani</w:t>
-      </w:r>
-      <w:proofErr w:type="spellEnd"/>
+      </w:pPr>
       <w:r>
         <w:rPr>
           <w:w w:val="105"/>
           <w:lang w:val="en-AU"/>
         </w:rPr>
-        <w:t xml:space="preserve"> and Friedman, 2009). Modern implementations, including </w:t>
-      </w:r>
-      <w:proofErr w:type="spellStart"/>
-      <w:r>
-        <w:rPr>
-          <w:w w:val="105"/>
-          <w:lang w:val="en-AU"/>
-        </w:rPr>
-        <w:t>XGBoost</w:t>
-      </w:r>
-      <w:proofErr w:type="spellEnd"/>
-      <w:r>
-        <w:rPr>
-          <w:w w:val="105"/>
-          <w:lang w:val="en-AU"/>
-        </w:rPr>
-        <w:t xml:space="preserve"> and </w:t>
-      </w:r>
-      <w:proofErr w:type="spellStart"/>
-      <w:r>
-        <w:rPr>
-          <w:w w:val="105"/>
-          <w:lang w:val="en-AU"/>
-        </w:rPr>
-        <w:t>LightGBM</w:t>
-      </w:r>
-      <w:proofErr w:type="spellEnd"/>
-      <w:r>
-        <w:rPr>
-          <w:w w:val="105"/>
-          <w:lang w:val="en-AU"/>
-        </w:rPr>
-        <w:t>, further enhance performance through regularisation and computational efficiency, making them suitable for large-scale forecasting problems (Chen and Guestrin, 2016; Ke et al., 2017).</w:t>
+        <w:t>In time series forecasting applications such as electricity demand prediction, gradient boosting models are particularly effective when combined with feature engineering techniques such as lagged variables and exogenous inputs like temperature. Unlike traditional statistical approaches, these models do not rely on assumptions of linearity or stationarity, allowing them to capture more complex patterns in the data. Empirical studies have shown that tree-based ensemble methods can outperform classical models when sufficient data and relevant features are available (Makridakis et al., 2018; Taieb and Hyndman, 2014). However, while gradient boosting provides strong predictive performance, it may require careful tuning and feature design to achieve optimal results.</w:t>
       </w:r>
     </w:p>
     <w:p>
@@ -6156,47 +5967,13 @@
         <w:jc w:val="both"/>
         <w:rPr>
           <w:w w:val="105"/>
-          <w:lang w:val="en-AU"/>
         </w:rPr>
       </w:pPr>
       <w:r>
         <w:rPr>
           <w:w w:val="105"/>
-          <w:lang w:val="en-AU"/>
-        </w:rPr>
-        <w:t>In time series forecasting applications such as electricity demand prediction, gradient boosting models are particularly effective when combined with feature engineering techniques such as lagged variables and exogenous inputs like temperature. Unlike traditional statistical approaches, these models do not rely on assumptions of linearity or stationarity, allowing them to capture more complex patterns in the data. Empirical studies have shown that tree-based ensemble methods can outperform classical models when sufficient data and relevant features are available (</w:t>
-      </w:r>
-      <w:proofErr w:type="spellStart"/>
-      <w:r>
-        <w:rPr>
-          <w:w w:val="105"/>
-          <w:lang w:val="en-AU"/>
-        </w:rPr>
-        <w:t>Makridakis</w:t>
-      </w:r>
-      <w:proofErr w:type="spellEnd"/>
-      <w:r>
-        <w:rPr>
-          <w:w w:val="105"/>
-          <w:lang w:val="en-AU"/>
-        </w:rPr>
-        <w:t xml:space="preserve"> et al., 2018; </w:t>
-      </w:r>
-      <w:proofErr w:type="spellStart"/>
-      <w:r>
-        <w:rPr>
-          <w:w w:val="105"/>
-          <w:lang w:val="en-AU"/>
-        </w:rPr>
-        <w:t>Taieb</w:t>
-      </w:r>
-      <w:proofErr w:type="spellEnd"/>
-      <w:r>
-        <w:rPr>
-          <w:w w:val="105"/>
-          <w:lang w:val="en-AU"/>
-        </w:rPr>
-        <w:t xml:space="preserve"> and Hyndman, 2014). However, while gradient boosting provides strong predictive performance, it may require careful tuning and feature design to achieve optimal results.</w:t>
+        </w:rPr>
+        <w:t>More recently, deep learning approaches have been introduced to better capture nonlinear relationships and complex temporal dependencies in electricity demand data. Long Short-Term Memory (LSTM) networks, a type of recurrent neural network, are particularly well suited to time series forecasting due to their ability to retain information over long sequences using gated memory cells (Hochreiter &amp; Schmidhuber, 1997). In the context of electricity demand, LSTM models have shown strong performance when incorporating exogenous variables such as temperature, as well as lagged demand and calendar features. Studies such as Kong et al. (2017) and Marino et al. (2016) demonstrate that LSTMs can outperform traditional statistical models in short-term forecasting by effectively learning nonlinear demand patterns and temporal dependencies.</w:t>
       </w:r>
     </w:p>
     <w:p>
@@ -6213,21 +5990,14 @@
         <w:rPr>
           <w:w w:val="105"/>
         </w:rPr>
-        <w:t xml:space="preserve">More recently, deep learning approaches have been introduced to better capture nonlinear relationships and complex temporal dependencies in electricity demand data. Long Short-Term Memory (LSTM) networks, a type of recurrent neural network, are particularly well suited to time series forecasting due to their ability to retain information over long sequences using gated memory cells (Hochreiter &amp; </w:t>
-      </w:r>
-      <w:proofErr w:type="spellStart"/>
+        <w:t xml:space="preserve">Despite their advantages, LSTM models have limitations when applied to medium- and long-term forecasting horizons. While they are capable of modelling long sequences, their </w:t>
+      </w:r>
       <w:r>
         <w:rPr>
           <w:w w:val="105"/>
         </w:rPr>
-        <w:t>Schmidhuber</w:t>
-      </w:r>
-      <w:proofErr w:type="spellEnd"/>
-      <w:r>
-        <w:rPr>
-          <w:w w:val="105"/>
-        </w:rPr>
-        <w:t>, 1997). In the context of electricity demand, LSTM models have shown strong performance when incorporating exogenous variables such as temperature, as well as lagged demand and calendar features. Studies such as Kong et al. (2017) and Marino et al. (2016) demonstrate that LSTMs can outperform traditional statistical models in short-term forecasting by effectively learning nonlinear demand patterns and temporal dependencies.</w:t>
+        <w:lastRenderedPageBreak/>
+        <w:t>predictive accuracy tends to decrease as the forecast horizon increases, as longer-term forecasts depend more heavily on stable trends and seasonal structures rather than short-term temporal relationships. Research such as Pełka and Dudek (2020) shows that hybrid or decomposition-based approaches, which combine statistical models with neural networks, can improve performance in these cases. This highlights the continued importance of classical methods and feature engineering when addressing forecasting horizons beyond short-term applications.</w:t>
       </w:r>
     </w:p>
     <w:p>
@@ -6244,42 +6014,7 @@
         <w:rPr>
           <w:w w:val="105"/>
         </w:rPr>
-        <w:t xml:space="preserve">Despite their advantages, LSTM models have limitations when applied to medium- and long-term forecasting horizons. While they </w:t>
-      </w:r>
-      <w:proofErr w:type="gramStart"/>
-      <w:r>
-        <w:rPr>
-          <w:w w:val="105"/>
-        </w:rPr>
-        <w:t>are capable of modelling</w:t>
-      </w:r>
-      <w:proofErr w:type="gramEnd"/>
-      <w:r>
-        <w:rPr>
-          <w:w w:val="105"/>
-        </w:rPr>
-        <w:t xml:space="preserve"> long sequences, their </w:t>
-      </w:r>
-      <w:r>
-        <w:rPr>
-          <w:w w:val="105"/>
-        </w:rPr>
-        <w:lastRenderedPageBreak/>
-        <w:t xml:space="preserve">predictive accuracy tends to decrease as the forecast horizon increases, as longer-term forecasts depend more heavily on stable trends and seasonal structures rather than short-term temporal relationships. Research such as </w:t>
-      </w:r>
-      <w:proofErr w:type="spellStart"/>
-      <w:r>
-        <w:rPr>
-          <w:w w:val="105"/>
-        </w:rPr>
-        <w:t>Pełka</w:t>
-      </w:r>
-      <w:proofErr w:type="spellEnd"/>
-      <w:r>
-        <w:rPr>
-          <w:w w:val="105"/>
-        </w:rPr>
-        <w:t xml:space="preserve"> and Dudek (2020) shows that hybrid or decomposition-based approaches, which combine statistical models with neural networks, can improve performance in these cases. This highlights the continued importance of classical methods and feature engineering when addressing forecasting horizons beyond short-term applications.</w:t>
+        <w:t>Transformer-based architectures have emerged as a newer approach for time series forecasting, offering an alternative to recurrent models by leveraging attention mechanisms to capture dependencies across long sequences. However, early work questioned their effectiveness in this domain, with studies showing that simpler statistical and machine learning models could outperform transformer-based approaches for long-term forecasting tasks (Li et al., 2022; Zeng et al., 2022). More recent developments, such as PatchTST (Nie et al., 2023), have addressed some of these limitations by introducing techniques such as patching and channel independence, improving performance on long-horizon forecasting benchmarks. These advancements suggest that transformer-based models may be more competitive when appropriately adapted for time series data.</w:t>
       </w:r>
     </w:p>
     <w:p>
@@ -6296,21 +6031,7 @@
         <w:rPr>
           <w:w w:val="105"/>
         </w:rPr>
-        <w:t xml:space="preserve">Transformer-based architectures have emerged as a newer approach for time series forecasting, offering an alternative to recurrent models by leveraging attention mechanisms to capture dependencies across long sequences. However, early work questioned their effectiveness in this domain, with studies showing that simpler statistical and machine learning models could outperform transformer-based approaches for long-term forecasting tasks (Li et al., 2022; Zeng et al., 2022). More recent developments, such as </w:t>
-      </w:r>
-      <w:proofErr w:type="spellStart"/>
-      <w:r>
-        <w:rPr>
-          <w:w w:val="105"/>
-        </w:rPr>
-        <w:t>PatchTST</w:t>
-      </w:r>
-      <w:proofErr w:type="spellEnd"/>
-      <w:r>
-        <w:rPr>
-          <w:w w:val="105"/>
-        </w:rPr>
-        <w:t xml:space="preserve"> (Nie et al., 2023), have addressed some of these limitations by introducing techniques such as patching and channel independence, improving performance on long-horizon forecasting benchmarks. These advancements suggest that transformer-based models may be more competitive when appropriately adapted for time series data.</w:t>
+        <w:t>While prior studies show LSTM performs well in short-term forecasting, its performance degrades over longer horizons. Although transformer-based models have shown mixed results, recent architectures such as PatchTST suggest improvements in long-horizon forecasting. However, empirical comparisons across short-to-medium horizons (48–720 hours) remain limited, particularly in the Australian electricity market context.</w:t>
       </w:r>
     </w:p>
     <w:p>
@@ -6319,71 +6040,12 @@
         <w:spacing w:before="237" w:line="237" w:lineRule="auto"/>
         <w:ind w:right="882"/>
         <w:jc w:val="both"/>
+      </w:pPr>
+      <w:r>
         <w:rPr>
           <w:w w:val="105"/>
         </w:rPr>
-      </w:pPr>
-      <w:r>
-        <w:rPr>
-          <w:w w:val="105"/>
-        </w:rPr>
-        <w:t xml:space="preserve">While prior studies show LSTM performs well in short-term forecasting, its performance degrades over longer horizons. Although transformer-based models have shown mixed results, recent architectures such as </w:t>
-      </w:r>
-      <w:proofErr w:type="spellStart"/>
-      <w:r>
-        <w:rPr>
-          <w:w w:val="105"/>
-        </w:rPr>
-        <w:t>PatchTST</w:t>
-      </w:r>
-      <w:proofErr w:type="spellEnd"/>
-      <w:r>
-        <w:rPr>
-          <w:w w:val="105"/>
-        </w:rPr>
-        <w:t xml:space="preserve"> suggest improvements in long-horizon forecasting. However, empirical comparisons across short-to-medium horizons (48–720 hours) remain limited, particularly in the Australian electricity market context.</w:t>
-      </w:r>
-    </w:p>
-    <w:p>
-      <w:pPr>
-        <w:pStyle w:val="BodyText"/>
-        <w:spacing w:before="237" w:line="237" w:lineRule="auto"/>
-        <w:ind w:right="882"/>
-        <w:jc w:val="both"/>
-      </w:pPr>
-      <w:r>
-        <w:rPr>
-          <w:w w:val="105"/>
-        </w:rPr>
-        <w:t xml:space="preserve">Overall, the literature suggests that model performance in electricity demand forecasting is strongly dependent on the forecast horizon. Statistical models remain highly effective for short-term and structured seasonal forecasting, while LSTM models provide advantages in capturing nonlinear and short-term temporal dependencies. Transformer-based models show promise for long-term forecasting but require careful design and sufficient data to outperform simpler approaches. </w:t>
-      </w:r>
-      <w:proofErr w:type="spellStart"/>
-      <w:r>
-        <w:rPr>
-          <w:w w:val="105"/>
-        </w:rPr>
-        <w:t>PatchTST</w:t>
-      </w:r>
-      <w:proofErr w:type="spellEnd"/>
-      <w:r>
-        <w:rPr>
-          <w:w w:val="105"/>
-        </w:rPr>
-        <w:t xml:space="preserve"> introduces patching and channel independence to improve long-horizon forecasting performance and reduce overfitting. In addition, prior studies such as Nie et al. (2023) primarily benchmark </w:t>
-      </w:r>
-      <w:proofErr w:type="spellStart"/>
-      <w:r>
-        <w:rPr>
-          <w:w w:val="105"/>
-        </w:rPr>
-        <w:t>PatchTST</w:t>
-      </w:r>
-      <w:proofErr w:type="spellEnd"/>
-      <w:r>
-        <w:rPr>
-          <w:w w:val="105"/>
-        </w:rPr>
-        <w:t xml:space="preserve"> against deep learning and linear machine learning models, with limited comparison to classical statistical models such as SARIMAX or recurrent models such as LSTM. This study addresses this gap by evaluating these model families under a consistent forecasting framework.</w:t>
+        <w:t>Overall, the literature suggests that model performance in electricity demand forecasting is strongly dependent on the forecast horizon. Statistical models remain highly effective for short-term and structured seasonal forecasting, while LSTM models provide advantages in capturing nonlinear and short-term temporal dependencies. Transformer-based models show promise for long-term forecasting but require careful design and sufficient data to outperform simpler approaches. PatchTST introduces patching and channel independence to improve long-horizon forecasting performance and reduce overfitting. In addition, prior studies such as Nie et al. (2023) primarily benchmark PatchTST against deep learning and linear machine learning models, with limited comparison to classical statistical models such as SARIMAX or recurrent models such as LSTM. This study addresses this gap by evaluating these model families under a consistent forecasting framework.</w:t>
       </w:r>
     </w:p>
     <w:p>
@@ -6498,21 +6160,7 @@
         <w:rPr>
           <w:w w:val="105"/>
         </w:rPr>
-        <w:t xml:space="preserve">A range of software tools was </w:t>
-      </w:r>
-      <w:proofErr w:type="spellStart"/>
-      <w:r>
-        <w:rPr>
-          <w:w w:val="105"/>
-        </w:rPr>
-        <w:t>utilised</w:t>
-      </w:r>
-      <w:proofErr w:type="spellEnd"/>
-      <w:r>
-        <w:rPr>
-          <w:w w:val="105"/>
-        </w:rPr>
-        <w:t xml:space="preserve"> to support collaboration, model development, and reporting throughout this project.</w:t>
+        <w:t>A range of software tools was utilised to support collaboration, model development, and reporting throughout this project.</w:t>
       </w:r>
     </w:p>
     <w:p>
@@ -6540,21 +6188,7 @@
         <w:rPr>
           <w:w w:val="105"/>
         </w:rPr>
-        <w:t xml:space="preserve">Microsoft Teams was used as the primary platform for group communication and coordination. It integrates chat, video conferencing, and file sharing within a single environment, enabling efficient collaboration among team members. Features such as meeting scheduling, recording, and live captions were particularly useful for documenting discussions and ensuring that all members could review key decisions. Its integration with OneDrive also facilitated </w:t>
-      </w:r>
-      <w:proofErr w:type="spellStart"/>
-      <w:r>
-        <w:rPr>
-          <w:w w:val="105"/>
-        </w:rPr>
-        <w:t>centralised</w:t>
-      </w:r>
-      <w:proofErr w:type="spellEnd"/>
-      <w:r>
-        <w:rPr>
-          <w:w w:val="105"/>
-        </w:rPr>
-        <w:t xml:space="preserve"> storage and version control of shared files.</w:t>
+        <w:t>Microsoft Teams was used as the primary platform for group communication and coordination. It integrates chat, video conferencing, and file sharing within a single environment, enabling efficient collaboration among team members. Features such as meeting scheduling, recording, and live captions were particularly useful for documenting discussions and ensuring that all members could review key decisions. Its integration with OneDrive also facilitated centralised storage and version control of shared files.</w:t>
       </w:r>
     </w:p>
     <w:p>
@@ -6610,63 +6244,7 @@
         <w:rPr>
           <w:w w:val="105"/>
         </w:rPr>
-        <w:t xml:space="preserve">Python was selected as the primary programming language for data analysis and modelling due to its extensive ecosystem of libraries. Pandas and NumPy were used for data manipulation, scikit-learn for machine learning models such as Gradient Boosting, </w:t>
-      </w:r>
-      <w:proofErr w:type="spellStart"/>
-      <w:r>
-        <w:rPr>
-          <w:w w:val="105"/>
-        </w:rPr>
-        <w:t>statsmodels</w:t>
-      </w:r>
-      <w:proofErr w:type="spellEnd"/>
-      <w:r>
-        <w:rPr>
-          <w:w w:val="105"/>
-        </w:rPr>
-        <w:t xml:space="preserve"> for SARIMAX implementation, and </w:t>
-      </w:r>
-      <w:proofErr w:type="spellStart"/>
-      <w:r>
-        <w:rPr>
-          <w:w w:val="105"/>
-        </w:rPr>
-        <w:t>PyTorch</w:t>
-      </w:r>
-      <w:proofErr w:type="spellEnd"/>
-      <w:r>
-        <w:rPr>
-          <w:w w:val="105"/>
-        </w:rPr>
-        <w:t xml:space="preserve"> for deep learning models including LSTM and </w:t>
-      </w:r>
-      <w:proofErr w:type="spellStart"/>
-      <w:r>
-        <w:rPr>
-          <w:w w:val="105"/>
-        </w:rPr>
-        <w:t>PatchTST</w:t>
-      </w:r>
-      <w:proofErr w:type="spellEnd"/>
-      <w:r>
-        <w:rPr>
-          <w:w w:val="105"/>
-        </w:rPr>
-        <w:t xml:space="preserve">. Python also supports efficient preprocessing, </w:t>
-      </w:r>
-      <w:proofErr w:type="spellStart"/>
-      <w:r>
-        <w:rPr>
-          <w:w w:val="105"/>
-        </w:rPr>
-        <w:t>visualisation</w:t>
-      </w:r>
-      <w:proofErr w:type="spellEnd"/>
-      <w:r>
-        <w:rPr>
-          <w:w w:val="105"/>
-        </w:rPr>
-        <w:t>, and evaluation workflows, making it well-suited for time series forecasting tasks.</w:t>
+        <w:t>Python was selected as the primary programming language for data analysis and modelling due to its extensive ecosystem of libraries. Pandas and NumPy were used for data manipulation, scikit-learn for machine learning models such as Gradient Boosting, statsmodels for SARIMAX implementation, and PyTorch for deep learning models including LSTM and PatchTST. Python also supports efficient preprocessing, visualisation, and evaluation workflows, making it well-suited for time series forecasting tasks.</w:t>
       </w:r>
     </w:p>
     <w:p>
@@ -6691,21 +6269,7 @@
         <w:rPr>
           <w:w w:val="105"/>
         </w:rPr>
-        <w:t xml:space="preserve">For reproducible analysis, </w:t>
-      </w:r>
-      <w:proofErr w:type="spellStart"/>
-      <w:r>
-        <w:rPr>
-          <w:w w:val="105"/>
-        </w:rPr>
-        <w:t>Jupyter</w:t>
-      </w:r>
-      <w:proofErr w:type="spellEnd"/>
-      <w:r>
-        <w:rPr>
-          <w:w w:val="105"/>
-        </w:rPr>
-        <w:t xml:space="preserve"> Notebooks were used to integrate code, outputs, and explanations in a single document. This allows the full modelling pipeline to be clearly documented and easily reviewed. The final report was compiled using Microsoft Word to ensure flexibility in formatting and compliance with submission requirements.</w:t>
+        <w:t>For reproducible analysis, Jupyter Notebooks were used to integrate code, outputs, and explanations in a single document. This allows the full modelling pipeline to be clearly documented and easily reviewed. The final report was compiled using Microsoft Word to ensure flexibility in formatting and compliance with submission requirements.</w:t>
       </w:r>
     </w:p>
     <w:p>
@@ -6824,15 +6388,7 @@
         <w:jc w:val="both"/>
       </w:pPr>
       <w:r>
-        <w:t xml:space="preserve">All datasets were stored as compressed CSV files </w:t>
-      </w:r>
-      <w:proofErr w:type="gramStart"/>
-      <w:r>
-        <w:t>(.csv.zip</w:t>
-      </w:r>
-      <w:proofErr w:type="gramEnd"/>
-      <w:r>
-        <w:t>) within a structured GitHub repository. In total, four raw data files were used: one file for total demand, one for temperature, and the forecast demand dataset split into two parts due to its large size.</w:t>
+        <w:t>All datasets were stored as compressed CSV files (.csv.zip) within a structured GitHub repository. In total, four raw data files were used: one file for total demand, one for temperature, and the forecast demand dataset split into two parts due to its large size.</w:t>
       </w:r>
     </w:p>
     <w:p>
@@ -6851,27 +6407,7 @@
         <w:jc w:val="both"/>
       </w:pPr>
       <w:r>
-        <w:t xml:space="preserve">The forecast demand data was stored as two separate files, </w:t>
-      </w:r>
-      <w:proofErr w:type="spellStart"/>
-      <w:proofErr w:type="gramStart"/>
-      <w:r>
-        <w:t>forecastdemand_nsw.csv.zip.parta</w:t>
-      </w:r>
-      <w:proofErr w:type="spellEnd"/>
-      <w:proofErr w:type="gramEnd"/>
-      <w:r>
-        <w:t xml:space="preserve"> (100 MB) and </w:t>
-      </w:r>
-      <w:proofErr w:type="spellStart"/>
-      <w:proofErr w:type="gramStart"/>
-      <w:r>
-        <w:t>forecastdemand_nsw.csv.zip.partb</w:t>
-      </w:r>
-      <w:proofErr w:type="spellEnd"/>
-      <w:proofErr w:type="gramEnd"/>
-      <w:r>
-        <w:t xml:space="preserve"> (14 MB), which were combined programmatically into a single compressed file prior to analysis. The temperature dataset (temperature_nsw.csv.zip) has a size of approximately 899 KB, while the total demand dataset (totaldemand_nsw.csv.zip) is approximately 1.24 MB in size.</w:t>
+        <w:t>The forecast demand data was stored as two separate files, forecastdemand_nsw.csv.zip.parta (100 MB) and forecastdemand_nsw.csv.zip.partb (14 MB), which were combined programmatically into a single compressed file prior to analysis. The temperature dataset (temperature_nsw.csv.zip) has a size of approximately 899 KB, while the total demand dataset (totaldemand_nsw.csv.zip) is approximately 1.24 MB in size.</w:t>
       </w:r>
     </w:p>
     <w:p>
@@ -7071,21 +6607,7 @@
         <w:rPr>
           <w:spacing w:val="-2"/>
         </w:rPr>
-        <w:t xml:space="preserve">Following datetime </w:t>
-      </w:r>
-      <w:proofErr w:type="spellStart"/>
-      <w:r>
-        <w:rPr>
-          <w:spacing w:val="-2"/>
-        </w:rPr>
-        <w:t>standardisation</w:t>
-      </w:r>
-      <w:proofErr w:type="spellEnd"/>
-      <w:r>
-        <w:rPr>
-          <w:spacing w:val="-2"/>
-        </w:rPr>
-        <w:t>, all datasets were sorted chronologically to preserve temporal order, which is essential for time series modelling.</w:t>
+        <w:t>Following datetime standardisation, all datasets were sorted chronologically to preserve temporal order, which is essential for time series modelling.</w:t>
       </w:r>
     </w:p>
     <w:p>
@@ -7437,15 +6959,7 @@
         <w:jc w:val="both"/>
       </w:pPr>
       <w:r>
-        <w:t xml:space="preserve">Second, the datasets are assumed to be temporally aligned after preprocessing. The merging process relies on the DATETIME variable, and it is assumed that observations sharing the same timestamp across datasets correspond to the same real-world </w:t>
-      </w:r>
-      <w:proofErr w:type="gramStart"/>
-      <w:r>
-        <w:t>time period</w:t>
-      </w:r>
-      <w:proofErr w:type="gramEnd"/>
-      <w:r>
-        <w:t>. Any minor discrepancies in timing are considered negligible after aggregation.</w:t>
+        <w:t>Second, the datasets are assumed to be temporally aligned after preprocessing. The merging process relies on the DATETIME variable, and it is assumed that observations sharing the same timestamp across datasets correspond to the same real-world time period. Any minor discrepancies in timing are considered negligible after aggregation.</w:t>
       </w:r>
     </w:p>
     <w:p>
@@ -7496,15 +7010,7 @@
         <w:jc w:val="both"/>
       </w:pPr>
       <w:r>
-        <w:t xml:space="preserve">Fifth, it is assumed that the historical patterns observed in the data, including seasonal and daily trends, are representative of future </w:t>
-      </w:r>
-      <w:proofErr w:type="spellStart"/>
-      <w:r>
-        <w:t>behaviour</w:t>
-      </w:r>
-      <w:proofErr w:type="spellEnd"/>
-      <w:r>
-        <w:t>. This assumption underpins the validity of time series forecasting models such as SARIMAX, Gradient Boosting, and deep learning models.</w:t>
+        <w:t>Fifth, it is assumed that the historical patterns observed in the data, including seasonal and daily trends, are representative of future behaviour. This assumption underpins the validity of time series forecasting models such as SARIMAX, Gradient Boosting, and deep learning models.</w:t>
       </w:r>
     </w:p>
     <w:p>
@@ -7619,23 +7125,7 @@
           <w:sz w:val="24"/>
           <w:szCs w:val="24"/>
         </w:rPr>
-        <w:t xml:space="preserve">Four modelling approaches were implemented: SARIMAX (statistical model), Gradient Boosting (GB), Long Short-Term Memory (LSTM), and </w:t>
-      </w:r>
-      <w:proofErr w:type="spellStart"/>
-      <w:r>
-        <w:rPr>
-          <w:sz w:val="24"/>
-          <w:szCs w:val="24"/>
-        </w:rPr>
-        <w:t>PatchTST</w:t>
-      </w:r>
-      <w:proofErr w:type="spellEnd"/>
-      <w:r>
-        <w:rPr>
-          <w:sz w:val="24"/>
-          <w:szCs w:val="24"/>
-        </w:rPr>
-        <w:t xml:space="preserve"> (transformer-based model). All models were evaluated under a consistent framework using forecasting horizons of 48, 336, and 720 steps, corresponding to short-, medium-, and long-term predictions.</w:t>
+        <w:t>Four modelling approaches were implemented: SARIMAX (statistical model), Gradient Boosting (GB), Long Short-Term Memory (LSTM), and PatchTST (transformer-based model). All models were evaluated under a consistent framework using forecasting horizons of 48, 336, and 720 steps, corresponding to short-, medium-, and long-term predictions.</w:t>
       </w:r>
     </w:p>
     <w:p>
@@ -8001,23 +7491,7 @@
           <w:sz w:val="24"/>
           <w:szCs w:val="24"/>
         </w:rPr>
-        <w:t xml:space="preserve">3.6.4 Transformer-based </w:t>
-      </w:r>
-      <w:proofErr w:type="spellStart"/>
-      <w:r>
-        <w:rPr>
-          <w:sz w:val="24"/>
-          <w:szCs w:val="24"/>
-        </w:rPr>
-        <w:t>PatchTST</w:t>
-      </w:r>
-      <w:proofErr w:type="spellEnd"/>
-      <w:r>
-        <w:rPr>
-          <w:sz w:val="24"/>
-          <w:szCs w:val="24"/>
-        </w:rPr>
-        <w:t xml:space="preserve"> model</w:t>
+        <w:t>3.6.4 Transformer-based PatchTST model</w:t>
       </w:r>
     </w:p>
     <w:p>
@@ -8048,39 +7522,7 @@
           <w:sz w:val="24"/>
           <w:szCs w:val="24"/>
         </w:rPr>
-        <w:t xml:space="preserve">based model, </w:t>
-      </w:r>
-      <w:proofErr w:type="spellStart"/>
-      <w:r>
-        <w:rPr>
-          <w:sz w:val="24"/>
-          <w:szCs w:val="24"/>
-        </w:rPr>
-        <w:t>PatchTST</w:t>
-      </w:r>
-      <w:proofErr w:type="spellEnd"/>
-      <w:r>
-        <w:rPr>
-          <w:sz w:val="24"/>
-          <w:szCs w:val="24"/>
-        </w:rPr>
-        <w:t xml:space="preserve">, was implemented to leverage recent advances in time series forecasting. </w:t>
-      </w:r>
-      <w:proofErr w:type="spellStart"/>
-      <w:r>
-        <w:rPr>
-          <w:sz w:val="24"/>
-          <w:szCs w:val="24"/>
-        </w:rPr>
-        <w:t>PatchTST</w:t>
-      </w:r>
-      <w:proofErr w:type="spellEnd"/>
-      <w:r>
-        <w:rPr>
-          <w:sz w:val="24"/>
-          <w:szCs w:val="24"/>
-        </w:rPr>
-        <w:t xml:space="preserve"> represents a state</w:t>
+        <w:t>based model, PatchTST, was implemented to leverage recent advances in time series forecasting. PatchTST represents a state</w:t>
       </w:r>
       <w:r>
         <w:rPr>
@@ -8216,39 +7658,7 @@
           <w:sz w:val="24"/>
           <w:szCs w:val="24"/>
         </w:rPr>
-        <w:t xml:space="preserve">based forecasting performance, </w:t>
-      </w:r>
-      <w:proofErr w:type="spellStart"/>
-      <w:r>
-        <w:rPr>
-          <w:sz w:val="24"/>
-          <w:szCs w:val="24"/>
-        </w:rPr>
-        <w:t>PatchTST</w:t>
-      </w:r>
-      <w:proofErr w:type="spellEnd"/>
-      <w:r>
-        <w:rPr>
-          <w:sz w:val="24"/>
-          <w:szCs w:val="24"/>
-        </w:rPr>
-        <w:t xml:space="preserve"> was evaluated under two configurations: a univariate setting using only historical electricity demand, and a multivariate setting incorporating temperature as an exogenous variable. This comparison enables assessment of whether explicit inclusion of temperature provides additional predictive benefit beyond the temporal patterns learned directly from demand data. By </w:t>
-      </w:r>
-      <w:proofErr w:type="spellStart"/>
-      <w:r>
-        <w:rPr>
-          <w:sz w:val="24"/>
-          <w:szCs w:val="24"/>
-        </w:rPr>
-        <w:t>analysing</w:t>
-      </w:r>
-      <w:proofErr w:type="spellEnd"/>
-      <w:r>
-        <w:rPr>
-          <w:sz w:val="24"/>
-          <w:szCs w:val="24"/>
-        </w:rPr>
-        <w:t xml:space="preserve"> both configurations across multiple forecasting horizons, the study evaluates the extent to which transformer</w:t>
+        <w:t>based forecasting performance, PatchTST was evaluated under two configurations: a univariate setting using only historical electricity demand, and a multivariate setting incorporating temperature as an exogenous variable. This comparison enables assessment of whether explicit inclusion of temperature provides additional predictive benefit beyond the temporal patterns learned directly from demand data. By analysing both configurations across multiple forecasting horizons, the study evaluates the extent to which transformer</w:t>
       </w:r>
       <w:r>
         <w:rPr>
@@ -8416,109 +7826,115 @@
     </w:p>
     <w:p/>
     <w:p>
-      <w:proofErr w:type="spellStart"/>
-      <w:r>
-        <w:t>model_SARIMAX</w:t>
-      </w:r>
-      <w:proofErr w:type="spellEnd"/>
-      <w:r>
-        <w:t xml:space="preserve"> = </w:t>
-      </w:r>
-      <w:proofErr w:type="gramStart"/>
-      <w:r>
-        <w:t>SARIMAX(</w:t>
-      </w:r>
-      <w:proofErr w:type="gramEnd"/>
-    </w:p>
-    <w:p>
-      <w:r>
-        <w:t xml:space="preserve">    </w:t>
-      </w:r>
-      <w:proofErr w:type="spellStart"/>
-      <w:r>
-        <w:t>y_train_clean</w:t>
-      </w:r>
-      <w:proofErr w:type="spellEnd"/>
+      <w:r>
+        <w:t>model_SARIMAX = SARIMAX(</w:t>
+      </w:r>
+    </w:p>
+    <w:p>
+      <w:r>
+        <w:t>    y_train_clean,</w:t>
+      </w:r>
+    </w:p>
+    <w:p>
+      <w:r>
+        <w:t>    exog=X_train_clean,</w:t>
+      </w:r>
+    </w:p>
+    <w:p>
+      <w:r>
+        <w:t>    order=(1, 1, 0),</w:t>
+      </w:r>
+    </w:p>
+    <w:p>
+      <w:r>
+        <w:t>    seasonal_order=(0, 1, 0, 48),</w:t>
+      </w:r>
+    </w:p>
+    <w:p>
+      <w:r>
+        <w:t>    enforce_stationarity=False,</w:t>
+      </w:r>
+    </w:p>
+    <w:p>
+      <w:r>
+        <w:t>    enforce_invertibility=False,</w:t>
+      </w:r>
+    </w:p>
+    <w:p>
+      <w:r>
+        <w:t>)</w:t>
+      </w:r>
+    </w:p>
+    <w:p/>
+    <w:p>
+      <w:pPr>
+        <w:rPr>
+          <w:lang w:val="en-AU"/>
+        </w:rPr>
+      </w:pPr>
+      <w:r>
+        <w:rPr>
+          <w:lang w:val="en-AU"/>
+        </w:rPr>
+        <w:t>For the Gradient Boosting model, hyperparameters controlling model complexity and learning behaviour were selected through iterative experimentation and evaluation using validation RMSE. The number of estimators was set to 500 to allow the model to learn patterns progressively across many trees, improving predictive performance. A learning rate of 0.03 was chosen to ensure updates were applied gradually, reducing the risk of overfitting and improving model stability.</w:t>
+      </w:r>
+    </w:p>
+    <w:p>
+      <w:pPr>
+        <w:rPr>
+          <w:lang w:val="en-AU"/>
+        </w:rPr>
+      </w:pPr>
+    </w:p>
+    <w:p>
+      <w:pPr>
+        <w:rPr>
+          <w:lang w:val="en-AU"/>
+        </w:rPr>
+      </w:pPr>
+      <w:r>
+        <w:rPr>
+          <w:lang w:val="en-AU"/>
+        </w:rPr>
+        <w:t>The maximum tree depth was set to 5, allowing the model to capture more complex non-linear relationships compared to shallower trees while still maintaining reasonable generalisation performance. A fixed random state was used to ensure reproducibility of results. While more complex configurations (e.g. deeper trees or additional estimators) were explored, they resulted in only marginal improvements in performance relative to the increased training time, indicating diminishing returns from further tuning</w:t>
+      </w:r>
+    </w:p>
+    <w:p/>
+    <w:p>
+      <w:r>
+        <w:t>gb_model = GradientBoostingRegressor(</w:t>
+      </w:r>
+    </w:p>
+    <w:p>
+      <w:r>
+        <w:t>    n_estimators=</w:t>
+      </w:r>
+      <w:r>
+        <w:t>500</w:t>
+      </w:r>
       <w:r>
         <w:t>,</w:t>
       </w:r>
     </w:p>
     <w:p>
       <w:r>
-        <w:t xml:space="preserve">    </w:t>
-      </w:r>
-      <w:proofErr w:type="spellStart"/>
-      <w:r>
-        <w:t>exog</w:t>
-      </w:r>
-      <w:proofErr w:type="spellEnd"/>
-      <w:r>
-        <w:t>=</w:t>
-      </w:r>
-      <w:proofErr w:type="spellStart"/>
-      <w:r>
-        <w:t>X_train_clean</w:t>
-      </w:r>
-      <w:proofErr w:type="spellEnd"/>
+        <w:t>    learning_rate=0.03,</w:t>
+      </w:r>
+    </w:p>
+    <w:p>
+      <w:r>
+        <w:t>    max_depth=</w:t>
+      </w:r>
+      <w:r>
+        <w:t>5</w:t>
+      </w:r>
       <w:r>
         <w:t>,</w:t>
       </w:r>
     </w:p>
     <w:p>
       <w:r>
-        <w:t>    order</w:t>
-      </w:r>
-      <w:proofErr w:type="gramStart"/>
-      <w:r>
-        <w:t>=(</w:t>
-      </w:r>
-      <w:proofErr w:type="gramEnd"/>
-      <w:r>
-        <w:t>1, 1, 0),</w:t>
-      </w:r>
-    </w:p>
-    <w:p>
-      <w:r>
-        <w:t xml:space="preserve">    </w:t>
-      </w:r>
-      <w:proofErr w:type="spellStart"/>
-      <w:r>
-        <w:t>seasonal_order</w:t>
-      </w:r>
-      <w:proofErr w:type="spellEnd"/>
-      <w:proofErr w:type="gramStart"/>
-      <w:r>
-        <w:t>=(</w:t>
-      </w:r>
-      <w:proofErr w:type="gramEnd"/>
-      <w:r>
-        <w:t>0, 1, 0, 48),</w:t>
-      </w:r>
-    </w:p>
-    <w:p>
-      <w:r>
-        <w:t xml:space="preserve">    </w:t>
-      </w:r>
-      <w:proofErr w:type="spellStart"/>
-      <w:r>
-        <w:t>enforce_stationarity</w:t>
-      </w:r>
-      <w:proofErr w:type="spellEnd"/>
-      <w:r>
-        <w:t>=False,</w:t>
-      </w:r>
-    </w:p>
-    <w:p>
-      <w:r>
-        <w:t xml:space="preserve">    </w:t>
-      </w:r>
-      <w:proofErr w:type="spellStart"/>
-      <w:r>
-        <w:t>enforce_invertibility</w:t>
-      </w:r>
-      <w:proofErr w:type="spellEnd"/>
-      <w:r>
-        <w:t>=False,</w:t>
+        <w:t>    random_state=42</w:t>
       </w:r>
     </w:p>
     <w:p>
@@ -8528,250 +7944,49 @@
     </w:p>
     <w:p/>
     <w:p>
-      <w:pPr>
-        <w:rPr>
-          <w:lang w:val="en-AU"/>
-        </w:rPr>
-      </w:pPr>
-      <w:r>
-        <w:rPr>
-          <w:lang w:val="en-AU"/>
-        </w:rPr>
-        <w:t>For the Gradient Boosting model, hyperparameters controlling model complexity and learning behaviour were selected through iterative experimentation and evaluation using validation RMSE. The number of estimators was set to 500 to allow the model to learn patterns progressively across many trees, improving predictive performance. A learning rate of 0.03 was chosen to ensure updates were applied gradually, reducing the risk of overfitting and improving model stability.</w:t>
-      </w:r>
-    </w:p>
-    <w:p>
-      <w:pPr>
-        <w:rPr>
-          <w:lang w:val="en-AU"/>
-        </w:rPr>
-      </w:pPr>
-    </w:p>
-    <w:p>
-      <w:pPr>
-        <w:rPr>
-          <w:lang w:val="en-AU"/>
-        </w:rPr>
-      </w:pPr>
-      <w:r>
-        <w:rPr>
-          <w:lang w:val="en-AU"/>
-        </w:rPr>
-        <w:t>The maximum tree depth was set to 5, allowing the model to capture more complex non-linear relationships compared to shallower trees while still maintaining reasonable generalisation performance. A fixed random state was used to ensure reproducibility of results. While more complex configurations (e.g. deeper trees or additional estimators) were explored, they resulted in only marginal improvements in performance relative to the increased training time, indicating diminishing returns from further tuning</w:t>
-      </w:r>
-    </w:p>
-    <w:p/>
-    <w:p>
-      <w:proofErr w:type="spellStart"/>
-      <w:r>
-        <w:t>gb_model</w:t>
-      </w:r>
-      <w:proofErr w:type="spellEnd"/>
-      <w:r>
-        <w:t xml:space="preserve"> = </w:t>
-      </w:r>
-      <w:proofErr w:type="spellStart"/>
-      <w:proofErr w:type="gramStart"/>
-      <w:r>
-        <w:t>GradientBoostingRegressor</w:t>
-      </w:r>
-      <w:proofErr w:type="spellEnd"/>
-      <w:r>
-        <w:t>(</w:t>
-      </w:r>
-      <w:proofErr w:type="gramEnd"/>
-    </w:p>
-    <w:p>
-      <w:r>
-        <w:t xml:space="preserve">    </w:t>
-      </w:r>
-      <w:proofErr w:type="spellStart"/>
-      <w:r>
-        <w:t>n_estimators</w:t>
-      </w:r>
-      <w:proofErr w:type="spellEnd"/>
-      <w:r>
-        <w:t>=</w:t>
-      </w:r>
-      <w:r>
-        <w:t>500</w:t>
-      </w:r>
-      <w:r>
-        <w:t>,</w:t>
-      </w:r>
-    </w:p>
-    <w:p>
-      <w:r>
-        <w:t xml:space="preserve">    </w:t>
-      </w:r>
-      <w:proofErr w:type="spellStart"/>
-      <w:r>
-        <w:t>learning_rate</w:t>
-      </w:r>
-      <w:proofErr w:type="spellEnd"/>
-      <w:r>
-        <w:t>=0.03,</w:t>
-      </w:r>
-    </w:p>
-    <w:p>
-      <w:r>
-        <w:t xml:space="preserve">    </w:t>
-      </w:r>
-      <w:proofErr w:type="spellStart"/>
-      <w:r>
-        <w:t>max_depth</w:t>
-      </w:r>
-      <w:proofErr w:type="spellEnd"/>
-      <w:r>
-        <w:t>=</w:t>
-      </w:r>
-      <w:r>
-        <w:t>5</w:t>
-      </w:r>
-      <w:r>
-        <w:t>,</w:t>
-      </w:r>
-    </w:p>
-    <w:p>
-      <w:r>
-        <w:t xml:space="preserve">    </w:t>
-      </w:r>
-      <w:proofErr w:type="spellStart"/>
-      <w:r>
-        <w:t>random_state</w:t>
-      </w:r>
-      <w:proofErr w:type="spellEnd"/>
-      <w:r>
-        <w:t>=42</w:t>
-      </w:r>
-    </w:p>
-    <w:p>
-      <w:r>
-        <w:t>)</w:t>
-      </w:r>
-    </w:p>
-    <w:p/>
-    <w:p>
-      <w:r>
-        <w:t xml:space="preserve">def </w:t>
-      </w:r>
-      <w:proofErr w:type="spellStart"/>
-      <w:r>
-        <w:t>run_patchtst_</w:t>
-      </w:r>
-      <w:proofErr w:type="gramStart"/>
-      <w:r>
-        <w:t>experiment</w:t>
-      </w:r>
-      <w:proofErr w:type="spellEnd"/>
-      <w:r>
-        <w:t>(</w:t>
-      </w:r>
-      <w:proofErr w:type="gramEnd"/>
-    </w:p>
-    <w:p>
-      <w:r>
-        <w:t xml:space="preserve">    </w:t>
-      </w:r>
-      <w:proofErr w:type="spellStart"/>
-      <w:r>
-        <w:t>train_series</w:t>
-      </w:r>
-      <w:proofErr w:type="spellEnd"/>
-      <w:r>
-        <w:t>,</w:t>
-      </w:r>
-    </w:p>
-    <w:p>
-      <w:r>
-        <w:t xml:space="preserve">    </w:t>
-      </w:r>
-      <w:proofErr w:type="spellStart"/>
-      <w:r>
-        <w:t>val_series</w:t>
-      </w:r>
-      <w:proofErr w:type="spellEnd"/>
-      <w:r>
-        <w:t>,</w:t>
-      </w:r>
-    </w:p>
-    <w:p>
-      <w:r>
-        <w:t xml:space="preserve">    </w:t>
-      </w:r>
-      <w:proofErr w:type="spellStart"/>
-      <w:r>
-        <w:t>test_series</w:t>
-      </w:r>
-      <w:proofErr w:type="spellEnd"/>
-      <w:r>
-        <w:t>,</w:t>
+      <w:r>
+        <w:t>def run_patchtst_experiment(</w:t>
+      </w:r>
+    </w:p>
+    <w:p>
+      <w:r>
+        <w:t>    train_series,</w:t>
+      </w:r>
+    </w:p>
+    <w:p>
+      <w:r>
+        <w:t>    val_series,</w:t>
+      </w:r>
+    </w:p>
+    <w:p>
+      <w:r>
+        <w:t>    test_series,</w:t>
       </w:r>
     </w:p>
     <w:p>
       <w:r>
         <w:lastRenderedPageBreak/>
-        <w:t xml:space="preserve">    </w:t>
-      </w:r>
-      <w:proofErr w:type="spellStart"/>
-      <w:r>
-        <w:t>target_scaler</w:t>
-      </w:r>
-      <w:proofErr w:type="spellEnd"/>
-      <w:r>
-        <w:t>,</w:t>
-      </w:r>
-    </w:p>
-    <w:p>
-      <w:r>
-        <w:t xml:space="preserve">    </w:t>
-      </w:r>
-      <w:proofErr w:type="spellStart"/>
-      <w:r>
-        <w:t>context_length</w:t>
-      </w:r>
-      <w:proofErr w:type="spellEnd"/>
-      <w:r>
-        <w:t>,</w:t>
-      </w:r>
-    </w:p>
-    <w:p>
-      <w:r>
-        <w:t xml:space="preserve">    </w:t>
-      </w:r>
-      <w:proofErr w:type="spellStart"/>
-      <w:r>
-        <w:t>prediction_length</w:t>
-      </w:r>
-      <w:proofErr w:type="spellEnd"/>
-      <w:r>
-        <w:t>,</w:t>
-      </w:r>
-    </w:p>
-    <w:p>
-      <w:r>
-        <w:t xml:space="preserve">    </w:t>
-      </w:r>
-      <w:proofErr w:type="spellStart"/>
-      <w:r>
-        <w:t>batch_size</w:t>
-      </w:r>
-      <w:proofErr w:type="spellEnd"/>
-      <w:r>
-        <w:t>=64,</w:t>
-      </w:r>
-    </w:p>
-    <w:p>
-      <w:r>
-        <w:t xml:space="preserve">    </w:t>
-      </w:r>
-      <w:proofErr w:type="spellStart"/>
-      <w:r>
-        <w:t>learning_rate</w:t>
-      </w:r>
-      <w:proofErr w:type="spellEnd"/>
-      <w:r>
-        <w:t>=1e-3,</w:t>
+        <w:t>    target_scaler,</w:t>
+      </w:r>
+    </w:p>
+    <w:p>
+      <w:r>
+        <w:t>    context_length,</w:t>
+      </w:r>
+    </w:p>
+    <w:p>
+      <w:r>
+        <w:t>    prediction_length,</w:t>
+      </w:r>
+    </w:p>
+    <w:p>
+      <w:r>
+        <w:t>    batch_size=64,</w:t>
+      </w:r>
+    </w:p>
+    <w:p>
+      <w:r>
+        <w:t>    learning_rate=1e-3,</w:t>
       </w:r>
     </w:p>
     <w:p>
@@ -8786,93 +8001,37 @@
     </w:p>
     <w:p>
       <w:r>
-        <w:t xml:space="preserve">    </w:t>
-      </w:r>
-      <w:proofErr w:type="spellStart"/>
-      <w:r>
-        <w:t>patch_length</w:t>
-      </w:r>
-      <w:proofErr w:type="spellEnd"/>
-      <w:r>
-        <w:t>=16,</w:t>
-      </w:r>
-    </w:p>
-    <w:p>
-      <w:r>
-        <w:t xml:space="preserve">    </w:t>
-      </w:r>
-      <w:proofErr w:type="spellStart"/>
-      <w:r>
-        <w:t>patch_stride</w:t>
-      </w:r>
-      <w:proofErr w:type="spellEnd"/>
-      <w:r>
-        <w:t>=8,</w:t>
-      </w:r>
-    </w:p>
-    <w:p>
-      <w:r>
-        <w:t xml:space="preserve">    </w:t>
-      </w:r>
-      <w:proofErr w:type="spellStart"/>
-      <w:r>
-        <w:t>d_model</w:t>
-      </w:r>
-      <w:proofErr w:type="spellEnd"/>
-      <w:r>
-        <w:t>=128,</w:t>
-      </w:r>
-    </w:p>
-    <w:p>
-      <w:r>
-        <w:t xml:space="preserve">    </w:t>
-      </w:r>
-      <w:proofErr w:type="spellStart"/>
-      <w:r>
-        <w:t>num_hidden_layers</w:t>
-      </w:r>
-      <w:proofErr w:type="spellEnd"/>
-      <w:r>
-        <w:t>=3,</w:t>
-      </w:r>
-    </w:p>
-    <w:p>
-      <w:r>
-        <w:t xml:space="preserve">    </w:t>
-      </w:r>
-      <w:proofErr w:type="spellStart"/>
-      <w:r>
-        <w:t>num_attention_heads</w:t>
-      </w:r>
-      <w:proofErr w:type="spellEnd"/>
-      <w:r>
-        <w:t>=16,</w:t>
-      </w:r>
-    </w:p>
-    <w:p>
-      <w:r>
-        <w:t xml:space="preserve">    </w:t>
-      </w:r>
-      <w:proofErr w:type="spellStart"/>
-      <w:r>
-        <w:t>ffn_dim</w:t>
-      </w:r>
-      <w:proofErr w:type="spellEnd"/>
-      <w:r>
-        <w:t>=256,</w:t>
-      </w:r>
-    </w:p>
-    <w:p>
-      <w:r>
-        <w:t xml:space="preserve">    </w:t>
-      </w:r>
-      <w:proofErr w:type="spellStart"/>
-      <w:r>
-        <w:t>use_seed</w:t>
-      </w:r>
-      <w:proofErr w:type="spellEnd"/>
-      <w:r>
-        <w:t>=None,</w:t>
+        <w:t>    patch_length=16,</w:t>
+      </w:r>
+    </w:p>
+    <w:p>
+      <w:r>
+        <w:t>    patch_stride=8,</w:t>
+      </w:r>
+    </w:p>
+    <w:p>
+      <w:r>
+        <w:t>    d_model=128,</w:t>
+      </w:r>
+    </w:p>
+    <w:p>
+      <w:r>
+        <w:t>    num_hidden_layers=3,</w:t>
+      </w:r>
+    </w:p>
+    <w:p>
+      <w:r>
+        <w:t>    num_attention_heads=16,</w:t>
+      </w:r>
+    </w:p>
+    <w:p>
+      <w:r>
+        <w:t>    ffn_dim=256,</w:t>
+      </w:r>
+    </w:p>
+    <w:p>
+      <w:r>
+        <w:t>    use_seed=None,</w:t>
       </w:r>
     </w:p>
     <w:p>
@@ -9186,7 +8345,7 @@
                 <v:stroke joinstyle="miter"/>
                 <v:path gradientshapeok="t" o:connecttype="rect"/>
               </v:shapetype>
-              <v:shape id="Text Box 2" o:spid="_x0000_s1026" type="#_x0000_t202" style="position:absolute;left:0;text-align:left;margin-left:218.6pt;margin-top:179.85pt;width:57.3pt;height:16.95pt;z-index:487608832;visibility:visible;mso-wrap-style:square;mso-width-percent:0;mso-height-percent:0;mso-wrap-distance-left:9pt;mso-wrap-distance-top:3.6pt;mso-wrap-distance-right:9pt;mso-wrap-distance-bottom:3.6pt;mso-position-horizontal:absolute;mso-position-horizontal-relative:margin;mso-position-vertical:absolute;mso-position-vertical-relative:text;mso-width-percent:0;mso-height-percent:0;mso-width-relative:margin;mso-height-relative:margin;v-text-anchor:top" o:gfxdata="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" filled="f" stroked="f">
+              <v:shape id="Text Box 2" o:spid="_x0000_s1026" type="#_x0000_t202" style="position:absolute;left:0;text-align:left;margin-left:218.6pt;margin-top:179.85pt;width:57.3pt;height:16.95pt;z-index:487608832;visibility:visible;mso-wrap-style:square;mso-width-percent:0;mso-height-percent:0;mso-wrap-distance-left:9pt;mso-wrap-distance-top:3.6pt;mso-wrap-distance-right:9pt;mso-wrap-distance-bottom:3.6pt;mso-position-horizontal:absolute;mso-position-horizontal-relative:margin;mso-position-vertical:absolute;mso-position-vertical-relative:text;mso-width-percent:0;mso-height-percent:0;mso-width-relative:margin;mso-height-relative:margin;v-text-anchor:top" o:gfxdata="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" filled="f" stroked="f">
                 <v:textbox>
                   <w:txbxContent>
                     <w:p>
@@ -9281,35 +8440,7 @@
         <w:rPr>
           <w:w w:val="110"/>
         </w:rPr>
-        <w:t xml:space="preserve">Peak demand reaches approximately 14,500 MW, while minimum demand levels are around 5,500 </w:t>
-      </w:r>
-      <w:proofErr w:type="gramStart"/>
-      <w:r>
-        <w:rPr>
-          <w:w w:val="110"/>
-        </w:rPr>
-        <w:t>MW .</w:t>
-      </w:r>
-      <w:proofErr w:type="gramEnd"/>
-      <w:r>
-        <w:rPr>
-          <w:w w:val="110"/>
-        </w:rPr>
-        <w:t xml:space="preserve"> These fluctuations reflect changes in consumption </w:t>
-      </w:r>
-      <w:proofErr w:type="spellStart"/>
-      <w:r>
-        <w:rPr>
-          <w:w w:val="110"/>
-        </w:rPr>
-        <w:t>behaviour</w:t>
-      </w:r>
-      <w:proofErr w:type="spellEnd"/>
-      <w:r>
-        <w:rPr>
-          <w:w w:val="110"/>
-        </w:rPr>
-        <w:t xml:space="preserve"> driven by factors such as weather conditions, time of day, and economic activity.</w:t>
+        <w:t>Peak demand reaches approximately 14,500 MW, while minimum demand levels are around 5,500 MW . These fluctuations reflect changes in consumption behaviour driven by factors such as weather conditions, time of day, and economic activity.</w:t>
       </w:r>
     </w:p>
     <w:p>
@@ -9695,7 +8826,7 @@
           </mc:Choice>
           <mc:Fallback>
             <w:pict>
-              <v:shape w14:anchorId="2A70FACA" id="_x0000_s1027" type="#_x0000_t202" style="position:absolute;left:0;text-align:left;margin-left:216.45pt;margin-top:21.35pt;width:57.3pt;height:16.95pt;z-index:487610880;visibility:visible;mso-wrap-style:square;mso-width-percent:0;mso-height-percent:0;mso-wrap-distance-left:9pt;mso-wrap-distance-top:3.6pt;mso-wrap-distance-right:9pt;mso-wrap-distance-bottom:3.6pt;mso-position-horizontal:absolute;mso-position-horizontal-relative:margin;mso-position-vertical:absolute;mso-position-vertical-relative:text;mso-width-percent:0;mso-height-percent:0;mso-width-relative:margin;mso-height-relative:margin;v-text-anchor:top" o:gfxdata="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" filled="f" stroked="f">
+              <v:shape w14:anchorId="2A70FACA" id="_x0000_s1027" type="#_x0000_t202" style="position:absolute;left:0;text-align:left;margin-left:216.45pt;margin-top:21.35pt;width:57.3pt;height:16.95pt;z-index:487610880;visibility:visible;mso-wrap-style:square;mso-width-percent:0;mso-height-percent:0;mso-wrap-distance-left:9pt;mso-wrap-distance-top:3.6pt;mso-wrap-distance-right:9pt;mso-wrap-distance-bottom:3.6pt;mso-position-horizontal:absolute;mso-position-horizontal-relative:margin;mso-position-vertical:absolute;mso-position-vertical-relative:text;mso-width-percent:0;mso-height-percent:0;mso-width-relative:margin;mso-height-relative:margin;v-text-anchor:top" o:gfxdata="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" filled="f" stroked="f">
                 <v:textbox>
                   <w:txbxContent>
                     <w:p>
@@ -9748,21 +8879,7 @@
         <w:rPr>
           <w:w w:val="110"/>
         </w:rPr>
-        <w:t xml:space="preserve">At low temperatures, demand increases due to heating requirements, while at high temperatures, demand rises due to air-conditioning </w:t>
-      </w:r>
-      <w:proofErr w:type="gramStart"/>
-      <w:r>
-        <w:rPr>
-          <w:w w:val="110"/>
-        </w:rPr>
-        <w:t>usage .</w:t>
-      </w:r>
-      <w:proofErr w:type="gramEnd"/>
-      <w:r>
-        <w:rPr>
-          <w:w w:val="110"/>
-        </w:rPr>
-        <w:t xml:space="preserve"> Demand is lowest at moderate temperatures, indicating reduced need for climate control.</w:t>
+        <w:t>At low temperatures, demand increases due to heating requirements, while at high temperatures, demand rises due to air-conditioning usage . Demand is lowest at moderate temperatures, indicating reduced need for climate control.</w:t>
       </w:r>
     </w:p>
     <w:p>
@@ -10182,7 +9299,7 @@
           </mc:Choice>
           <mc:Fallback>
             <w:pict>
-              <v:shape w14:anchorId="19F99277" id="_x0000_s1028" type="#_x0000_t202" style="position:absolute;left:0;text-align:left;margin-left:221.9pt;margin-top:14.6pt;width:57.3pt;height:16.95pt;z-index:487612928;visibility:visible;mso-wrap-style:square;mso-width-percent:0;mso-height-percent:0;mso-wrap-distance-left:9pt;mso-wrap-distance-top:3.6pt;mso-wrap-distance-right:9pt;mso-wrap-distance-bottom:3.6pt;mso-position-horizontal:absolute;mso-position-horizontal-relative:margin;mso-position-vertical:absolute;mso-position-vertical-relative:text;mso-width-percent:0;mso-height-percent:0;mso-width-relative:margin;mso-height-relative:margin;v-text-anchor:top" o:gfxdata="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" filled="f" stroked="f">
+              <v:shape w14:anchorId="19F99277" id="_x0000_s1028" type="#_x0000_t202" style="position:absolute;left:0;text-align:left;margin-left:221.9pt;margin-top:14.6pt;width:57.3pt;height:16.95pt;z-index:487612928;visibility:visible;mso-wrap-style:square;mso-width-percent:0;mso-height-percent:0;mso-wrap-distance-left:9pt;mso-wrap-distance-top:3.6pt;mso-wrap-distance-right:9pt;mso-wrap-distance-bottom:3.6pt;mso-position-horizontal:absolute;mso-position-horizontal-relative:margin;mso-position-vertical:absolute;mso-position-vertical-relative:text;mso-width-percent:0;mso-height-percent:0;mso-width-relative:margin;mso-height-relative:margin;v-text-anchor:top" o:gfxdata="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" filled="f" stroked="f">
                 <v:textbox>
                   <w:txbxContent>
                     <w:p>
@@ -10226,13 +9343,8 @@
         <w:jc w:val="both"/>
       </w:pPr>
       <w:r>
-        <w:t xml:space="preserve">However, some dispersion is observed, particularly at higher demand levels, indicating reduced accuracy during peak demand </w:t>
-      </w:r>
-      <w:proofErr w:type="gramStart"/>
-      <w:r>
-        <w:t>periods .</w:t>
-      </w:r>
-      <w:proofErr w:type="gramEnd"/>
+        <w:t>However, some dispersion is observed, particularly at higher demand levels, indicating reduced accuracy during peak demand periods .</w:t>
+      </w:r>
     </w:p>
     <w:p>
       <w:pPr>
@@ -10629,7 +9741,7 @@
           </mc:Choice>
           <mc:Fallback>
             <w:pict>
-              <v:shape w14:anchorId="1E84502E" id="_x0000_s1029" type="#_x0000_t202" style="position:absolute;left:0;text-align:left;margin-left:212.35pt;margin-top:8.45pt;width:57.3pt;height:16.95pt;z-index:487614976;visibility:visible;mso-wrap-style:square;mso-width-percent:0;mso-height-percent:0;mso-wrap-distance-left:9pt;mso-wrap-distance-top:3.6pt;mso-wrap-distance-right:9pt;mso-wrap-distance-bottom:3.6pt;mso-position-horizontal:absolute;mso-position-horizontal-relative:margin;mso-position-vertical:absolute;mso-position-vertical-relative:text;mso-width-percent:0;mso-height-percent:0;mso-width-relative:margin;mso-height-relative:margin;v-text-anchor:top" o:gfxdata="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" filled="f" stroked="f">
+              <v:shape w14:anchorId="1E84502E" id="_x0000_s1029" type="#_x0000_t202" style="position:absolute;left:0;text-align:left;margin-left:212.35pt;margin-top:8.45pt;width:57.3pt;height:16.95pt;z-index:487614976;visibility:visible;mso-wrap-style:square;mso-width-percent:0;mso-height-percent:0;mso-wrap-distance-left:9pt;mso-wrap-distance-top:3.6pt;mso-wrap-distance-right:9pt;mso-wrap-distance-bottom:3.6pt;mso-position-horizontal:absolute;mso-position-horizontal-relative:margin;mso-position-vertical:absolute;mso-position-vertical-relative:text;mso-width-percent:0;mso-height-percent:0;mso-width-relative:margin;mso-height-relative:margin;v-text-anchor:top" o:gfxdata="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" filled="f" stroked="f">
                 <v:textbox>
                   <w:txbxContent>
                     <w:p>
@@ -10715,21 +9827,10 @@
         <w:rPr>
           <w:highlight w:val="red"/>
         </w:rPr>
-        <w:t xml:space="preserve"> (TBC</w:t>
-      </w:r>
-      <w:proofErr w:type="gramStart"/>
-      <w:r>
-        <w:rPr>
-          <w:highlight w:val="red"/>
-        </w:rPr>
-        <w:t>)</w:t>
-      </w:r>
-      <w:r>
-        <w:t xml:space="preserve"> ,</w:t>
-      </w:r>
-      <w:proofErr w:type="gramEnd"/>
-      <w:r>
-        <w:t xml:space="preserve"> indicating that while forecast demand is informative, it does not fully explain the variability in actual demand.</w:t>
+        <w:t xml:space="preserve"> (TBC)</w:t>
+      </w:r>
+      <w:r>
+        <w:t xml:space="preserve"> , indicating that while forecast demand is informative, it does not fully explain the variability in actual demand.</w:t>
       </w:r>
     </w:p>
     <w:p>
@@ -10889,7 +9990,7 @@
           </mc:Choice>
           <mc:Fallback>
             <w:pict>
-              <v:shape w14:anchorId="74790337" id="_x0000_s1030" type="#_x0000_t202" style="position:absolute;left:0;text-align:left;margin-left:-43.6pt;margin-top:87.9pt;width:54pt;height:14.45pt;rotation:-90;z-index:487603712;visibility:visible;mso-wrap-style:square;mso-width-percent:0;mso-height-percent:0;mso-wrap-distance-left:9pt;mso-wrap-distance-top:3.6pt;mso-wrap-distance-right:9pt;mso-wrap-distance-bottom:3.6pt;mso-position-horizontal:absolute;mso-position-horizontal-relative:text;mso-position-vertical:absolute;mso-position-vertical-relative:text;mso-width-percent:0;mso-height-percent:0;mso-width-relative:margin;mso-height-relative:margin;v-text-anchor:top" o:gfxdata="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" filled="f" stroked="f">
+              <v:shape w14:anchorId="74790337" id="_x0000_s1030" type="#_x0000_t202" style="position:absolute;left:0;text-align:left;margin-left:-43.6pt;margin-top:87.9pt;width:54pt;height:14.45pt;rotation:-90;z-index:487603712;visibility:visible;mso-wrap-style:square;mso-width-percent:0;mso-height-percent:0;mso-wrap-distance-left:9pt;mso-wrap-distance-top:3.6pt;mso-wrap-distance-right:9pt;mso-wrap-distance-bottom:3.6pt;mso-position-horizontal:absolute;mso-position-horizontal-relative:text;mso-position-vertical:absolute;mso-position-vertical-relative:text;mso-width-percent:0;mso-height-percent:0;mso-width-relative:margin;mso-height-relative:margin;v-text-anchor:top" o:gfxdata="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" filled="f" stroked="f">
                 <v:textbox>
                   <w:txbxContent>
                     <w:p>
@@ -11069,7 +10170,7 @@
                 </mc:Choice>
                 <mc:Fallback>
                   <w:pict>
-                    <v:shape w14:anchorId="79DA2D40" id="_x0000_s1031" type="#_x0000_t202" style="position:absolute;left:0;text-align:left;margin-left:52.45pt;margin-top:146.25pt;width:57.3pt;height:16.95pt;z-index:487621120;visibility:visible;mso-wrap-style:square;mso-width-percent:0;mso-height-percent:0;mso-wrap-distance-left:9pt;mso-wrap-distance-top:3.6pt;mso-wrap-distance-right:9pt;mso-wrap-distance-bottom:3.6pt;mso-position-horizontal:absolute;mso-position-horizontal-relative:margin;mso-position-vertical:absolute;mso-position-vertical-relative:text;mso-width-percent:0;mso-height-percent:0;mso-width-relative:margin;mso-height-relative:margin;v-text-anchor:top" o:gfxdata="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" filled="f" stroked="f">
+                    <v:shape w14:anchorId="79DA2D40" id="_x0000_s1031" type="#_x0000_t202" style="position:absolute;left:0;text-align:left;margin-left:52.45pt;margin-top:146.25pt;width:57.3pt;height:16.95pt;z-index:487621120;visibility:visible;mso-wrap-style:square;mso-width-percent:0;mso-height-percent:0;mso-wrap-distance-left:9pt;mso-wrap-distance-top:3.6pt;mso-wrap-distance-right:9pt;mso-wrap-distance-bottom:3.6pt;mso-position-horizontal:absolute;mso-position-horizontal-relative:margin;mso-position-vertical:absolute;mso-position-vertical-relative:text;mso-width-percent:0;mso-height-percent:0;mso-width-relative:margin;mso-height-relative:margin;v-text-anchor:top" o:gfxdata="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" filled="f" stroked="f">
                       <v:textbox>
                         <w:txbxContent>
                           <w:p>
@@ -11101,7 +10202,7 @@
                 <w:noProof/>
               </w:rPr>
               <w:drawing>
-                <wp:anchor distT="0" distB="0" distL="114300" distR="114300" simplePos="0" relativeHeight="487599616" behindDoc="0" locked="0" layoutInCell="1" allowOverlap="1" wp14:anchorId="2687DCBC" wp14:editId="4FB80FFA">
+                <wp:anchor distT="0" distB="0" distL="114300" distR="114300" simplePos="0" relativeHeight="487599616" behindDoc="0" locked="0" layoutInCell="1" allowOverlap="1" wp14:anchorId="2687DCBC" wp14:editId="404ACBB9">
                   <wp:simplePos x="0" y="0"/>
                   <wp:positionH relativeFrom="column">
                     <wp:posOffset>26020</wp:posOffset>
@@ -11180,7 +10281,7 @@
                 <w:noProof/>
               </w:rPr>
               <w:drawing>
-                <wp:anchor distT="0" distB="0" distL="114300" distR="114300" simplePos="0" relativeHeight="487600640" behindDoc="0" locked="0" layoutInCell="1" allowOverlap="1" wp14:anchorId="1E3F83FF" wp14:editId="63B5C79F">
+                <wp:anchor distT="0" distB="0" distL="114300" distR="114300" simplePos="0" relativeHeight="487600640" behindDoc="0" locked="0" layoutInCell="1" allowOverlap="1" wp14:anchorId="1E3F83FF" wp14:editId="747ED1FD">
                   <wp:simplePos x="0" y="0"/>
                   <wp:positionH relativeFrom="column">
                     <wp:posOffset>-41771</wp:posOffset>
@@ -11259,7 +10360,7 @@
                 <w:noProof/>
               </w:rPr>
               <w:drawing>
-                <wp:anchor distT="0" distB="0" distL="114300" distR="114300" simplePos="0" relativeHeight="487604736" behindDoc="0" locked="0" layoutInCell="1" allowOverlap="1" wp14:anchorId="07B2B002" wp14:editId="07B2716B">
+                <wp:anchor distT="0" distB="0" distL="114300" distR="114300" simplePos="0" relativeHeight="487604736" behindDoc="0" locked="0" layoutInCell="1" allowOverlap="1" wp14:anchorId="07B2B002" wp14:editId="5487B02F">
                   <wp:simplePos x="0" y="0"/>
                   <wp:positionH relativeFrom="column">
                     <wp:posOffset>-42669</wp:posOffset>
@@ -11477,7 +10578,7 @@
           </mc:Choice>
           <mc:Fallback>
             <w:pict>
-              <v:shape w14:anchorId="2D67F42D" id="_x0000_s1032" type="#_x0000_t202" style="position:absolute;left:0;text-align:left;margin-left:204.05pt;margin-top:.15pt;width:57.3pt;height:16.95pt;z-index:487617024;visibility:visible;mso-wrap-style:square;mso-width-percent:0;mso-height-percent:0;mso-wrap-distance-left:9pt;mso-wrap-distance-top:3.6pt;mso-wrap-distance-right:9pt;mso-wrap-distance-bottom:3.6pt;mso-position-horizontal:absolute;mso-position-horizontal-relative:margin;mso-position-vertical:absolute;mso-position-vertical-relative:text;mso-width-percent:0;mso-height-percent:0;mso-width-relative:margin;mso-height-relative:margin;v-text-anchor:top" o:gfxdata="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" filled="f" stroked="f">
+              <v:shape w14:anchorId="2D67F42D" id="_x0000_s1032" type="#_x0000_t202" style="position:absolute;left:0;text-align:left;margin-left:204.05pt;margin-top:.15pt;width:57.3pt;height:16.95pt;z-index:487617024;visibility:visible;mso-wrap-style:square;mso-width-percent:0;mso-height-percent:0;mso-wrap-distance-left:9pt;mso-wrap-distance-top:3.6pt;mso-wrap-distance-right:9pt;mso-wrap-distance-bottom:3.6pt;mso-position-horizontal:absolute;mso-position-horizontal-relative:margin;mso-position-vertical:absolute;mso-position-vertical-relative:text;mso-width-percent:0;mso-height-percent:0;mso-width-relative:margin;mso-height-relative:margin;v-text-anchor:top" o:gfxdata="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" filled="f" stroked="f">
                 <v:textbox>
                   <w:txbxContent>
                     <w:p>
@@ -11586,7 +10687,7 @@
           </mc:Choice>
           <mc:Fallback>
             <w:pict>
-              <v:shape w14:anchorId="700B61C8" id="_x0000_s1033" type="#_x0000_t202" style="position:absolute;left:0;text-align:left;margin-left:372.85pt;margin-top:.3pt;width:57.3pt;height:16.95pt;z-index:487619072;visibility:visible;mso-wrap-style:square;mso-width-percent:0;mso-height-percent:0;mso-wrap-distance-left:9pt;mso-wrap-distance-top:3.6pt;mso-wrap-distance-right:9pt;mso-wrap-distance-bottom:3.6pt;mso-position-horizontal:absolute;mso-position-horizontal-relative:margin;mso-position-vertical:absolute;mso-position-vertical-relative:text;mso-width-percent:0;mso-height-percent:0;mso-width-relative:margin;mso-height-relative:margin;v-text-anchor:top" o:gfxdata="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" filled="f" stroked="f">
+              <v:shape w14:anchorId="700B61C8" id="_x0000_s1033" type="#_x0000_t202" style="position:absolute;left:0;text-align:left;margin-left:372.85pt;margin-top:.3pt;width:57.3pt;height:16.95pt;z-index:487619072;visibility:visible;mso-wrap-style:square;mso-width-percent:0;mso-height-percent:0;mso-wrap-distance-left:9pt;mso-wrap-distance-top:3.6pt;mso-wrap-distance-right:9pt;mso-wrap-distance-bottom:3.6pt;mso-position-horizontal:absolute;mso-position-horizontal-relative:margin;mso-position-vertical:absolute;mso-position-vertical-relative:text;mso-width-percent:0;mso-height-percent:0;mso-width-relative:margin;mso-height-relative:margin;v-text-anchor:top" o:gfxdata="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" filled="f" stroked="f">
                 <v:textbox>
                   <w:txbxContent>
                     <w:p>
@@ -11632,13 +10733,8 @@
         <w:t>, e</w:t>
       </w:r>
       <w:r>
-        <w:t xml:space="preserve">lectricity demand shows clear seasonal variation, with peaks occurring during winter months (June to August), likely due to increased heating usage. Lower demand is observed during milder months such as April and </w:t>
-      </w:r>
-      <w:proofErr w:type="gramStart"/>
-      <w:r>
-        <w:t>October .</w:t>
-      </w:r>
-      <w:proofErr w:type="gramEnd"/>
+        <w:t>lectricity demand shows clear seasonal variation, with peaks occurring during winter months (June to August), likely due to increased heating usage. Lower demand is observed during milder months such as April and October .</w:t>
+      </w:r>
     </w:p>
     <w:p>
       <w:pPr>
@@ -12157,7 +11253,7 @@
           </mc:Choice>
           <mc:Fallback>
             <w:pict>
-              <v:shape w14:anchorId="151C1186" id="_x0000_s1034" type="#_x0000_t202" style="position:absolute;left:0;text-align:left;margin-left:210.95pt;margin-top:9.4pt;width:57.3pt;height:16.95pt;z-index:487623168;visibility:visible;mso-wrap-style:square;mso-width-percent:0;mso-height-percent:0;mso-wrap-distance-left:9pt;mso-wrap-distance-top:3.6pt;mso-wrap-distance-right:9pt;mso-wrap-distance-bottom:3.6pt;mso-position-horizontal:absolute;mso-position-horizontal-relative:margin;mso-position-vertical:absolute;mso-position-vertical-relative:text;mso-width-percent:0;mso-height-percent:0;mso-width-relative:margin;mso-height-relative:margin;v-text-anchor:top" o:gfxdata="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" filled="f" stroked="f">
+              <v:shape w14:anchorId="151C1186" id="_x0000_s1034" type="#_x0000_t202" style="position:absolute;left:0;text-align:left;margin-left:210.95pt;margin-top:9.4pt;width:57.3pt;height:16.95pt;z-index:487623168;visibility:visible;mso-wrap-style:square;mso-width-percent:0;mso-height-percent:0;mso-wrap-distance-left:9pt;mso-wrap-distance-top:3.6pt;mso-wrap-distance-right:9pt;mso-wrap-distance-bottom:3.6pt;mso-position-horizontal:absolute;mso-position-horizontal-relative:margin;mso-position-vertical:absolute;mso-position-vertical-relative:text;mso-width-percent:0;mso-height-percent:0;mso-width-relative:margin;mso-height-relative:margin;v-text-anchor:top" o:gfxdata="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" filled="f" stroked="f">
                 <v:textbox>
                   <w:txbxContent>
                     <w:p>
@@ -12208,7 +11304,7 @@
           <w:noProof/>
         </w:rPr>
         <w:drawing>
-          <wp:anchor distT="0" distB="0" distL="114300" distR="114300" simplePos="0" relativeHeight="487606784" behindDoc="0" locked="0" layoutInCell="1" allowOverlap="1" wp14:anchorId="3E495B9D" wp14:editId="1F9DE6F8">
+          <wp:anchor distT="0" distB="0" distL="114300" distR="114300" simplePos="0" relativeHeight="487606784" behindDoc="0" locked="0" layoutInCell="1" allowOverlap="1" wp14:anchorId="3E495B9D" wp14:editId="1668FB91">
             <wp:simplePos x="0" y="0"/>
             <wp:positionH relativeFrom="column">
               <wp:posOffset>647839</wp:posOffset>
@@ -12443,7 +11539,7 @@
           </mc:Choice>
           <mc:Fallback>
             <w:pict>
-              <v:shape w14:anchorId="159D296B" id="_x0000_s1035" type="#_x0000_t202" style="position:absolute;left:0;text-align:left;margin-left:311.25pt;margin-top:7.6pt;width:57.3pt;height:16.95pt;z-index:487627264;visibility:visible;mso-wrap-style:square;mso-width-percent:0;mso-height-percent:0;mso-wrap-distance-left:9pt;mso-wrap-distance-top:3.6pt;mso-wrap-distance-right:9pt;mso-wrap-distance-bottom:3.6pt;mso-position-horizontal:absolute;mso-position-horizontal-relative:margin;mso-position-vertical:absolute;mso-position-vertical-relative:text;mso-width-percent:0;mso-height-percent:0;mso-width-relative:margin;mso-height-relative:margin;v-text-anchor:top" o:gfxdata="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" filled="f" stroked="f">
+              <v:shape w14:anchorId="159D296B" id="_x0000_s1035" type="#_x0000_t202" style="position:absolute;left:0;text-align:left;margin-left:311.25pt;margin-top:7.6pt;width:57.3pt;height:16.95pt;z-index:487627264;visibility:visible;mso-wrap-style:square;mso-width-percent:0;mso-height-percent:0;mso-wrap-distance-left:9pt;mso-wrap-distance-top:3.6pt;mso-wrap-distance-right:9pt;mso-wrap-distance-bottom:3.6pt;mso-position-horizontal:absolute;mso-position-horizontal-relative:margin;mso-position-vertical:absolute;mso-position-vertical-relative:text;mso-width-percent:0;mso-height-percent:0;mso-width-relative:margin;mso-height-relative:margin;v-text-anchor:top" o:gfxdata="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" filled="f" stroked="f">
                 <v:textbox>
                   <w:txbxContent>
                     <w:p>
@@ -12552,7 +11648,7 @@
           </mc:Choice>
           <mc:Fallback>
             <w:pict>
-              <v:shape w14:anchorId="29EF2A27" id="_x0000_s1036" type="#_x0000_t202" style="position:absolute;left:0;text-align:left;margin-left:130.7pt;margin-top:9.1pt;width:57.3pt;height:16.95pt;z-index:487625216;visibility:visible;mso-wrap-style:square;mso-width-percent:0;mso-height-percent:0;mso-wrap-distance-left:9pt;mso-wrap-distance-top:3.6pt;mso-wrap-distance-right:9pt;mso-wrap-distance-bottom:3.6pt;mso-position-horizontal:absolute;mso-position-horizontal-relative:margin;mso-position-vertical:absolute;mso-position-vertical-relative:text;mso-width-percent:0;mso-height-percent:0;mso-width-relative:margin;mso-height-relative:margin;v-text-anchor:top" o:gfxdata="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" filled="f" stroked="f">
+              <v:shape w14:anchorId="29EF2A27" id="_x0000_s1036" type="#_x0000_t202" style="position:absolute;left:0;text-align:left;margin-left:130.7pt;margin-top:9.1pt;width:57.3pt;height:16.95pt;z-index:487625216;visibility:visible;mso-wrap-style:square;mso-width-percent:0;mso-height-percent:0;mso-wrap-distance-left:9pt;mso-wrap-distance-top:3.6pt;mso-wrap-distance-right:9pt;mso-wrap-distance-bottom:3.6pt;mso-position-horizontal:absolute;mso-position-horizontal-relative:margin;mso-position-vertical:absolute;mso-position-vertical-relative:text;mso-width-percent:0;mso-height-percent:0;mso-width-relative:margin;mso-height-relative:margin;v-text-anchor:top" o:gfxdata="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" filled="f" stroked="f">
                 <v:textbox>
                   <w:txbxContent>
                     <w:p>
@@ -12850,15 +11946,7 @@
         <w:jc w:val="both"/>
       </w:pPr>
       <w:r>
-        <w:t xml:space="preserve">MAE, on the other hand, calculates the average of the absolute differences between predicted and actual values. Unlike RMSE, MAE treats all errors equally, providing a more balanced measure of overall model accuracy without disproportionately </w:t>
-      </w:r>
-      <w:proofErr w:type="spellStart"/>
-      <w:r>
-        <w:t>penalising</w:t>
-      </w:r>
-      <w:proofErr w:type="spellEnd"/>
-      <w:r>
-        <w:t xml:space="preserve"> large deviations. This makes MAE easier to interpret as it represents the average magnitude of forecasting error in the same units as the original data</w:t>
+        <w:t>MAE, on the other hand, calculates the average of the absolute differences between predicted and actual values. Unlike RMSE, MAE treats all errors equally, providing a more balanced measure of overall model accuracy without disproportionately penalising large deviations. This makes MAE easier to interpret as it represents the average magnitude of forecasting error in the same units as the original data</w:t>
       </w:r>
       <w:r>
         <w:t>, making it easier to communicate.</w:t>
@@ -13052,23 +12140,7 @@
           <w:sz w:val="24"/>
           <w:szCs w:val="24"/>
         </w:rPr>
-        <w:t xml:space="preserve">Corresponds to approximately one week ahead. This horizon introduces greater uncertainty as short-term patterns </w:t>
-      </w:r>
-      <w:proofErr w:type="gramStart"/>
-      <w:r>
-        <w:rPr>
-          <w:sz w:val="24"/>
-          <w:szCs w:val="24"/>
-        </w:rPr>
-        <w:t>weaken</w:t>
-      </w:r>
-      <w:proofErr w:type="gramEnd"/>
-      <w:r>
-        <w:rPr>
-          <w:sz w:val="24"/>
-          <w:szCs w:val="24"/>
-        </w:rPr>
-        <w:t xml:space="preserve"> and broader temporal structures (e.g., weekly seasonality) become more important.</w:t>
+        <w:t>Corresponds to approximately one week ahead. This horizon introduces greater uncertainty as short-term patterns weaken and broader temporal structures (e.g., weekly seasonality) become more important.</w:t>
       </w:r>
     </w:p>
     <w:p>
@@ -13187,9 +12259,8 @@
           <w:sz w:val="24"/>
           <w:szCs w:val="24"/>
         </w:rPr>
-        <w:t xml:space="preserve">Seasonal </w:t>
-      </w:r>
-      <w:proofErr w:type="spellStart"/>
+        <w:t>Seasonal AutoRegressive Integrated Moving Average with Exogenous Variables (</w:t>
+      </w:r>
       <w:r>
         <w:rPr>
           <w:b/>
@@ -13197,9 +12268,40 @@
           <w:sz w:val="24"/>
           <w:szCs w:val="24"/>
         </w:rPr>
-        <w:t>AutoRegressive</w:t>
-      </w:r>
-      <w:proofErr w:type="spellEnd"/>
+        <w:t>SARIMAX)</w:t>
+      </w:r>
+      <w:r>
+        <w:rPr>
+          <w:sz w:val="24"/>
+          <w:szCs w:val="24"/>
+        </w:rPr>
+        <w:t>:</w:t>
+      </w:r>
+      <w:r>
+        <w:rPr>
+          <w:sz w:val="24"/>
+          <w:szCs w:val="24"/>
+        </w:rPr>
+        <w:t xml:space="preserve"> </w:t>
+      </w:r>
+      <w:r>
+        <w:rPr>
+          <w:sz w:val="24"/>
+          <w:szCs w:val="24"/>
+        </w:rPr>
+        <w:t>A classical statistical model that captures linear temporal dependencies and seasonality, with temperature included as an external regressor.</w:t>
+      </w:r>
+    </w:p>
+    <w:p>
+      <w:pPr>
+        <w:spacing w:after="240"/>
+        <w:ind w:leftChars="64" w:left="141"/>
+        <w:jc w:val="both"/>
+        <w:rPr>
+          <w:sz w:val="24"/>
+          <w:szCs w:val="24"/>
+        </w:rPr>
+      </w:pPr>
       <w:r>
         <w:rPr>
           <w:b/>
@@ -13207,8 +12309,54 @@
           <w:sz w:val="24"/>
           <w:szCs w:val="24"/>
         </w:rPr>
-        <w:t xml:space="preserve"> Integrated Moving Average with Exogenous Variables (</w:t>
-      </w:r>
+        <w:t>Gradient Boosting (GB)</w:t>
+      </w:r>
+      <w:r>
+        <w:rPr>
+          <w:sz w:val="24"/>
+          <w:szCs w:val="24"/>
+        </w:rPr>
+        <w:t>:</w:t>
+      </w:r>
+      <w:r>
+        <w:rPr>
+          <w:sz w:val="24"/>
+          <w:szCs w:val="24"/>
+        </w:rPr>
+        <w:t xml:space="preserve"> </w:t>
+      </w:r>
+      <w:r>
+        <w:rPr>
+          <w:sz w:val="24"/>
+          <w:szCs w:val="24"/>
+        </w:rPr>
+        <w:t>A tree-based machine learning model capable of capturing nonlinear relationships between features and demand, using engineered lag features and exogenous inputs.</w:t>
+      </w:r>
+      <w:r>
+        <w:rPr>
+          <w:sz w:val="24"/>
+          <w:szCs w:val="24"/>
+        </w:rPr>
+        <w:t xml:space="preserve">  </w:t>
+      </w:r>
+      <w:r>
+        <w:rPr>
+          <w:sz w:val="24"/>
+          <w:szCs w:val="24"/>
+        </w:rPr>
+        <w:t>In this study, lag features such as demand values from previous time steps (e.g., one day and one week prior) were explicitly constructed to provide the model with historical context, enabling it to learn temporal dependencies in the time series despite not being inherently sequential in structure.</w:t>
+      </w:r>
+    </w:p>
+    <w:p>
+      <w:pPr>
+        <w:spacing w:after="240"/>
+        <w:ind w:leftChars="64" w:left="141"/>
+        <w:jc w:val="both"/>
+        <w:rPr>
+          <w:sz w:val="24"/>
+          <w:szCs w:val="24"/>
+        </w:rPr>
+      </w:pPr>
       <w:r>
         <w:rPr>
           <w:b/>
@@ -13216,7 +12364,7 @@
           <w:sz w:val="24"/>
           <w:szCs w:val="24"/>
         </w:rPr>
-        <w:t>SARIMAX)</w:t>
+        <w:t>Long Short-Term Memory (LSTM)</w:t>
       </w:r>
       <w:r>
         <w:rPr>
@@ -13237,7 +12385,21 @@
           <w:sz w:val="24"/>
           <w:szCs w:val="24"/>
         </w:rPr>
-        <w:t>A classical statistical model that captures linear temporal dependencies and seasonality, with temperature included as an external regressor.</w:t>
+        <w:t>A recurrent neural network designed to model sequential data and long-term dependencies, particularly suitable for time series forecasting.</w:t>
+      </w:r>
+      <w:r>
+        <w:rPr>
+          <w:sz w:val="24"/>
+          <w:szCs w:val="24"/>
+        </w:rPr>
+        <w:t xml:space="preserve"> </w:t>
+      </w:r>
+      <w:r>
+        <w:rPr>
+          <w:sz w:val="24"/>
+          <w:szCs w:val="24"/>
+        </w:rPr>
+        <w:t>In this study, three different LSTM configurations were implemented to evaluate the impact of model complexity and input settings on forecasting performance.</w:t>
       </w:r>
     </w:p>
     <w:p>
@@ -13257,7 +12419,7 @@
           <w:sz w:val="24"/>
           <w:szCs w:val="24"/>
         </w:rPr>
-        <w:t>Gradient Boosting (GB)</w:t>
+        <w:t>Transformer-based model (PatchTST)</w:t>
       </w:r>
       <w:r>
         <w:rPr>
@@ -13266,45 +12428,6 @@
         </w:rPr>
         <w:t>:</w:t>
       </w:r>
-      <w:r>
-        <w:rPr>
-          <w:sz w:val="24"/>
-          <w:szCs w:val="24"/>
-        </w:rPr>
-        <w:t xml:space="preserve"> </w:t>
-      </w:r>
-      <w:r>
-        <w:rPr>
-          <w:sz w:val="24"/>
-          <w:szCs w:val="24"/>
-        </w:rPr>
-        <w:t>A tree-based machine learning model capable of capturing nonlinear relationships between features and demand, using engineered lag features and exogenous inputs.</w:t>
-      </w:r>
-      <w:r>
-        <w:rPr>
-          <w:sz w:val="24"/>
-          <w:szCs w:val="24"/>
-        </w:rPr>
-        <w:t xml:space="preserve">  </w:t>
-      </w:r>
-      <w:r>
-        <w:rPr>
-          <w:sz w:val="24"/>
-          <w:szCs w:val="24"/>
-        </w:rPr>
-        <w:t>In this study, lag features such as demand values from previous time steps (e.g., one day and one week prior) were explicitly constructed to provide the model with historical context, enabling it to learn temporal dependencies in the time series despite not being inherently sequential in structure.</w:t>
-      </w:r>
-    </w:p>
-    <w:p>
-      <w:pPr>
-        <w:spacing w:after="240"/>
-        <w:ind w:leftChars="64" w:left="141"/>
-        <w:jc w:val="both"/>
-        <w:rPr>
-          <w:sz w:val="24"/>
-          <w:szCs w:val="24"/>
-        </w:rPr>
-      </w:pPr>
       <w:r>
         <w:rPr>
           <w:b/>
@@ -13312,14 +12435,14 @@
           <w:sz w:val="24"/>
           <w:szCs w:val="24"/>
         </w:rPr>
-        <w:t>Long Short-Term Memory (LSTM)</w:t>
+        <w:t xml:space="preserve"> </w:t>
       </w:r>
       <w:r>
         <w:rPr>
           <w:sz w:val="24"/>
           <w:szCs w:val="24"/>
         </w:rPr>
-        <w:t>:</w:t>
+        <w:t>A state-of-the-art transformer architecture that processes time series in patches, enabling efficient learning of long-range dependencies and complex temporal patterns.</w:t>
       </w:r>
       <w:r>
         <w:rPr>
@@ -13333,114 +12456,7 @@
           <w:sz w:val="24"/>
           <w:szCs w:val="24"/>
         </w:rPr>
-        <w:t>A recurrent neural network designed to model sequential data and long-term dependencies, particularly suitable for time series forecasting.</w:t>
-      </w:r>
-      <w:r>
-        <w:rPr>
-          <w:sz w:val="24"/>
-          <w:szCs w:val="24"/>
-        </w:rPr>
-        <w:t xml:space="preserve"> </w:t>
-      </w:r>
-      <w:r>
-        <w:rPr>
-          <w:sz w:val="24"/>
-          <w:szCs w:val="24"/>
-        </w:rPr>
-        <w:t>In this study, three different LSTM configurations were implemented to evaluate the impact of model complexity and input settings on forecasting performance.</w:t>
-      </w:r>
-    </w:p>
-    <w:p>
-      <w:pPr>
-        <w:spacing w:after="240"/>
-        <w:ind w:leftChars="64" w:left="141"/>
-        <w:jc w:val="both"/>
-        <w:rPr>
-          <w:sz w:val="24"/>
-          <w:szCs w:val="24"/>
-        </w:rPr>
-      </w:pPr>
-      <w:r>
-        <w:rPr>
-          <w:b/>
-          <w:bCs/>
-          <w:sz w:val="24"/>
-          <w:szCs w:val="24"/>
-        </w:rPr>
-        <w:t>Transformer-based model (</w:t>
-      </w:r>
-      <w:proofErr w:type="spellStart"/>
-      <w:r>
-        <w:rPr>
-          <w:b/>
-          <w:bCs/>
-          <w:sz w:val="24"/>
-          <w:szCs w:val="24"/>
-        </w:rPr>
-        <w:t>PatchTST</w:t>
-      </w:r>
-      <w:proofErr w:type="spellEnd"/>
-      <w:r>
-        <w:rPr>
-          <w:b/>
-          <w:bCs/>
-          <w:sz w:val="24"/>
-          <w:szCs w:val="24"/>
-        </w:rPr>
-        <w:t>)</w:t>
-      </w:r>
-      <w:r>
-        <w:rPr>
-          <w:sz w:val="24"/>
-          <w:szCs w:val="24"/>
-        </w:rPr>
-        <w:t>:</w:t>
-      </w:r>
-      <w:r>
-        <w:rPr>
-          <w:b/>
-          <w:bCs/>
-          <w:sz w:val="24"/>
-          <w:szCs w:val="24"/>
-        </w:rPr>
-        <w:t xml:space="preserve"> </w:t>
-      </w:r>
-      <w:r>
-        <w:rPr>
-          <w:sz w:val="24"/>
-          <w:szCs w:val="24"/>
-        </w:rPr>
-        <w:t>A state-of-the-art transformer architecture that processes time series in patches, enabling efficient learning of long-range dependencies and complex temporal patterns.</w:t>
-      </w:r>
-      <w:r>
-        <w:rPr>
-          <w:sz w:val="24"/>
-          <w:szCs w:val="24"/>
-        </w:rPr>
-        <w:t xml:space="preserve"> </w:t>
-      </w:r>
-      <w:r>
-        <w:rPr>
-          <w:sz w:val="24"/>
-          <w:szCs w:val="24"/>
-        </w:rPr>
-        <w:t xml:space="preserve">In this study, two variants of the </w:t>
-      </w:r>
-      <w:proofErr w:type="spellStart"/>
-      <w:r>
-        <w:rPr>
-          <w:sz w:val="24"/>
-          <w:szCs w:val="24"/>
-        </w:rPr>
-        <w:t>PatchTST</w:t>
-      </w:r>
-      <w:proofErr w:type="spellEnd"/>
-      <w:r>
-        <w:rPr>
-          <w:sz w:val="24"/>
-          <w:szCs w:val="24"/>
-        </w:rPr>
-        <w:t xml:space="preserve"> model were implemented—one using only historical demand data and another incorporating temperature as an exogenous feature—to evaluate the impact of external variables on forecasting performance</w:t>
+        <w:t>In this study, two variants of the PatchTST model were implemented—one using only historical demand data and another incorporating temperature as an exogenous feature—to evaluate the impact of external variables on forecasting performance</w:t>
       </w:r>
       <w:r>
         <w:rPr>
@@ -13650,14 +12666,9 @@
       <w:pPr>
         <w:ind w:leftChars="700" w:left="1540"/>
       </w:pPr>
-      <w:proofErr w:type="spellStart"/>
       <w:r>
         <w:lastRenderedPageBreak/>
-        <w:t>PatchTST</w:t>
-      </w:r>
-      <w:proofErr w:type="spellEnd"/>
-      <w:r>
-        <w:t xml:space="preserve"> further improves performance (~472) </w:t>
+        <w:t xml:space="preserve">PatchTST further improves performance (~472) </w:t>
       </w:r>
     </w:p>
     <w:p>
@@ -13756,13 +12767,8 @@
       <w:pPr>
         <w:ind w:leftChars="500" w:left="1100"/>
       </w:pPr>
-      <w:proofErr w:type="spellStart"/>
-      <w:r>
-        <w:t>PatchTST</w:t>
-      </w:r>
-      <w:proofErr w:type="spellEnd"/>
-      <w:r>
-        <w:t xml:space="preserve"> achieves significantly lower error (~660) </w:t>
+      <w:r>
+        <w:t xml:space="preserve">PatchTST achieves significantly lower error (~660) </w:t>
       </w:r>
     </w:p>
     <w:p>
@@ -13873,57 +12879,50 @@
       <w:pPr>
         <w:ind w:leftChars="500" w:left="1100"/>
       </w:pPr>
-      <w:proofErr w:type="spellStart"/>
+      <w:r>
+        <w:t xml:space="preserve">PatchTST achieves the best performance (~737) </w:t>
+      </w:r>
+    </w:p>
+    <w:p>
+      <w:pPr>
+        <w:ind w:leftChars="500" w:left="1100"/>
+      </w:pPr>
+      <w:r>
+        <w:t xml:space="preserve">GB and LSTM performance: [insert results] </w:t>
+      </w:r>
+    </w:p>
+    <w:p>
+      <w:pPr>
+        <w:ind w:leftChars="400" w:left="880"/>
+      </w:pPr>
+      <w:r>
+        <w:t>Summary statement:</w:t>
+      </w:r>
+    </w:p>
+    <w:p>
+      <w:pPr>
+        <w:ind w:leftChars="400" w:left="880" w:firstLine="254"/>
+      </w:pPr>
+      <w:r>
+        <w:t>Transformer-based model shows clear advantage for long-term forecasting</w:t>
+      </w:r>
+    </w:p>
+    <w:p>
+      <w:pPr>
+        <w:ind w:leftChars="400" w:left="880" w:firstLine="254"/>
+      </w:pPr>
+      <w:r>
+        <w:t>GB</w:t>
+      </w:r>
+      <w:r>
+        <w:t xml:space="preserve"> and LSTM show intermediate performance, outperforming SARIMAX but </w:t>
+      </w:r>
+      <w:r>
+        <w:t>&lt;</w:t>
+      </w:r>
       <w:r>
         <w:t>PatchTST</w:t>
       </w:r>
-      <w:proofErr w:type="spellEnd"/>
-      <w:r>
-        <w:t xml:space="preserve"> achieves the best performance (~737) </w:t>
-      </w:r>
-    </w:p>
-    <w:p>
-      <w:pPr>
-        <w:ind w:leftChars="500" w:left="1100"/>
-      </w:pPr>
-      <w:r>
-        <w:t xml:space="preserve">GB and LSTM performance: [insert results] </w:t>
-      </w:r>
-    </w:p>
-    <w:p>
-      <w:pPr>
-        <w:ind w:leftChars="400" w:left="880"/>
-      </w:pPr>
-      <w:r>
-        <w:t>Summary statement:</w:t>
-      </w:r>
-    </w:p>
-    <w:p>
-      <w:pPr>
-        <w:ind w:leftChars="400" w:left="880" w:firstLine="254"/>
-      </w:pPr>
-      <w:r>
-        <w:t>Transformer-based model shows clear advantage for long-term forecasting</w:t>
-      </w:r>
-    </w:p>
-    <w:p>
-      <w:pPr>
-        <w:ind w:leftChars="400" w:left="880" w:firstLine="254"/>
-      </w:pPr>
-      <w:r>
-        <w:t>GB</w:t>
-      </w:r>
-      <w:r>
-        <w:t xml:space="preserve"> and LSTM show intermediate performance, outperforming SARIMAX but </w:t>
-      </w:r>
-      <w:r>
-        <w:t>&lt;</w:t>
-      </w:r>
-      <w:proofErr w:type="spellStart"/>
-      <w:r>
-        <w:t>PatchTST</w:t>
-      </w:r>
-      <w:proofErr w:type="spellEnd"/>
     </w:p>
     <w:p>
       <w:pPr>
@@ -13968,23 +12967,7 @@
           <w:sz w:val="24"/>
           <w:szCs w:val="24"/>
         </w:rPr>
-        <w:t xml:space="preserve">Table 5.6 </w:t>
-      </w:r>
-      <w:proofErr w:type="spellStart"/>
-      <w:r>
-        <w:rPr>
-          <w:sz w:val="24"/>
-          <w:szCs w:val="24"/>
-        </w:rPr>
-        <w:t>summarises</w:t>
-      </w:r>
-      <w:proofErr w:type="spellEnd"/>
-      <w:r>
-        <w:rPr>
-          <w:sz w:val="24"/>
-          <w:szCs w:val="24"/>
-        </w:rPr>
-        <w:t xml:space="preserve"> the performance of all models across different forecasting horizons.</w:t>
+        <w:t>Table 5.6 summarises the performance of all models across different forecasting horizons.</w:t>
       </w:r>
     </w:p>
     <w:tbl>
@@ -14344,11 +13327,9 @@
             <w:vAlign w:val="center"/>
           </w:tcPr>
           <w:p>
-            <w:proofErr w:type="spellStart"/>
             <w:r>
               <w:t>Sarimax</w:t>
             </w:r>
-            <w:proofErr w:type="spellEnd"/>
           </w:p>
         </w:tc>
         <w:tc>
@@ -14946,11 +13927,9 @@
             <w:pPr>
               <w:ind w:rightChars="-18" w:right="-40"/>
             </w:pPr>
-            <w:proofErr w:type="spellStart"/>
             <w:r>
               <w:t>BiLSTM</w:t>
             </w:r>
-            <w:proofErr w:type="spellEnd"/>
           </w:p>
         </w:tc>
         <w:tc>
@@ -15104,11 +14083,9 @@
             <w:vAlign w:val="center"/>
           </w:tcPr>
           <w:p>
-            <w:proofErr w:type="spellStart"/>
             <w:r>
               <w:t>PatchTST</w:t>
             </w:r>
-            <w:proofErr w:type="spellEnd"/>
           </w:p>
           <w:p>
             <w:r>
@@ -15244,12 +14221,10 @@
             <w:vAlign w:val="center"/>
           </w:tcPr>
           <w:p>
-            <w:proofErr w:type="spellStart"/>
             <w:r>
               <w:lastRenderedPageBreak/>
               <w:t>PatchTST</w:t>
             </w:r>
-            <w:proofErr w:type="spellEnd"/>
           </w:p>
           <w:p>
             <w:r>
@@ -15398,39 +14373,7 @@
           <w:sz w:val="20"/>
           <w:szCs w:val="20"/>
         </w:rPr>
-        <w:t xml:space="preserve">Remark (#): </w:t>
-      </w:r>
-      <w:proofErr w:type="spellStart"/>
-      <w:r>
-        <w:rPr>
-          <w:sz w:val="20"/>
-          <w:szCs w:val="20"/>
-        </w:rPr>
-        <w:t>PatchTST</w:t>
-      </w:r>
-      <w:proofErr w:type="spellEnd"/>
-      <w:r>
-        <w:rPr>
-          <w:sz w:val="20"/>
-          <w:szCs w:val="20"/>
-        </w:rPr>
-        <w:t xml:space="preserve"> </w:t>
-      </w:r>
-      <w:proofErr w:type="spellStart"/>
-      <w:r>
-        <w:rPr>
-          <w:sz w:val="20"/>
-          <w:szCs w:val="20"/>
-        </w:rPr>
-        <w:t>utilises</w:t>
-      </w:r>
-      <w:proofErr w:type="spellEnd"/>
-      <w:r>
-        <w:rPr>
-          <w:sz w:val="20"/>
-          <w:szCs w:val="20"/>
-        </w:rPr>
-        <w:t xml:space="preserve"> a context window of raw time series data and learns temporal dependencies through self-attention, eliminating the need for manual feature engineering. In contrast, Gradient Boosting requires explicitly constructed lag features to represent time dependencies, while LSTM combines sequential processing with lagged inputs to capture temporal patterns. SARIMAX does not require explicit lag features, as temporal relationships are modelled internally through autoregressive and seasonal components.</w:t>
+        <w:t>Remark (#): PatchTST utilises a context window of raw time series data and learns temporal dependencies through self-attention, eliminating the need for manual feature engineering. In contrast, Gradient Boosting requires explicitly constructed lag features to represent time dependencies, while LSTM combines sequential processing with lagged inputs to capture temporal patterns. SARIMAX does not require explicit lag features, as temporal relationships are modelled internally through autoregressive and seasonal components.</w:t>
       </w:r>
       <w:r>
         <w:rPr>
@@ -15555,15 +14498,7 @@
         <w:ind w:leftChars="455" w:left="1481"/>
       </w:pPr>
       <w:r>
-        <w:t xml:space="preserve">Does not explicitly </w:t>
-      </w:r>
-      <w:proofErr w:type="spellStart"/>
-      <w:r>
-        <w:t>utilise</w:t>
-      </w:r>
-      <w:proofErr w:type="spellEnd"/>
-      <w:r>
-        <w:t xml:space="preserve"> engineered lag features</w:t>
+        <w:t>Does not explicitly utilise engineered lag features</w:t>
       </w:r>
     </w:p>
     <w:p>
@@ -15610,13 +14545,8 @@
         <w:ind w:leftChars="455" w:left="1481"/>
       </w:pPr>
       <w:r>
-        <w:t xml:space="preserve">SARIMAX cannot effectively model this </w:t>
-      </w:r>
-      <w:proofErr w:type="spellStart"/>
-      <w:r>
-        <w:t>behaviour</w:t>
-      </w:r>
-      <w:proofErr w:type="spellEnd"/>
+        <w:t>SARIMAX cannot effectively model this behaviour</w:t>
+      </w:r>
     </w:p>
     <w:p>
       <w:pPr>
@@ -15655,13 +14585,8 @@
         </w:numPr>
         <w:ind w:leftChars="455" w:left="1481"/>
       </w:pPr>
-      <w:proofErr w:type="spellStart"/>
-      <w:r>
-        <w:t>Utilises</w:t>
-      </w:r>
-      <w:proofErr w:type="spellEnd"/>
-      <w:r>
-        <w:t xml:space="preserve"> lag features and engineered inputs</w:t>
+      <w:r>
+        <w:t>Utilises lag features and engineered inputs</w:t>
       </w:r>
     </w:p>
     <w:p>
@@ -15739,15 +14664,7 @@
       </w:pPr>
       <w:bookmarkStart w:id="57" w:name="_Toc226329756"/>
       <w:r>
-        <w:t xml:space="preserve">Why </w:t>
-      </w:r>
-      <w:proofErr w:type="spellStart"/>
-      <w:r>
-        <w:t>PatchTST</w:t>
-      </w:r>
-      <w:proofErr w:type="spellEnd"/>
-      <w:r>
-        <w:t xml:space="preserve"> Performs Best (Key Section)</w:t>
+        <w:t>Why PatchTST Performs Best (Key Section)</w:t>
       </w:r>
       <w:bookmarkEnd w:id="57"/>
       <w:r>
@@ -15899,13 +14816,8 @@
         </w:numPr>
         <w:ind w:leftChars="455" w:left="1481"/>
       </w:pPr>
-      <w:proofErr w:type="spellStart"/>
-      <w:r>
-        <w:t>PatchTST</w:t>
-      </w:r>
-      <w:proofErr w:type="spellEnd"/>
-      <w:r>
-        <w:t xml:space="preserve"> remains relatively stable</w:t>
+      <w:r>
+        <w:t>PatchTST remains relatively stable</w:t>
       </w:r>
     </w:p>
     <w:p>
@@ -16022,15 +14934,7 @@
         <w:jc w:val="both"/>
       </w:pPr>
       <w:r>
-        <w:t xml:space="preserve">In practice, operational forecasting systems often incorporate a wide range of inputs beyond historical demand and temperature data. These may include weather forecasts, real-time system conditions, grid performance characteristics, and high-frequency demand updates. </w:t>
-      </w:r>
-      <w:proofErr w:type="gramStart"/>
-      <w:r>
-        <w:t>In particular, access</w:t>
-      </w:r>
-      <w:proofErr w:type="gramEnd"/>
-      <w:r>
-        <w:t xml:space="preserve"> to near real-time data enables such systems to capture the most recent changes in demand patterns, which are highly informative for short-term predictions.</w:t>
+        <w:t>In practice, operational forecasting systems often incorporate a wide range of inputs beyond historical demand and temperature data. These may include weather forecasts, real-time system conditions, grid performance characteristics, and high-frequency demand updates. In particular, access to near real-time data enables such systems to capture the most recent changes in demand patterns, which are highly informative for short-term predictions.</w:t>
       </w:r>
     </w:p>
     <w:p>
@@ -16058,15 +14962,7 @@
         <w:jc w:val="both"/>
       </w:pPr>
       <w:r>
-        <w:t xml:space="preserve">Even advanced models such as LSTM and transformer-based architectures are constrained by the information available to them. While these models </w:t>
-      </w:r>
-      <w:proofErr w:type="gramStart"/>
-      <w:r>
-        <w:t>are capable of capturing</w:t>
-      </w:r>
-      <w:proofErr w:type="gramEnd"/>
-      <w:r>
-        <w:t xml:space="preserve"> complex temporal dependencies, their performance remains limited when critical predictive signals—such as real-time system updates or future exogenous variables—are not included</w:t>
+        <w:t>Even advanced models such as LSTM and transformer-based architectures are constrained by the information available to them. While these models are capable of capturing complex temporal dependencies, their performance remains limited when critical predictive signals—such as real-time system updates or future exogenous variables—are not included</w:t>
       </w:r>
     </w:p>
     <w:p>
@@ -16372,21 +15268,12 @@
           <w:szCs w:val="24"/>
         </w:rPr>
       </w:pPr>
-      <w:proofErr w:type="spellStart"/>
       <w:r>
         <w:rPr>
           <w:sz w:val="24"/>
           <w:szCs w:val="24"/>
         </w:rPr>
-        <w:t>PatchTST</w:t>
-      </w:r>
-      <w:proofErr w:type="spellEnd"/>
-      <w:r>
-        <w:rPr>
-          <w:sz w:val="24"/>
-          <w:szCs w:val="24"/>
-        </w:rPr>
-        <w:t xml:space="preserve"> performs best for medium- and long-term forecasting</w:t>
+        <w:t>PatchTST performs best for medium- and long-term forecasting</w:t>
       </w:r>
     </w:p>
     <w:p>
@@ -16659,14 +15546,11 @@
     <w:p>
       <w:pPr>
         <w:pStyle w:val="BodyText"/>
-        <w:numPr>
-          <w:ilvl w:val="0"/>
-          <w:numId w:val="10"/>
-        </w:numPr>
-        <w:spacing w:line="287" w:lineRule="exact"/>
-        <w:ind w:rightChars="388" w:right="854"/>
-        <w:jc w:val="both"/>
-        <w:rPr>
+        <w:spacing w:after="240" w:line="287" w:lineRule="exact"/>
+        <w:ind w:left="528" w:rightChars="388" w:right="854" w:hangingChars="200" w:hanging="528"/>
+        <w:jc w:val="both"/>
+        <w:rPr>
+          <w:rFonts w:ascii="Times New Roman" w:hAnsi="Times New Roman" w:cs="Times New Roman"/>
           <w:w w:val="110"/>
           <w:szCs w:val="22"/>
         </w:rPr>
@@ -16675,605 +15559,984 @@
       <w:bookmarkEnd w:id="70"/>
       <w:r>
         <w:rPr>
+          <w:rFonts w:ascii="Times New Roman" w:hAnsi="Times New Roman" w:cs="Times New Roman"/>
           <w:w w:val="110"/>
           <w:szCs w:val="22"/>
         </w:rPr>
         <w:lastRenderedPageBreak/>
-        <w:t xml:space="preserve">Box, G.E.P., Jenkins, G.M., Reinsel, G.C. and Ljung, G.M. (2015), Time Series Analysis: Forecasting and Control, 5th </w:t>
-      </w:r>
-      <w:proofErr w:type="spellStart"/>
-      <w:r>
-        <w:rPr>
+        <w:t>Box, G.E.P., Jenkins, G.M., Reinsel, G.C. and Ljung, G.M. (2015)</w:t>
+      </w:r>
+      <w:r>
+        <w:rPr>
+          <w:rFonts w:ascii="Times New Roman" w:hAnsi="Times New Roman" w:cs="Times New Roman"/>
           <w:w w:val="110"/>
           <w:szCs w:val="22"/>
         </w:rPr>
-        <w:t>edn</w:t>
-      </w:r>
-      <w:proofErr w:type="spellEnd"/>
-      <w:r>
-        <w:rPr>
+        <w:t xml:space="preserve"> </w:t>
+      </w:r>
+      <w:r>
+        <w:rPr>
+          <w:rFonts w:ascii="Times New Roman" w:hAnsi="Times New Roman" w:cs="Times New Roman"/>
+          <w:i/>
+          <w:iCs/>
           <w:w w:val="110"/>
           <w:szCs w:val="22"/>
         </w:rPr>
-        <w:t>, Wiley.</w:t>
-      </w:r>
-    </w:p>
-    <w:p>
-      <w:pPr>
-        <w:pStyle w:val="BodyText"/>
-        <w:numPr>
-          <w:ilvl w:val="0"/>
-          <w:numId w:val="10"/>
-        </w:numPr>
-        <w:spacing w:line="287" w:lineRule="exact"/>
-        <w:ind w:rightChars="388" w:right="854"/>
-        <w:jc w:val="both"/>
-        <w:rPr>
+        <w:t>Time Series Analysis: Forecasting and Control</w:t>
+      </w:r>
+      <w:r>
+        <w:rPr>
+          <w:rFonts w:ascii="Times New Roman" w:hAnsi="Times New Roman" w:cs="Times New Roman"/>
           <w:w w:val="110"/>
           <w:szCs w:val="22"/>
         </w:rPr>
-      </w:pPr>
-      <w:r>
-        <w:rPr>
+        <w:t>.</w:t>
+      </w:r>
+      <w:r>
+        <w:rPr>
+          <w:rFonts w:ascii="Times New Roman" w:hAnsi="Times New Roman" w:cs="Times New Roman"/>
           <w:w w:val="110"/>
           <w:szCs w:val="22"/>
         </w:rPr>
-        <w:t xml:space="preserve">Chen, T. and </w:t>
-      </w:r>
-      <w:proofErr w:type="spellStart"/>
-      <w:r>
-        <w:rPr>
+        <w:t xml:space="preserve"> 5th edn</w:t>
+      </w:r>
+      <w:r>
+        <w:rPr>
+          <w:rFonts w:ascii="Times New Roman" w:hAnsi="Times New Roman" w:cs="Times New Roman"/>
           <w:w w:val="110"/>
           <w:szCs w:val="22"/>
         </w:rPr>
-        <w:t>Guestrin</w:t>
-      </w:r>
-      <w:proofErr w:type="spellEnd"/>
-      <w:r>
-        <w:rPr>
+        <w:t>.</w:t>
+      </w:r>
+      <w:r>
+        <w:rPr>
+          <w:rFonts w:ascii="Times New Roman" w:hAnsi="Times New Roman" w:cs="Times New Roman"/>
           <w:w w:val="110"/>
           <w:szCs w:val="22"/>
         </w:rPr>
-        <w:t>, C. (2016) ‘</w:t>
-      </w:r>
-      <w:proofErr w:type="spellStart"/>
-      <w:r>
-        <w:rPr>
+        <w:t xml:space="preserve"> Wiley.</w:t>
+      </w:r>
+    </w:p>
+    <w:p>
+      <w:pPr>
+        <w:pStyle w:val="BodyText"/>
+        <w:spacing w:after="240" w:line="287" w:lineRule="exact"/>
+        <w:ind w:left="528" w:rightChars="388" w:right="854" w:hangingChars="200" w:hanging="528"/>
+        <w:jc w:val="both"/>
+        <w:rPr>
+          <w:rFonts w:ascii="Times New Roman" w:hAnsi="Times New Roman" w:cs="Times New Roman"/>
           <w:w w:val="110"/>
           <w:szCs w:val="22"/>
         </w:rPr>
-        <w:t>XGBoost</w:t>
-      </w:r>
-      <w:proofErr w:type="spellEnd"/>
-      <w:r>
-        <w:rPr>
+      </w:pPr>
+      <w:r>
+        <w:rPr>
+          <w:rFonts w:ascii="Times New Roman" w:hAnsi="Times New Roman" w:cs="Times New Roman"/>
           <w:w w:val="110"/>
           <w:szCs w:val="22"/>
         </w:rPr>
-        <w:t>: A scalable tree boosting system’, Proceedings of the 22nd ACM SIGKDD International Conference on Knowledge Discovery and Data Mining, pp. 785–794.</w:t>
-      </w:r>
-    </w:p>
-    <w:p>
-      <w:pPr>
-        <w:pStyle w:val="BodyText"/>
-        <w:numPr>
-          <w:ilvl w:val="0"/>
-          <w:numId w:val="10"/>
-        </w:numPr>
-        <w:spacing w:line="287" w:lineRule="exact"/>
-        <w:ind w:rightChars="388" w:right="854"/>
-        <w:jc w:val="both"/>
-        <w:rPr>
+        <w:t>Chen, T. and Guestrin, C. (2016) ‘XGBoost: A scalable tree boosting system’,</w:t>
+      </w:r>
+      <w:r>
+        <w:rPr>
+          <w:rFonts w:ascii="Times New Roman" w:hAnsi="Times New Roman" w:cs="Times New Roman"/>
+          <w:i/>
+          <w:iCs/>
           <w:w w:val="110"/>
           <w:szCs w:val="22"/>
         </w:rPr>
-      </w:pPr>
-      <w:r>
-        <w:rPr>
+        <w:t xml:space="preserve"> </w:t>
+      </w:r>
+      <w:r>
+        <w:rPr>
+          <w:rFonts w:ascii="Times New Roman" w:hAnsi="Times New Roman" w:cs="Times New Roman"/>
           <w:w w:val="110"/>
           <w:szCs w:val="22"/>
         </w:rPr>
-        <w:t>Fan, S. and Hyndman, R.J. (2012), ‘Short-term load forecasting based on a semi-parametric additive model’, IEEE Transactions on Power Systems, 27(1), pp. 134–141.</w:t>
-      </w:r>
-    </w:p>
-    <w:p>
-      <w:pPr>
-        <w:pStyle w:val="BodyText"/>
-        <w:numPr>
-          <w:ilvl w:val="0"/>
-          <w:numId w:val="10"/>
-        </w:numPr>
-        <w:spacing w:line="287" w:lineRule="exact"/>
-        <w:ind w:rightChars="388" w:right="854"/>
-        <w:jc w:val="both"/>
-        <w:rPr>
+        <w:t>In:</w:t>
+      </w:r>
+      <w:r>
+        <w:rPr>
+          <w:rFonts w:ascii="Times New Roman" w:hAnsi="Times New Roman" w:cs="Times New Roman"/>
+          <w:i/>
+          <w:iCs/>
           <w:w w:val="110"/>
           <w:szCs w:val="22"/>
         </w:rPr>
-      </w:pPr>
-      <w:r>
-        <w:rPr>
+        <w:t xml:space="preserve"> </w:t>
+      </w:r>
+      <w:r>
+        <w:rPr>
+          <w:rFonts w:ascii="Times New Roman" w:hAnsi="Times New Roman" w:cs="Times New Roman"/>
+          <w:i/>
+          <w:iCs/>
           <w:w w:val="110"/>
           <w:szCs w:val="22"/>
         </w:rPr>
-        <w:t>Friedman, J.H. (2001) ‘Greedy function approximation: A gradient boosting machine’, Annals of Statistics, 29(5), pp. 1189–1232.</w:t>
-      </w:r>
-    </w:p>
-    <w:p>
-      <w:pPr>
-        <w:pStyle w:val="BodyText"/>
-        <w:numPr>
-          <w:ilvl w:val="0"/>
-          <w:numId w:val="10"/>
-        </w:numPr>
-        <w:spacing w:line="287" w:lineRule="exact"/>
-        <w:ind w:rightChars="388" w:right="854"/>
-        <w:jc w:val="both"/>
-        <w:rPr>
+        <w:t>Proceedings of the 22nd ACM SIGKDD International Conference on Knowledge Discovery and Data Mining</w:t>
+      </w:r>
+      <w:r>
+        <w:rPr>
+          <w:rFonts w:ascii="Times New Roman" w:hAnsi="Times New Roman" w:cs="Times New Roman"/>
           <w:w w:val="110"/>
           <w:szCs w:val="22"/>
         </w:rPr>
-      </w:pPr>
-      <w:r>
-        <w:rPr>
+        <w:t>, pp. 785–794.</w:t>
+      </w:r>
+    </w:p>
+    <w:p>
+      <w:pPr>
+        <w:pStyle w:val="BodyText"/>
+        <w:spacing w:after="240" w:line="287" w:lineRule="exact"/>
+        <w:ind w:left="528" w:rightChars="388" w:right="854" w:hangingChars="200" w:hanging="528"/>
+        <w:jc w:val="both"/>
+        <w:rPr>
+          <w:rFonts w:ascii="Times New Roman" w:hAnsi="Times New Roman" w:cs="Times New Roman"/>
           <w:w w:val="110"/>
           <w:szCs w:val="22"/>
         </w:rPr>
-        <w:t xml:space="preserve">Hastie, T., </w:t>
-      </w:r>
-      <w:proofErr w:type="spellStart"/>
-      <w:r>
-        <w:rPr>
+      </w:pPr>
+      <w:r>
+        <w:rPr>
+          <w:rFonts w:ascii="Times New Roman" w:hAnsi="Times New Roman" w:cs="Times New Roman"/>
           <w:w w:val="110"/>
           <w:szCs w:val="22"/>
         </w:rPr>
-        <w:t>Tibshirani</w:t>
-      </w:r>
-      <w:proofErr w:type="spellEnd"/>
-      <w:r>
-        <w:rPr>
+        <w:t>Fan, S. and Hyndman, R.J. (2012) ‘Short-term load forecasting based on a semi-parametric additive model’</w:t>
+      </w:r>
+      <w:r>
+        <w:rPr>
+          <w:rFonts w:ascii="Times New Roman" w:hAnsi="Times New Roman" w:cs="Times New Roman"/>
+          <w:i/>
+          <w:iCs/>
           <w:w w:val="110"/>
           <w:szCs w:val="22"/>
         </w:rPr>
-        <w:t xml:space="preserve">, R. and Friedman, J. (2009) The Elements of Statistical Learning. 2nd </w:t>
-      </w:r>
-      <w:proofErr w:type="spellStart"/>
-      <w:r>
-        <w:rPr>
+        <w:t>,</w:t>
+      </w:r>
+      <w:r>
+        <w:rPr>
+          <w:rFonts w:ascii="Times New Roman" w:hAnsi="Times New Roman" w:cs="Times New Roman"/>
+          <w:i/>
+          <w:iCs/>
           <w:w w:val="110"/>
           <w:szCs w:val="22"/>
         </w:rPr>
-        <w:t>edn</w:t>
-      </w:r>
-      <w:proofErr w:type="spellEnd"/>
-      <w:r>
-        <w:rPr>
+        <w:t xml:space="preserve"> </w:t>
+      </w:r>
+      <w:r>
+        <w:rPr>
+          <w:rFonts w:ascii="Times New Roman" w:hAnsi="Times New Roman" w:cs="Times New Roman"/>
+          <w:i/>
+          <w:iCs/>
           <w:w w:val="110"/>
           <w:szCs w:val="22"/>
         </w:rPr>
-        <w:t>. New York: Springer.</w:t>
-      </w:r>
-    </w:p>
-    <w:p>
-      <w:pPr>
-        <w:pStyle w:val="BodyText"/>
-        <w:numPr>
-          <w:ilvl w:val="0"/>
-          <w:numId w:val="10"/>
-        </w:numPr>
-        <w:spacing w:line="287" w:lineRule="exact"/>
-        <w:ind w:rightChars="388" w:right="854"/>
-        <w:jc w:val="both"/>
-        <w:rPr>
+        <w:t xml:space="preserve">IEEE Transactions on Power Systems, </w:t>
+      </w:r>
+      <w:r>
+        <w:rPr>
+          <w:rFonts w:ascii="Times New Roman" w:hAnsi="Times New Roman" w:cs="Times New Roman"/>
           <w:w w:val="110"/>
           <w:szCs w:val="22"/>
         </w:rPr>
-      </w:pPr>
-      <w:r>
-        <w:rPr>
+        <w:t>27(1), pp. 134–141.</w:t>
+      </w:r>
+    </w:p>
+    <w:p>
+      <w:pPr>
+        <w:pStyle w:val="BodyText"/>
+        <w:spacing w:after="240" w:line="287" w:lineRule="exact"/>
+        <w:ind w:left="528" w:rightChars="388" w:right="854" w:hangingChars="200" w:hanging="528"/>
+        <w:jc w:val="both"/>
+        <w:rPr>
+          <w:rFonts w:ascii="Times New Roman" w:hAnsi="Times New Roman" w:cs="Times New Roman"/>
           <w:w w:val="110"/>
           <w:szCs w:val="22"/>
         </w:rPr>
-        <w:t>Hippert, H.S., Pedreira, C.E. and Souza, R.C. (2001), ‘Neural networks for short-term load forecasting: A review and evaluation’, IEEE Transactions on Power Systems, 16(1), pp. 44–55.</w:t>
-      </w:r>
-    </w:p>
-    <w:p>
-      <w:pPr>
-        <w:pStyle w:val="BodyText"/>
-        <w:numPr>
-          <w:ilvl w:val="0"/>
-          <w:numId w:val="10"/>
-        </w:numPr>
-        <w:spacing w:line="287" w:lineRule="exact"/>
-        <w:ind w:rightChars="388" w:right="854"/>
-        <w:jc w:val="both"/>
-        <w:rPr>
+      </w:pPr>
+      <w:r>
+        <w:rPr>
+          <w:rFonts w:ascii="Times New Roman" w:hAnsi="Times New Roman" w:cs="Times New Roman"/>
           <w:w w:val="110"/>
           <w:szCs w:val="22"/>
         </w:rPr>
-      </w:pPr>
-      <w:r>
-        <w:rPr>
+        <w:t xml:space="preserve">Friedman, J.H. (2001) </w:t>
+      </w:r>
+      <w:r>
+        <w:rPr>
+          <w:rFonts w:ascii="Times New Roman" w:hAnsi="Times New Roman" w:cs="Times New Roman"/>
+          <w:i/>
+          <w:iCs/>
           <w:w w:val="110"/>
           <w:szCs w:val="22"/>
         </w:rPr>
-        <w:t xml:space="preserve">Hochreiter, S. and </w:t>
-      </w:r>
-      <w:proofErr w:type="spellStart"/>
-      <w:r>
-        <w:rPr>
+        <w:t>‘Greedy function approximation: A gradient boosting machine’, Annals of Statistics, 29(5)</w:t>
+      </w:r>
+      <w:r>
+        <w:rPr>
+          <w:rFonts w:ascii="Times New Roman" w:hAnsi="Times New Roman" w:cs="Times New Roman"/>
           <w:w w:val="110"/>
           <w:szCs w:val="22"/>
         </w:rPr>
-        <w:t>Schmidhuber</w:t>
-      </w:r>
-      <w:proofErr w:type="spellEnd"/>
-      <w:r>
-        <w:rPr>
+        <w:t>, pp. 1189–1232.</w:t>
+      </w:r>
+    </w:p>
+    <w:p>
+      <w:pPr>
+        <w:pStyle w:val="BodyText"/>
+        <w:spacing w:after="240" w:line="287" w:lineRule="exact"/>
+        <w:ind w:left="528" w:rightChars="388" w:right="854" w:hangingChars="200" w:hanging="528"/>
+        <w:jc w:val="both"/>
+        <w:rPr>
+          <w:rFonts w:ascii="Times New Roman" w:hAnsi="Times New Roman" w:cs="Times New Roman"/>
           <w:w w:val="110"/>
           <w:szCs w:val="22"/>
         </w:rPr>
-        <w:t>, J. (1997), ‘Long short-term memory’, Neural Computation, 9(8), pp. 1735–1780.</w:t>
-      </w:r>
-    </w:p>
-    <w:p>
-      <w:pPr>
-        <w:pStyle w:val="BodyText"/>
-        <w:numPr>
-          <w:ilvl w:val="0"/>
-          <w:numId w:val="10"/>
-        </w:numPr>
-        <w:spacing w:line="287" w:lineRule="exact"/>
-        <w:ind w:rightChars="388" w:right="854"/>
-        <w:jc w:val="both"/>
-        <w:rPr>
+      </w:pPr>
+      <w:r>
+        <w:rPr>
+          <w:rFonts w:ascii="Times New Roman" w:hAnsi="Times New Roman" w:cs="Times New Roman"/>
           <w:w w:val="110"/>
           <w:szCs w:val="22"/>
         </w:rPr>
-      </w:pPr>
-      <w:r>
-        <w:rPr>
+        <w:t xml:space="preserve">Hastie, T., Tibshirani, R. and Friedman, J. (2009) </w:t>
+      </w:r>
+      <w:r>
+        <w:rPr>
+          <w:rFonts w:ascii="Times New Roman" w:hAnsi="Times New Roman" w:cs="Times New Roman"/>
+          <w:i/>
+          <w:iCs/>
           <w:w w:val="110"/>
           <w:szCs w:val="22"/>
         </w:rPr>
-        <w:t>Ke, G. et al. (2017) ‘</w:t>
-      </w:r>
-      <w:proofErr w:type="spellStart"/>
-      <w:r>
-        <w:rPr>
+        <w:t>The Elements of Statistical Learning. Springer</w:t>
+      </w:r>
+      <w:r>
+        <w:rPr>
+          <w:rFonts w:ascii="Times New Roman" w:hAnsi="Times New Roman" w:cs="Times New Roman"/>
           <w:w w:val="110"/>
           <w:szCs w:val="22"/>
         </w:rPr>
-        <w:t>LightGBM</w:t>
-      </w:r>
-      <w:proofErr w:type="spellEnd"/>
-      <w:r>
-        <w:rPr>
+        <w:t>.</w:t>
+      </w:r>
+    </w:p>
+    <w:p>
+      <w:pPr>
+        <w:pStyle w:val="BodyText"/>
+        <w:spacing w:after="240" w:line="287" w:lineRule="exact"/>
+        <w:ind w:left="528" w:rightChars="388" w:right="854" w:hangingChars="200" w:hanging="528"/>
+        <w:jc w:val="both"/>
+        <w:rPr>
+          <w:rFonts w:ascii="Times New Roman" w:hAnsi="Times New Roman" w:cs="Times New Roman"/>
           <w:w w:val="110"/>
           <w:szCs w:val="22"/>
         </w:rPr>
-        <w:t>: A highly efficient gradient boosting decision tree’, Advances in Neural Information Processing Systems, 30.</w:t>
-      </w:r>
-    </w:p>
-    <w:p>
-      <w:pPr>
-        <w:pStyle w:val="BodyText"/>
-        <w:numPr>
-          <w:ilvl w:val="0"/>
-          <w:numId w:val="10"/>
-        </w:numPr>
-        <w:spacing w:line="287" w:lineRule="exact"/>
-        <w:ind w:rightChars="388" w:right="854"/>
-        <w:jc w:val="both"/>
-        <w:rPr>
+      </w:pPr>
+      <w:r>
+        <w:rPr>
+          <w:rFonts w:ascii="Times New Roman" w:hAnsi="Times New Roman" w:cs="Times New Roman"/>
           <w:w w:val="110"/>
           <w:szCs w:val="22"/>
         </w:rPr>
-      </w:pPr>
-      <w:r>
-        <w:rPr>
+        <w:t>Hippert, H.S., Pedreira, C.E. and Souza, R.C. (2001) ‘Neural networks for short-term load forecasting: A review and evaluation’,</w:t>
+      </w:r>
+      <w:r>
+        <w:rPr>
+          <w:rFonts w:ascii="Times New Roman" w:hAnsi="Times New Roman" w:cs="Times New Roman"/>
+          <w:i/>
+          <w:iCs/>
           <w:w w:val="110"/>
           <w:szCs w:val="22"/>
         </w:rPr>
-        <w:t>Kong, W. et al. (2017), ‘Short-term residential load forecasting based on LSTM’, IEEE Transactions on Smart Grid, 10(1), pp. 841–851.</w:t>
-      </w:r>
-    </w:p>
-    <w:p>
-      <w:pPr>
-        <w:pStyle w:val="BodyText"/>
-        <w:numPr>
-          <w:ilvl w:val="0"/>
-          <w:numId w:val="10"/>
-        </w:numPr>
-        <w:spacing w:line="287" w:lineRule="exact"/>
-        <w:ind w:rightChars="388" w:right="854"/>
-        <w:jc w:val="both"/>
-        <w:rPr>
+        <w:t xml:space="preserve"> </w:t>
+      </w:r>
+      <w:r>
+        <w:rPr>
+          <w:rFonts w:ascii="Times New Roman" w:hAnsi="Times New Roman" w:cs="Times New Roman"/>
           <w:w w:val="110"/>
           <w:szCs w:val="22"/>
         </w:rPr>
-      </w:pPr>
-      <w:r>
-        <w:rPr>
+        <w:t>In:</w:t>
+      </w:r>
+      <w:r>
+        <w:rPr>
+          <w:rFonts w:ascii="Times New Roman" w:hAnsi="Times New Roman" w:cs="Times New Roman"/>
           <w:w w:val="110"/>
           <w:szCs w:val="22"/>
         </w:rPr>
-        <w:t>Li, H., Shao, J., Liao, K. and Tang, M. (2022), ‘Do simpler statistical methods perform better in multivariate long sequence time-series forecasting?’, Proceedings of the 31st ACM International Conference on Information and Knowledge Management (CIKM), pp. 4168–4172.</w:t>
-      </w:r>
-    </w:p>
-    <w:p>
-      <w:pPr>
-        <w:pStyle w:val="BodyText"/>
-        <w:numPr>
-          <w:ilvl w:val="0"/>
-          <w:numId w:val="10"/>
-        </w:numPr>
-        <w:spacing w:line="287" w:lineRule="exact"/>
-        <w:ind w:rightChars="388" w:right="854"/>
-        <w:jc w:val="both"/>
-        <w:rPr>
+        <w:t xml:space="preserve"> </w:t>
+      </w:r>
+      <w:r>
+        <w:rPr>
+          <w:rFonts w:ascii="Times New Roman" w:hAnsi="Times New Roman" w:cs="Times New Roman"/>
+          <w:i/>
+          <w:iCs/>
           <w:w w:val="110"/>
           <w:szCs w:val="22"/>
         </w:rPr>
-      </w:pPr>
-      <w:proofErr w:type="spellStart"/>
-      <w:r>
-        <w:rPr>
+        <w:t>IEEE Transactions on Power Systems</w:t>
+      </w:r>
+      <w:r>
+        <w:rPr>
+          <w:rFonts w:ascii="Times New Roman" w:hAnsi="Times New Roman" w:cs="Times New Roman"/>
           <w:w w:val="110"/>
           <w:szCs w:val="22"/>
         </w:rPr>
-        <w:t>Makridakis</w:t>
-      </w:r>
-      <w:proofErr w:type="spellEnd"/>
-      <w:r>
-        <w:rPr>
+        <w:t>, 16(1), pp. 44–55.</w:t>
+      </w:r>
+    </w:p>
+    <w:p>
+      <w:pPr>
+        <w:pStyle w:val="BodyText"/>
+        <w:spacing w:after="240" w:line="287" w:lineRule="exact"/>
+        <w:ind w:left="528" w:rightChars="388" w:right="854" w:hangingChars="200" w:hanging="528"/>
+        <w:jc w:val="both"/>
+        <w:rPr>
+          <w:rFonts w:ascii="Times New Roman" w:hAnsi="Times New Roman" w:cs="Times New Roman"/>
           <w:w w:val="110"/>
           <w:szCs w:val="22"/>
         </w:rPr>
-        <w:t xml:space="preserve">, S., Spiliotis, E. and </w:t>
-      </w:r>
-      <w:proofErr w:type="spellStart"/>
-      <w:r>
-        <w:rPr>
+      </w:pPr>
+      <w:r>
+        <w:rPr>
+          <w:rFonts w:ascii="Times New Roman" w:hAnsi="Times New Roman" w:cs="Times New Roman"/>
           <w:w w:val="110"/>
           <w:szCs w:val="22"/>
         </w:rPr>
-        <w:t>Assimakopoulos</w:t>
-      </w:r>
-      <w:proofErr w:type="spellEnd"/>
-      <w:r>
-        <w:rPr>
+        <w:t xml:space="preserve">Hochreiter, S. and Schmidhuber, J. (1997) </w:t>
+      </w:r>
+      <w:r>
+        <w:rPr>
+          <w:rFonts w:ascii="Times New Roman" w:hAnsi="Times New Roman" w:cs="Times New Roman"/>
+          <w:i/>
+          <w:iCs/>
           <w:w w:val="110"/>
           <w:szCs w:val="22"/>
         </w:rPr>
-        <w:t>, V. (2018) ‘The M4 Competition: Results, findings, conclusion and way forward’, International Journal of Forecasting, 34(4), pp. 802–808.</w:t>
-      </w:r>
-    </w:p>
-    <w:p>
-      <w:pPr>
-        <w:pStyle w:val="BodyText"/>
-        <w:numPr>
-          <w:ilvl w:val="0"/>
-          <w:numId w:val="10"/>
-        </w:numPr>
-        <w:spacing w:line="287" w:lineRule="exact"/>
-        <w:ind w:rightChars="388" w:right="854"/>
-        <w:jc w:val="both"/>
-        <w:rPr>
+        <w:t>‘Long short-term memory’</w:t>
+      </w:r>
+      <w:r>
+        <w:rPr>
+          <w:rFonts w:ascii="Times New Roman" w:hAnsi="Times New Roman" w:cs="Times New Roman"/>
           <w:w w:val="110"/>
           <w:szCs w:val="22"/>
         </w:rPr>
-      </w:pPr>
-      <w:r>
-        <w:rPr>
+        <w:t xml:space="preserve">, </w:t>
+      </w:r>
+      <w:r>
+        <w:rPr>
+          <w:rFonts w:ascii="Times New Roman" w:hAnsi="Times New Roman" w:cs="Times New Roman"/>
+          <w:i/>
+          <w:iCs/>
           <w:w w:val="110"/>
           <w:szCs w:val="22"/>
         </w:rPr>
-        <w:t>Marino, D.L., Amarasinghe, K. and Manic, M. (2016), ‘Building energy load forecasting using deep neural networks’, Proceedings of the IEEE Industrial Electronics Conference (IECON), pp. 7046–7051.</w:t>
-      </w:r>
-    </w:p>
-    <w:p>
-      <w:pPr>
-        <w:pStyle w:val="BodyText"/>
-        <w:numPr>
-          <w:ilvl w:val="0"/>
-          <w:numId w:val="10"/>
-        </w:numPr>
-        <w:spacing w:line="287" w:lineRule="exact"/>
-        <w:ind w:rightChars="388" w:right="854"/>
-        <w:jc w:val="both"/>
-        <w:rPr>
+        <w:t>Neural Computation</w:t>
+      </w:r>
+      <w:r>
+        <w:rPr>
+          <w:rFonts w:ascii="Times New Roman" w:hAnsi="Times New Roman" w:cs="Times New Roman"/>
           <w:w w:val="110"/>
           <w:szCs w:val="22"/>
         </w:rPr>
-      </w:pPr>
-      <w:r>
-        <w:rPr>
+        <w:t>, 9(8), pp. 1735–1780.</w:t>
+      </w:r>
+    </w:p>
+    <w:p>
+      <w:pPr>
+        <w:pStyle w:val="BodyText"/>
+        <w:spacing w:after="240" w:line="287" w:lineRule="exact"/>
+        <w:ind w:left="528" w:rightChars="388" w:right="854" w:hangingChars="200" w:hanging="528"/>
+        <w:jc w:val="both"/>
+        <w:rPr>
+          <w:rFonts w:ascii="Times New Roman" w:hAnsi="Times New Roman" w:cs="Times New Roman"/>
           <w:w w:val="110"/>
           <w:szCs w:val="22"/>
         </w:rPr>
-        <w:t>Nie, Y. et al. (2023), ‘A time series is worth 64 words: Long-term forecasting with transformers’, Proceedings of the International Conference on Learning Representations (ICLR).</w:t>
-      </w:r>
-    </w:p>
-    <w:p>
-      <w:pPr>
-        <w:pStyle w:val="BodyText"/>
-        <w:numPr>
-          <w:ilvl w:val="0"/>
-          <w:numId w:val="10"/>
-        </w:numPr>
-        <w:spacing w:line="287" w:lineRule="exact"/>
-        <w:ind w:rightChars="388" w:right="854"/>
-        <w:jc w:val="both"/>
-        <w:rPr>
+      </w:pPr>
+      <w:r>
+        <w:rPr>
+          <w:rFonts w:ascii="Times New Roman" w:hAnsi="Times New Roman" w:cs="Times New Roman"/>
           <w:w w:val="110"/>
           <w:szCs w:val="22"/>
         </w:rPr>
-      </w:pPr>
-      <w:proofErr w:type="spellStart"/>
-      <w:r>
-        <w:rPr>
+        <w:t>Ke, G. et al. (2017) ‘LightGBM: A highly efficient gradient boosting decision tree’</w:t>
+      </w:r>
+      <w:r>
+        <w:rPr>
+          <w:rFonts w:ascii="Times New Roman" w:hAnsi="Times New Roman" w:cs="Times New Roman"/>
+          <w:i/>
+          <w:iCs/>
           <w:w w:val="110"/>
           <w:szCs w:val="22"/>
         </w:rPr>
-        <w:t>Pełka</w:t>
-      </w:r>
-      <w:proofErr w:type="spellEnd"/>
-      <w:r>
-        <w:rPr>
+        <w:t>, Advances in Neural Information Processing Systems</w:t>
+      </w:r>
+      <w:r>
+        <w:rPr>
+          <w:rFonts w:ascii="Times New Roman" w:hAnsi="Times New Roman" w:cs="Times New Roman"/>
           <w:w w:val="110"/>
           <w:szCs w:val="22"/>
         </w:rPr>
-        <w:t xml:space="preserve">, P. and Dudek, G. (2020), ‘Pattern-based LSTM for mid-term electrical load forecasting’, </w:t>
-      </w:r>
-      <w:proofErr w:type="spellStart"/>
-      <w:r>
-        <w:rPr>
+        <w:t>, 30.</w:t>
+      </w:r>
+    </w:p>
+    <w:p>
+      <w:pPr>
+        <w:pStyle w:val="BodyText"/>
+        <w:spacing w:after="240" w:line="287" w:lineRule="exact"/>
+        <w:ind w:left="528" w:rightChars="388" w:right="854" w:hangingChars="200" w:hanging="528"/>
+        <w:jc w:val="both"/>
+        <w:rPr>
+          <w:rFonts w:ascii="Times New Roman" w:hAnsi="Times New Roman" w:cs="Times New Roman"/>
           <w:w w:val="110"/>
           <w:szCs w:val="22"/>
         </w:rPr>
-        <w:t>arXiv</w:t>
-      </w:r>
-      <w:proofErr w:type="spellEnd"/>
-      <w:r>
-        <w:rPr>
+      </w:pPr>
+      <w:r>
+        <w:rPr>
+          <w:rFonts w:ascii="Times New Roman" w:hAnsi="Times New Roman" w:cs="Times New Roman"/>
           <w:w w:val="110"/>
           <w:szCs w:val="22"/>
         </w:rPr>
-        <w:t xml:space="preserve"> [online]. Available at: https://arxiv.org/abs/2004.11834 (Accessed: 23 March 2026).</w:t>
-      </w:r>
-    </w:p>
-    <w:p>
-      <w:pPr>
-        <w:pStyle w:val="BodyText"/>
-        <w:numPr>
-          <w:ilvl w:val="0"/>
-          <w:numId w:val="10"/>
-        </w:numPr>
-        <w:spacing w:line="287" w:lineRule="exact"/>
-        <w:ind w:rightChars="388" w:right="854"/>
-        <w:jc w:val="both"/>
-      </w:pPr>
-      <w:r>
-        <w:rPr>
+        <w:t>Kong, W. et al. (2017) ‘Short-term residential load forecasting based on LSTM’,</w:t>
+      </w:r>
+      <w:r>
+        <w:rPr>
+          <w:rFonts w:ascii="Times New Roman" w:hAnsi="Times New Roman" w:cs="Times New Roman"/>
           <w:w w:val="110"/>
           <w:szCs w:val="22"/>
         </w:rPr>
-        <w:t>Taieb, S.B. and Hyndman, R.J. (2014) ‘A gradient boosting approach to the Kaggle load forecasting competition’, International Journal of Forecasting, 30(2), pp. 382–394</w:t>
-      </w:r>
-      <w:r>
-        <w:t>.</w:t>
-      </w:r>
-    </w:p>
-    <w:p>
-      <w:pPr>
-        <w:pStyle w:val="BodyText"/>
-        <w:numPr>
-          <w:ilvl w:val="0"/>
-          <w:numId w:val="10"/>
-        </w:numPr>
-        <w:spacing w:line="287" w:lineRule="exact"/>
-        <w:ind w:rightChars="388" w:right="854"/>
-        <w:jc w:val="both"/>
-        <w:rPr>
+        <w:t xml:space="preserve"> </w:t>
+      </w:r>
+      <w:r>
+        <w:rPr>
+          <w:rFonts w:ascii="Times New Roman" w:hAnsi="Times New Roman" w:cs="Times New Roman"/>
           <w:w w:val="110"/>
           <w:szCs w:val="22"/>
         </w:rPr>
-      </w:pPr>
-      <w:r>
-        <w:rPr>
+        <w:t>In:</w:t>
+      </w:r>
+      <w:r>
+        <w:rPr>
+          <w:rFonts w:ascii="Times New Roman" w:hAnsi="Times New Roman" w:cs="Times New Roman"/>
+          <w:i/>
+          <w:iCs/>
           <w:w w:val="110"/>
           <w:szCs w:val="22"/>
         </w:rPr>
-        <w:t xml:space="preserve">Taylor, J.W. (2003), ‘Short-term electricity demand forecasting using double </w:t>
-      </w:r>
-      <w:r>
-        <w:rPr>
+        <w:t xml:space="preserve"> </w:t>
+      </w:r>
+      <w:r>
+        <w:rPr>
+          <w:rFonts w:ascii="Times New Roman" w:hAnsi="Times New Roman" w:cs="Times New Roman"/>
+          <w:i/>
+          <w:iCs/>
           <w:w w:val="110"/>
           <w:szCs w:val="22"/>
         </w:rPr>
-        <w:lastRenderedPageBreak/>
-        <w:t>seasonal exponential smoothing’, Journal of the Operational Research Society, 54(8), pp. 799–805.</w:t>
-      </w:r>
-    </w:p>
-    <w:p>
-      <w:pPr>
-        <w:pStyle w:val="BodyText"/>
-        <w:numPr>
-          <w:ilvl w:val="0"/>
-          <w:numId w:val="10"/>
-        </w:numPr>
-        <w:spacing w:line="287" w:lineRule="exact"/>
-        <w:ind w:rightChars="388" w:right="854"/>
-        <w:jc w:val="both"/>
-        <w:rPr>
+        <w:t xml:space="preserve"> IEEE Transactions on Smart Grid</w:t>
+      </w:r>
+      <w:r>
+        <w:rPr>
+          <w:rFonts w:ascii="Times New Roman" w:hAnsi="Times New Roman" w:cs="Times New Roman"/>
           <w:w w:val="110"/>
           <w:szCs w:val="22"/>
         </w:rPr>
-      </w:pPr>
-      <w:r>
-        <w:rPr>
+        <w:t>, 10(1), pp. 841–851.</w:t>
+      </w:r>
+    </w:p>
+    <w:p>
+      <w:pPr>
+        <w:pStyle w:val="BodyText"/>
+        <w:spacing w:after="240" w:line="287" w:lineRule="exact"/>
+        <w:ind w:left="528" w:rightChars="388" w:right="854" w:hangingChars="200" w:hanging="528"/>
+        <w:jc w:val="both"/>
+        <w:rPr>
+          <w:rFonts w:ascii="Times New Roman" w:hAnsi="Times New Roman" w:cs="Times New Roman"/>
           <w:w w:val="110"/>
           <w:szCs w:val="22"/>
         </w:rPr>
-        <w:t>Vaswani, A. et al. (2017), ‘Attention is all you need’, Advances in Neural Information Processing Systems (</w:t>
-      </w:r>
-      <w:proofErr w:type="spellStart"/>
-      <w:r>
-        <w:rPr>
+      </w:pPr>
+      <w:r>
+        <w:rPr>
+          <w:rFonts w:ascii="Times New Roman" w:hAnsi="Times New Roman" w:cs="Times New Roman"/>
           <w:w w:val="110"/>
           <w:szCs w:val="22"/>
         </w:rPr>
-        <w:t>NeurIPS</w:t>
-      </w:r>
-      <w:proofErr w:type="spellEnd"/>
-      <w:r>
-        <w:rPr>
+        <w:t xml:space="preserve">Li, H., Shao, J., Liao, K. and Tang, M. (2022) ‘Do simpler statistical methods perform better in multivariate long sequence time-series forecasting?’, </w:t>
+      </w:r>
+      <w:r>
+        <w:rPr>
+          <w:rFonts w:ascii="Times New Roman" w:hAnsi="Times New Roman" w:cs="Times New Roman"/>
           <w:w w:val="110"/>
           <w:szCs w:val="22"/>
         </w:rPr>
-        <w:t>), 30, pp. 5998–6008.</w:t>
-      </w:r>
-    </w:p>
-    <w:p>
-      <w:pPr>
-        <w:pStyle w:val="BodyText"/>
-        <w:numPr>
-          <w:ilvl w:val="0"/>
-          <w:numId w:val="10"/>
-        </w:numPr>
-        <w:spacing w:line="287" w:lineRule="exact"/>
-        <w:ind w:rightChars="388" w:right="854"/>
-        <w:jc w:val="both"/>
-      </w:pPr>
-      <w:r>
-        <w:rPr>
+        <w:t>In:</w:t>
+      </w:r>
+      <w:r>
+        <w:rPr>
+          <w:rFonts w:ascii="Times New Roman" w:hAnsi="Times New Roman" w:cs="Times New Roman"/>
+          <w:i/>
+          <w:iCs/>
           <w:w w:val="110"/>
           <w:szCs w:val="22"/>
         </w:rPr>
-        <w:t xml:space="preserve">Zeng, A. et al. (2022), ‘Are transformers effective for time series forecasting?’, </w:t>
-      </w:r>
-      <w:proofErr w:type="spellStart"/>
-      <w:r>
-        <w:rPr>
+        <w:t xml:space="preserve"> </w:t>
+      </w:r>
+      <w:r>
+        <w:rPr>
+          <w:rFonts w:ascii="Times New Roman" w:hAnsi="Times New Roman" w:cs="Times New Roman"/>
+          <w:i/>
+          <w:iCs/>
           <w:w w:val="110"/>
           <w:szCs w:val="22"/>
         </w:rPr>
-        <w:t>arXiv</w:t>
-      </w:r>
-      <w:proofErr w:type="spellEnd"/>
-      <w:r>
-        <w:rPr>
+        <w:t>Proceedings of the 31st ACM International Conference on Information and Knowledge Management (CIKM)</w:t>
+      </w:r>
+      <w:r>
+        <w:rPr>
+          <w:rFonts w:ascii="Times New Roman" w:hAnsi="Times New Roman" w:cs="Times New Roman"/>
           <w:w w:val="110"/>
           <w:szCs w:val="22"/>
         </w:rPr>
-        <w:t xml:space="preserve"> [online]. Available at: https://arxiv.org/abs/2205.13504 (Accessed: 23 March 2026).</w:t>
-      </w:r>
-    </w:p>
-    <w:p>
-      <w:pPr>
-        <w:pStyle w:val="BodyText"/>
-        <w:spacing w:line="287" w:lineRule="exact"/>
+        <w:t>, pp. 4168–4172.</w:t>
+      </w:r>
+    </w:p>
+    <w:p>
+      <w:pPr>
+        <w:pStyle w:val="BodyText"/>
+        <w:spacing w:after="240" w:line="287" w:lineRule="exact"/>
+        <w:ind w:left="528" w:rightChars="388" w:right="854" w:hangingChars="200" w:hanging="528"/>
+        <w:jc w:val="both"/>
+        <w:rPr>
+          <w:rFonts w:ascii="Times New Roman" w:hAnsi="Times New Roman" w:cs="Times New Roman"/>
+          <w:w w:val="110"/>
+          <w:szCs w:val="22"/>
+        </w:rPr>
+      </w:pPr>
+      <w:r>
+        <w:rPr>
+          <w:rFonts w:ascii="Times New Roman" w:hAnsi="Times New Roman" w:cs="Times New Roman"/>
+          <w:w w:val="110"/>
+          <w:szCs w:val="22"/>
+        </w:rPr>
+        <w:t xml:space="preserve">Makridakis, S., Spiliotis, E. and Assimakopoulos, V. (2018) </w:t>
+      </w:r>
+      <w:r>
+        <w:rPr>
+          <w:rFonts w:ascii="Times New Roman" w:hAnsi="Times New Roman" w:cs="Times New Roman"/>
+          <w:i/>
+          <w:iCs/>
+          <w:w w:val="110"/>
+          <w:szCs w:val="22"/>
+        </w:rPr>
+        <w:t>‘The M4 Competition: Results, findings, conclusion and way forward’, International Journal of Forecasting</w:t>
+      </w:r>
+      <w:r>
+        <w:rPr>
+          <w:rFonts w:ascii="Times New Roman" w:hAnsi="Times New Roman" w:cs="Times New Roman"/>
+          <w:w w:val="110"/>
+          <w:szCs w:val="22"/>
+        </w:rPr>
+        <w:t>, 34(4), pp. 802–808.</w:t>
+      </w:r>
+    </w:p>
+    <w:p>
+      <w:pPr>
+        <w:pStyle w:val="BodyText"/>
+        <w:spacing w:after="240" w:line="287" w:lineRule="exact"/>
+        <w:ind w:left="528" w:rightChars="388" w:right="854" w:hangingChars="200" w:hanging="528"/>
+        <w:jc w:val="both"/>
+        <w:rPr>
+          <w:rFonts w:ascii="Times New Roman" w:hAnsi="Times New Roman" w:cs="Times New Roman"/>
+          <w:w w:val="110"/>
+          <w:szCs w:val="22"/>
+        </w:rPr>
+      </w:pPr>
+      <w:r>
+        <w:rPr>
+          <w:rFonts w:ascii="Times New Roman" w:hAnsi="Times New Roman" w:cs="Times New Roman"/>
+          <w:w w:val="110"/>
+          <w:szCs w:val="22"/>
+        </w:rPr>
+        <w:t>Marino, D.L., Amarasinghe, K. and Manic, M. (2016)</w:t>
+      </w:r>
+      <w:r>
+        <w:rPr>
+          <w:rFonts w:ascii="Times New Roman" w:hAnsi="Times New Roman" w:cs="Times New Roman"/>
+          <w:w w:val="110"/>
+          <w:szCs w:val="22"/>
+        </w:rPr>
+        <w:t xml:space="preserve"> </w:t>
+      </w:r>
+      <w:r>
+        <w:rPr>
+          <w:rFonts w:ascii="Times New Roman" w:hAnsi="Times New Roman" w:cs="Times New Roman"/>
+          <w:w w:val="110"/>
+          <w:szCs w:val="22"/>
+        </w:rPr>
+        <w:t>‘Building energy load forecasting using deep neural networks’,</w:t>
+      </w:r>
+      <w:r>
+        <w:rPr>
+          <w:rFonts w:ascii="Times New Roman" w:hAnsi="Times New Roman" w:cs="Times New Roman"/>
+          <w:i/>
+          <w:iCs/>
+          <w:w w:val="110"/>
+          <w:szCs w:val="22"/>
+        </w:rPr>
+        <w:t xml:space="preserve"> </w:t>
+      </w:r>
+      <w:r>
+        <w:rPr>
+          <w:rFonts w:ascii="Times New Roman" w:hAnsi="Times New Roman" w:cs="Times New Roman"/>
+          <w:w w:val="110"/>
+          <w:szCs w:val="22"/>
+        </w:rPr>
+        <w:t>In:</w:t>
+      </w:r>
+      <w:r>
+        <w:rPr>
+          <w:rFonts w:ascii="Times New Roman" w:hAnsi="Times New Roman" w:cs="Times New Roman"/>
+          <w:i/>
+          <w:iCs/>
+          <w:w w:val="110"/>
+          <w:szCs w:val="22"/>
+        </w:rPr>
+        <w:t xml:space="preserve"> </w:t>
+      </w:r>
+      <w:r>
+        <w:rPr>
+          <w:rFonts w:ascii="Times New Roman" w:hAnsi="Times New Roman" w:cs="Times New Roman"/>
+          <w:i/>
+          <w:iCs/>
+          <w:w w:val="110"/>
+          <w:szCs w:val="22"/>
+        </w:rPr>
+        <w:t>Proceedings of the IEEE Industrial Electronics Conference (IECON)</w:t>
+      </w:r>
+      <w:r>
+        <w:rPr>
+          <w:rFonts w:ascii="Times New Roman" w:hAnsi="Times New Roman" w:cs="Times New Roman"/>
+          <w:w w:val="110"/>
+          <w:szCs w:val="22"/>
+        </w:rPr>
+        <w:t>, pp. 7046–7051.</w:t>
+      </w:r>
+    </w:p>
+    <w:p>
+      <w:pPr>
+        <w:pStyle w:val="BodyText"/>
+        <w:spacing w:after="240" w:line="287" w:lineRule="exact"/>
+        <w:ind w:left="528" w:rightChars="388" w:right="854" w:hangingChars="200" w:hanging="528"/>
+        <w:jc w:val="both"/>
+        <w:rPr>
+          <w:rFonts w:ascii="Times New Roman" w:hAnsi="Times New Roman" w:cs="Times New Roman"/>
+          <w:w w:val="110"/>
+          <w:szCs w:val="22"/>
+        </w:rPr>
+      </w:pPr>
+    </w:p>
+    <w:p>
+      <w:pPr>
+        <w:pStyle w:val="BodyText"/>
+        <w:spacing w:after="240" w:line="287" w:lineRule="exact"/>
+        <w:ind w:left="528" w:rightChars="388" w:right="854" w:hangingChars="200" w:hanging="528"/>
+        <w:jc w:val="both"/>
+        <w:rPr>
+          <w:rFonts w:ascii="Times New Roman" w:hAnsi="Times New Roman" w:cs="Times New Roman"/>
+          <w:w w:val="110"/>
+          <w:szCs w:val="22"/>
+        </w:rPr>
+      </w:pPr>
+      <w:r>
+        <w:rPr>
+          <w:rFonts w:ascii="Times New Roman" w:hAnsi="Times New Roman" w:cs="Times New Roman"/>
+          <w:w w:val="110"/>
+          <w:szCs w:val="22"/>
+        </w:rPr>
+        <w:t>Nie, Y. et al. (2023) ‘A time series is worth 64 words: Long-term forecasting with transformers’,</w:t>
+      </w:r>
+      <w:r>
+        <w:rPr>
+          <w:rFonts w:ascii="Times New Roman" w:hAnsi="Times New Roman" w:cs="Times New Roman"/>
+          <w:i/>
+          <w:iCs/>
+          <w:w w:val="110"/>
+          <w:szCs w:val="22"/>
+        </w:rPr>
+        <w:t xml:space="preserve"> </w:t>
+      </w:r>
+      <w:r>
+        <w:rPr>
+          <w:rFonts w:ascii="Times New Roman" w:hAnsi="Times New Roman" w:cs="Times New Roman"/>
+          <w:w w:val="110"/>
+          <w:szCs w:val="22"/>
+        </w:rPr>
+        <w:t>In:</w:t>
+      </w:r>
+      <w:r>
+        <w:rPr>
+          <w:rFonts w:ascii="Times New Roman" w:hAnsi="Times New Roman" w:cs="Times New Roman"/>
+          <w:i/>
+          <w:iCs/>
+          <w:w w:val="110"/>
+          <w:szCs w:val="22"/>
+        </w:rPr>
+        <w:t xml:space="preserve"> </w:t>
+      </w:r>
+      <w:r>
+        <w:rPr>
+          <w:rFonts w:ascii="Times New Roman" w:hAnsi="Times New Roman" w:cs="Times New Roman"/>
+          <w:i/>
+          <w:iCs/>
+          <w:w w:val="110"/>
+          <w:szCs w:val="22"/>
+        </w:rPr>
+        <w:t>Proceedings of the International Conference on Learning Representations (ICLR)</w:t>
+      </w:r>
+      <w:r>
+        <w:rPr>
+          <w:rFonts w:ascii="Times New Roman" w:hAnsi="Times New Roman" w:cs="Times New Roman"/>
+          <w:w w:val="110"/>
+          <w:szCs w:val="22"/>
+        </w:rPr>
+        <w:t>.</w:t>
+      </w:r>
+    </w:p>
+    <w:p>
+      <w:pPr>
+        <w:pStyle w:val="BodyText"/>
+        <w:spacing w:after="240" w:line="287" w:lineRule="exact"/>
+        <w:ind w:left="528" w:rightChars="388" w:right="854" w:hangingChars="200" w:hanging="528"/>
+        <w:jc w:val="both"/>
+        <w:rPr>
+          <w:rFonts w:ascii="Times New Roman" w:hAnsi="Times New Roman" w:cs="Times New Roman"/>
+          <w:w w:val="110"/>
+          <w:szCs w:val="22"/>
+        </w:rPr>
+      </w:pPr>
+      <w:r>
+        <w:rPr>
+          <w:rFonts w:ascii="Times New Roman" w:hAnsi="Times New Roman" w:cs="Times New Roman"/>
+          <w:w w:val="110"/>
+          <w:szCs w:val="22"/>
+        </w:rPr>
+        <w:t>Pe</w:t>
+      </w:r>
+      <w:r>
+        <w:rPr>
+          <w:rFonts w:ascii="Times New Roman" w:hAnsi="Times New Roman" w:cs="Times New Roman"/>
+          <w:w w:val="110"/>
+          <w:szCs w:val="22"/>
+        </w:rPr>
+        <w:t>k</w:t>
+      </w:r>
+      <w:r>
+        <w:rPr>
+          <w:rFonts w:ascii="Times New Roman" w:hAnsi="Times New Roman" w:cs="Times New Roman"/>
+          <w:w w:val="110"/>
+          <w:szCs w:val="22"/>
+        </w:rPr>
+        <w:t xml:space="preserve">łka, P. and Dudek, G. (2020) ‘Pattern-based LSTM for mid-term electrical load forecasting’, </w:t>
+      </w:r>
+      <w:r>
+        <w:rPr>
+          <w:rFonts w:ascii="Times New Roman" w:hAnsi="Times New Roman" w:cs="Times New Roman"/>
+          <w:i/>
+          <w:iCs/>
+          <w:w w:val="110"/>
+          <w:szCs w:val="22"/>
+        </w:rPr>
+        <w:t>arXiv</w:t>
+      </w:r>
+      <w:r>
+        <w:rPr>
+          <w:rFonts w:ascii="Times New Roman" w:hAnsi="Times New Roman" w:cs="Times New Roman"/>
+          <w:w w:val="110"/>
+          <w:szCs w:val="22"/>
+        </w:rPr>
+        <w:t xml:space="preserve">. Available at: </w:t>
+      </w:r>
+      <w:r>
+        <w:rPr>
+          <w:rFonts w:ascii="Times New Roman" w:hAnsi="Times New Roman" w:cs="Times New Roman"/>
+          <w:i/>
+          <w:iCs/>
+          <w:w w:val="110"/>
+          <w:szCs w:val="22"/>
+        </w:rPr>
+        <w:t>https://arxiv.org/abs/2004.11834</w:t>
+      </w:r>
+      <w:r>
+        <w:rPr>
+          <w:rFonts w:ascii="Times New Roman" w:hAnsi="Times New Roman" w:cs="Times New Roman"/>
+          <w:w w:val="110"/>
+          <w:szCs w:val="22"/>
+        </w:rPr>
+        <w:t xml:space="preserve"> (Accessed: 23 March 2026).</w:t>
+      </w:r>
+    </w:p>
+    <w:p>
+      <w:pPr>
+        <w:pStyle w:val="BodyText"/>
+        <w:spacing w:after="240" w:line="287" w:lineRule="exact"/>
+        <w:ind w:left="528" w:rightChars="388" w:right="854" w:hangingChars="200" w:hanging="528"/>
+        <w:jc w:val="both"/>
+        <w:rPr>
+          <w:rFonts w:ascii="Times New Roman" w:hAnsi="Times New Roman" w:cs="Times New Roman"/>
+        </w:rPr>
+      </w:pPr>
+      <w:r>
+        <w:rPr>
+          <w:rFonts w:ascii="Times New Roman" w:hAnsi="Times New Roman" w:cs="Times New Roman"/>
+          <w:w w:val="110"/>
+          <w:szCs w:val="22"/>
+        </w:rPr>
+        <w:t>Taieb, S.B. and Hyndman, R.J. (2014) ‘A gradient boosting approach to the Kaggle load forecasting competition’,</w:t>
+      </w:r>
+      <w:r>
+        <w:rPr>
+          <w:rFonts w:ascii="Times New Roman" w:hAnsi="Times New Roman" w:cs="Times New Roman"/>
+          <w:w w:val="110"/>
+          <w:szCs w:val="22"/>
+        </w:rPr>
+        <w:t xml:space="preserve"> </w:t>
+      </w:r>
+      <w:r>
+        <w:rPr>
+          <w:rFonts w:ascii="Times New Roman" w:hAnsi="Times New Roman" w:cs="Times New Roman"/>
+          <w:i/>
+          <w:iCs/>
+          <w:w w:val="110"/>
+          <w:szCs w:val="22"/>
+        </w:rPr>
+        <w:t>International Journal of Forecasting</w:t>
+      </w:r>
+      <w:r>
+        <w:rPr>
+          <w:rFonts w:ascii="Times New Roman" w:hAnsi="Times New Roman" w:cs="Times New Roman"/>
+          <w:w w:val="110"/>
+          <w:szCs w:val="22"/>
+        </w:rPr>
+        <w:t>, 30(2), pp. 382–394</w:t>
+      </w:r>
+      <w:r>
+        <w:rPr>
+          <w:rFonts w:ascii="Times New Roman" w:hAnsi="Times New Roman" w:cs="Times New Roman"/>
+        </w:rPr>
+        <w:t>.</w:t>
+      </w:r>
+    </w:p>
+    <w:p>
+      <w:pPr>
+        <w:pStyle w:val="BodyText"/>
+        <w:spacing w:after="240" w:line="287" w:lineRule="exact"/>
+        <w:ind w:left="528" w:rightChars="388" w:right="854" w:hangingChars="200" w:hanging="528"/>
+        <w:jc w:val="both"/>
+        <w:rPr>
+          <w:rFonts w:ascii="Times New Roman" w:hAnsi="Times New Roman" w:cs="Times New Roman"/>
+          <w:w w:val="110"/>
+          <w:szCs w:val="22"/>
+        </w:rPr>
+      </w:pPr>
+      <w:r>
+        <w:rPr>
+          <w:rFonts w:ascii="Times New Roman" w:hAnsi="Times New Roman" w:cs="Times New Roman"/>
+          <w:w w:val="110"/>
+          <w:szCs w:val="22"/>
+        </w:rPr>
+        <w:t>Taylor, J.W. (2003) ‘Short-term electricity demand forecasting using double seasonal exponential smoothing’,</w:t>
+      </w:r>
+      <w:r>
+        <w:rPr>
+          <w:rFonts w:ascii="Times New Roman" w:hAnsi="Times New Roman" w:cs="Times New Roman"/>
+          <w:w w:val="110"/>
+          <w:szCs w:val="22"/>
+        </w:rPr>
+        <w:t xml:space="preserve"> </w:t>
+      </w:r>
+      <w:r>
+        <w:rPr>
+          <w:rFonts w:ascii="Times New Roman" w:hAnsi="Times New Roman" w:cs="Times New Roman"/>
+          <w:i/>
+          <w:iCs/>
+          <w:w w:val="110"/>
+          <w:szCs w:val="22"/>
+        </w:rPr>
+        <w:t>Journal of the Operational Research Society</w:t>
+      </w:r>
+      <w:r>
+        <w:rPr>
+          <w:rFonts w:ascii="Times New Roman" w:hAnsi="Times New Roman" w:cs="Times New Roman"/>
+          <w:w w:val="110"/>
+          <w:szCs w:val="22"/>
+        </w:rPr>
+        <w:t>, 54(8), pp. 799–805.</w:t>
+      </w:r>
+    </w:p>
+    <w:p>
+      <w:pPr>
+        <w:pStyle w:val="BodyText"/>
+        <w:spacing w:after="240" w:line="287" w:lineRule="exact"/>
+        <w:ind w:left="528" w:rightChars="388" w:right="854" w:hangingChars="200" w:hanging="528"/>
+        <w:jc w:val="both"/>
+        <w:rPr>
+          <w:rFonts w:ascii="Times New Roman" w:hAnsi="Times New Roman" w:cs="Times New Roman"/>
+          <w:w w:val="110"/>
+          <w:szCs w:val="22"/>
+        </w:rPr>
+      </w:pPr>
+      <w:r>
+        <w:rPr>
+          <w:rFonts w:ascii="Times New Roman" w:hAnsi="Times New Roman" w:cs="Times New Roman"/>
+          <w:w w:val="110"/>
+          <w:szCs w:val="22"/>
+        </w:rPr>
+        <w:t>Vaswani, A. et al. (2017)</w:t>
+      </w:r>
+      <w:r>
+        <w:rPr>
+          <w:rFonts w:ascii="Times New Roman" w:hAnsi="Times New Roman" w:cs="Times New Roman"/>
+          <w:w w:val="110"/>
+          <w:szCs w:val="22"/>
+        </w:rPr>
+        <w:t xml:space="preserve"> </w:t>
+      </w:r>
+      <w:r>
+        <w:rPr>
+          <w:rFonts w:ascii="Times New Roman" w:hAnsi="Times New Roman" w:cs="Times New Roman"/>
+          <w:w w:val="110"/>
+          <w:szCs w:val="22"/>
+        </w:rPr>
+        <w:t xml:space="preserve">‘Attention is all you need’, </w:t>
+      </w:r>
+      <w:r>
+        <w:rPr>
+          <w:rFonts w:ascii="Times New Roman" w:hAnsi="Times New Roman" w:cs="Times New Roman"/>
+          <w:i/>
+          <w:iCs/>
+          <w:w w:val="110"/>
+          <w:szCs w:val="22"/>
+        </w:rPr>
+        <w:t>Advances in Neural Information Processing Systems (NeurIPS)</w:t>
+      </w:r>
+      <w:r>
+        <w:rPr>
+          <w:rFonts w:ascii="Times New Roman" w:hAnsi="Times New Roman" w:cs="Times New Roman"/>
+          <w:w w:val="110"/>
+          <w:szCs w:val="22"/>
+        </w:rPr>
+        <w:t>, 30, pp. 5998–6008.</w:t>
+      </w:r>
+    </w:p>
+    <w:p>
+      <w:pPr>
+        <w:pStyle w:val="BodyText"/>
+        <w:spacing w:after="240" w:line="287" w:lineRule="exact"/>
+        <w:ind w:left="480" w:rightChars="388" w:right="854" w:hangingChars="200" w:hanging="480"/>
         <w:jc w:val="both"/>
         <w:sectPr>
           <w:headerReference w:type="default" r:id="rId38"/>
@@ -17283,6 +16546,32 @@
           <w:cols w:space="720"/>
         </w:sectPr>
       </w:pPr>
+      <w:r>
+        <w:rPr>
+          <w:rFonts w:ascii="Times New Roman" w:hAnsi="Times New Roman" w:cs="Times New Roman"/>
+        </w:rPr>
+        <w:t xml:space="preserve">Zeng, A. et al. (2022) ‘Are transformers effective for time series forecasting?’, </w:t>
+      </w:r>
+      <w:r>
+        <w:rPr>
+          <w:rFonts w:ascii="Times New Roman" w:hAnsi="Times New Roman" w:cs="Times New Roman"/>
+          <w:i/>
+          <w:iCs/>
+        </w:rPr>
+        <w:t>arXiv</w:t>
+      </w:r>
+      <w:r>
+        <w:rPr>
+          <w:rFonts w:ascii="Times New Roman" w:hAnsi="Times New Roman" w:cs="Times New Roman"/>
+        </w:rPr>
+        <w:t>. Available at: https://arxiv.org/abs/2205.13504 (Accessed: 23 March 2026).</w:t>
+      </w:r>
+      <w:r>
+        <w:rPr>
+          <w:noProof/>
+        </w:rPr>
+        <w:t xml:space="preserve"> </w:t>
+      </w:r>
     </w:p>
     <w:p>
       <w:pPr>
@@ -17323,11 +16612,9 @@
         </w:rPr>
         <w:t xml:space="preserve"> </w:t>
       </w:r>
-      <w:proofErr w:type="gramStart"/>
       <w:r>
         <w:t>you</w:t>
       </w:r>
-      <w:proofErr w:type="gramEnd"/>
       <w:r>
         <w:rPr>
           <w:spacing w:val="32"/>
@@ -17502,14 +16789,12 @@
         </w:rPr>
         <w:t xml:space="preserve"> </w:t>
       </w:r>
-      <w:proofErr w:type="spellStart"/>
       <w:r>
         <w:rPr>
           <w:w w:val="110"/>
         </w:rPr>
         <w:t>crete</w:t>
       </w:r>
-      <w:proofErr w:type="spellEnd"/>
       <w:r>
         <w:rPr>
           <w:spacing w:val="-11"/>
@@ -17536,7 +16821,6 @@
         </w:rPr>
         <w:t>sim-</w:t>
       </w:r>
-      <w:proofErr w:type="spellStart"/>
       <w:r>
         <w:rPr>
           <w:spacing w:val="-2"/>
@@ -17544,7 +16828,6 @@
         </w:rPr>
         <w:t>ple</w:t>
       </w:r>
-      <w:proofErr w:type="spellEnd"/>
       <w:r>
         <w:rPr>
           <w:spacing w:val="-7"/>
@@ -18058,7 +17341,6 @@
                 <w:sz w:val="24"/>
               </w:rPr>
             </w:pPr>
-            <w:proofErr w:type="gramStart"/>
             <w:r>
               <w:rPr>
                 <w:spacing w:val="-2"/>
@@ -18067,7 +17349,6 @@
               </w:rPr>
               <w:t>right-aligned</w:t>
             </w:r>
-            <w:proofErr w:type="gramEnd"/>
           </w:p>
         </w:tc>
         <w:tc>
@@ -18246,7 +17527,7 @@
               <v:stroke joinstyle="miter"/>
               <v:path gradientshapeok="t" o:connecttype="rect"/>
             </v:shapetype>
-            <v:shape id="Textbox 5" o:spid="_x0000_s1038" type="#_x0000_t202" style="position:absolute;margin-left:321.05pt;margin-top:780.5pt;width:10.25pt;height:14pt;z-index:-251663360;visibility:visible;mso-wrap-style:square;mso-wrap-distance-left:0;mso-wrap-distance-top:0;mso-wrap-distance-right:0;mso-wrap-distance-bottom:0;mso-position-horizontal:absolute;mso-position-horizontal-relative:page;mso-position-vertical:absolute;mso-position-vertical-relative:page;v-text-anchor:top" o:gfxdata="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" filled="f" stroked="f">
+            <v:shape id="Textbox 5" o:spid="_x0000_s1038" type="#_x0000_t202" style="position:absolute;margin-left:321.05pt;margin-top:780.5pt;width:10.25pt;height:14pt;z-index:-251663360;visibility:visible;mso-wrap-style:square;mso-wrap-distance-left:0;mso-wrap-distance-top:0;mso-wrap-distance-right:0;mso-wrap-distance-bottom:0;mso-position-horizontal:absolute;mso-position-horizontal-relative:page;mso-position-vertical:absolute;mso-position-vertical-relative:page;v-text-anchor:top" o:gfxdata="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" filled="f" stroked="f">
               <v:textbox inset="0,0,0,0">
                 <w:txbxContent>
                   <w:p>
@@ -18407,7 +17688,7 @@
               <v:stroke joinstyle="miter"/>
               <v:path gradientshapeok="t" o:connecttype="rect"/>
             </v:shapetype>
-            <v:shape id="Textbox 125" o:spid="_x0000_s1049" type="#_x0000_t202" style="position:absolute;margin-left:319.75pt;margin-top:780.5pt;width:12.85pt;height:14pt;z-index:-16058880;visibility:visible;mso-wrap-style:square;mso-wrap-distance-left:0;mso-wrap-distance-top:0;mso-wrap-distance-right:0;mso-wrap-distance-bottom:0;mso-position-horizontal:absolute;mso-position-horizontal-relative:page;mso-position-vertical:absolute;mso-position-vertical-relative:page;v-text-anchor:top" o:gfxdata="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" filled="f" stroked="f">
+            <v:shape id="Textbox 125" o:spid="_x0000_s1049" type="#_x0000_t202" style="position:absolute;margin-left:319.75pt;margin-top:780.5pt;width:12.85pt;height:14pt;z-index:-16058880;visibility:visible;mso-wrap-style:square;mso-wrap-distance-left:0;mso-wrap-distance-top:0;mso-wrap-distance-right:0;mso-wrap-distance-bottom:0;mso-position-horizontal:absolute;mso-position-horizontal-relative:page;mso-position-vertical:absolute;mso-position-vertical-relative:page;v-text-anchor:top" o:gfxdata="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" filled="f" stroked="f">
               <v:textbox inset="0,0,0,0">
                 <w:txbxContent>
                   <w:p>
@@ -18563,7 +17844,7 @@
               <v:stroke joinstyle="miter"/>
               <v:path gradientshapeok="t" o:connecttype="rect"/>
             </v:shapetype>
-            <v:shape id="Textbox 132" o:spid="_x0000_s1051" type="#_x0000_t202" style="position:absolute;margin-left:319.75pt;margin-top:780.5pt;width:12.85pt;height:14pt;z-index:-16056832;visibility:visible;mso-wrap-style:square;mso-wrap-distance-left:0;mso-wrap-distance-top:0;mso-wrap-distance-right:0;mso-wrap-distance-bottom:0;mso-position-horizontal:absolute;mso-position-horizontal-relative:page;mso-position-vertical:absolute;mso-position-vertical-relative:page;v-text-anchor:top" o:gfxdata="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" filled="f" stroked="f">
+            <v:shape id="Textbox 132" o:spid="_x0000_s1051" type="#_x0000_t202" style="position:absolute;margin-left:319.75pt;margin-top:780.5pt;width:12.85pt;height:14pt;z-index:-16056832;visibility:visible;mso-wrap-style:square;mso-wrap-distance-left:0;mso-wrap-distance-top:0;mso-wrap-distance-right:0;mso-wrap-distance-bottom:0;mso-position-horizontal:absolute;mso-position-horizontal-relative:page;mso-position-vertical:absolute;mso-position-vertical-relative:page;v-text-anchor:top" o:gfxdata="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" filled="f" stroked="f">
               <v:textbox inset="0,0,0,0">
                 <w:txbxContent>
                   <w:p>
@@ -18719,7 +18000,7 @@
               <v:stroke joinstyle="miter"/>
               <v:path gradientshapeok="t" o:connecttype="rect"/>
             </v:shapetype>
-            <v:shape id="Textbox 136" o:spid="_x0000_s1053" type="#_x0000_t202" style="position:absolute;margin-left:316.85pt;margin-top:780.5pt;width:18.75pt;height:14pt;z-index:-16054784;visibility:visible;mso-wrap-style:square;mso-wrap-distance-left:0;mso-wrap-distance-top:0;mso-wrap-distance-right:0;mso-wrap-distance-bottom:0;mso-position-horizontal:absolute;mso-position-horizontal-relative:page;mso-position-vertical:absolute;mso-position-vertical-relative:page;v-text-anchor:top" o:gfxdata="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" filled="f" stroked="f">
+            <v:shape id="Textbox 136" o:spid="_x0000_s1053" type="#_x0000_t202" style="position:absolute;margin-left:316.85pt;margin-top:780.5pt;width:18.75pt;height:14pt;z-index:-16054784;visibility:visible;mso-wrap-style:square;mso-wrap-distance-left:0;mso-wrap-distance-top:0;mso-wrap-distance-right:0;mso-wrap-distance-bottom:0;mso-position-horizontal:absolute;mso-position-horizontal-relative:page;mso-position-vertical:absolute;mso-position-vertical-relative:page;v-text-anchor:top" o:gfxdata="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" filled="f" stroked="f">
               <v:textbox inset="0,0,0,0">
                 <w:txbxContent>
                   <w:p>
@@ -18880,7 +18161,7 @@
               <v:stroke joinstyle="miter"/>
               <v:path gradientshapeok="t" o:connecttype="rect"/>
             </v:shapetype>
-            <v:shape id="Textbox 13" o:spid="_x0000_s1040" type="#_x0000_t202" style="position:absolute;margin-left:317.8pt;margin-top:780.5pt;width:16.8pt;height:14pt;z-index:-251642880;visibility:visible;mso-wrap-style:square;mso-wrap-distance-left:0;mso-wrap-distance-top:0;mso-wrap-distance-right:0;mso-wrap-distance-bottom:0;mso-position-horizontal:absolute;mso-position-horizontal-relative:page;mso-position-vertical:absolute;mso-position-vertical-relative:page;v-text-anchor:top" o:gfxdata="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" filled="f" stroked="f">
+            <v:shape id="Textbox 13" o:spid="_x0000_s1040" type="#_x0000_t202" style="position:absolute;margin-left:317.8pt;margin-top:780.5pt;width:16.8pt;height:14pt;z-index:-251642880;visibility:visible;mso-wrap-style:square;mso-wrap-distance-left:0;mso-wrap-distance-top:0;mso-wrap-distance-right:0;mso-wrap-distance-bottom:0;mso-position-horizontal:absolute;mso-position-horizontal-relative:page;mso-position-vertical:absolute;mso-position-vertical-relative:page;v-text-anchor:top" o:gfxdata="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" filled="f" stroked="f">
               <v:textbox inset="0,0,0,0">
                 <w:txbxContent>
                   <w:p>
@@ -19046,7 +18327,7 @@
               <v:stroke joinstyle="miter"/>
               <v:path gradientshapeok="t" o:connecttype="rect"/>
             </v:shapetype>
-            <v:shape id="Textbox 18" o:spid="_x0000_s1042" type="#_x0000_t202" style="position:absolute;margin-left:318pt;margin-top:780.5pt;width:16.45pt;height:14pt;z-index:-16073728;visibility:visible;mso-wrap-style:square;mso-wrap-distance-left:0;mso-wrap-distance-top:0;mso-wrap-distance-right:0;mso-wrap-distance-bottom:0;mso-position-horizontal:absolute;mso-position-horizontal-relative:page;mso-position-vertical:absolute;mso-position-vertical-relative:page;v-text-anchor:top" o:gfxdata="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" filled="f" stroked="f">
+            <v:shape id="Textbox 18" o:spid="_x0000_s1042" type="#_x0000_t202" style="position:absolute;margin-left:318pt;margin-top:780.5pt;width:16.45pt;height:14pt;z-index:-16073728;visibility:visible;mso-wrap-style:square;mso-wrap-distance-left:0;mso-wrap-distance-top:0;mso-wrap-distance-right:0;mso-wrap-distance-bottom:0;mso-position-horizontal:absolute;mso-position-horizontal-relative:page;mso-position-vertical:absolute;mso-position-vertical-relative:page;v-text-anchor:top" o:gfxdata="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" filled="f" stroked="f">
               <v:textbox inset="0,0,0,0">
                 <w:txbxContent>
                   <w:p>
@@ -19207,7 +18488,7 @@
               <v:stroke joinstyle="miter"/>
               <v:path gradientshapeok="t" o:connecttype="rect"/>
             </v:shapetype>
-            <v:shape id="Textbox 22" o:spid="_x0000_s1043" type="#_x0000_t202" style="position:absolute;margin-left:319.75pt;margin-top:780.5pt;width:12.85pt;height:14pt;z-index:-16071680;visibility:visible;mso-wrap-style:square;mso-wrap-distance-left:0;mso-wrap-distance-top:0;mso-wrap-distance-right:0;mso-wrap-distance-bottom:0;mso-position-horizontal:absolute;mso-position-horizontal-relative:page;mso-position-vertical:absolute;mso-position-vertical-relative:page;v-text-anchor:top" o:gfxdata="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" filled="f" stroked="f">
+            <v:shape id="Textbox 22" o:spid="_x0000_s1043" type="#_x0000_t202" style="position:absolute;margin-left:319.75pt;margin-top:780.5pt;width:12.85pt;height:14pt;z-index:-16071680;visibility:visible;mso-wrap-style:square;mso-wrap-distance-left:0;mso-wrap-distance-top:0;mso-wrap-distance-right:0;mso-wrap-distance-bottom:0;mso-position-horizontal:absolute;mso-position-horizontal-relative:page;mso-position-vertical:absolute;mso-position-vertical-relative:page;v-text-anchor:top" o:gfxdata="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" filled="f" stroked="f">
               <v:textbox inset="0,0,0,0">
                 <w:txbxContent>
                   <w:p>
@@ -19363,7 +18644,7 @@
               <v:stroke joinstyle="miter"/>
               <v:path gradientshapeok="t" o:connecttype="rect"/>
             </v:shapetype>
-            <v:shape id="Textbox 26" o:spid="_x0000_s1044" type="#_x0000_t202" style="position:absolute;margin-left:319.75pt;margin-top:780.5pt;width:12.85pt;height:14pt;z-index:-16069632;visibility:visible;mso-wrap-style:square;mso-wrap-distance-left:0;mso-wrap-distance-top:0;mso-wrap-distance-right:0;mso-wrap-distance-bottom:0;mso-position-horizontal:absolute;mso-position-horizontal-relative:page;mso-position-vertical:absolute;mso-position-vertical-relative:page;v-text-anchor:top" o:gfxdata="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" filled="f" stroked="f">
+            <v:shape id="Textbox 26" o:spid="_x0000_s1044" type="#_x0000_t202" style="position:absolute;margin-left:319.75pt;margin-top:780.5pt;width:12.85pt;height:14pt;z-index:-16069632;visibility:visible;mso-wrap-style:square;mso-wrap-distance-left:0;mso-wrap-distance-top:0;mso-wrap-distance-right:0;mso-wrap-distance-bottom:0;mso-position-horizontal:absolute;mso-position-horizontal-relative:page;mso-position-vertical:absolute;mso-position-vertical-relative:page;v-text-anchor:top" o:gfxdata="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" filled="f" stroked="f">
               <v:textbox inset="0,0,0,0">
                 <w:txbxContent>
                   <w:p>
@@ -19519,7 +18800,7 @@
               <v:stroke joinstyle="miter"/>
               <v:path gradientshapeok="t" o:connecttype="rect"/>
             </v:shapetype>
-            <v:shape id="Textbox 30" o:spid="_x0000_s1045" type="#_x0000_t202" style="position:absolute;margin-left:319.75pt;margin-top:780.5pt;width:12.85pt;height:14pt;z-index:-16067584;visibility:visible;mso-wrap-style:square;mso-wrap-distance-left:0;mso-wrap-distance-top:0;mso-wrap-distance-right:0;mso-wrap-distance-bottom:0;mso-position-horizontal:absolute;mso-position-horizontal-relative:page;mso-position-vertical:absolute;mso-position-vertical-relative:page;v-text-anchor:top" o:gfxdata="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" filled="f" stroked="f">
+            <v:shape id="Textbox 30" o:spid="_x0000_s1045" type="#_x0000_t202" style="position:absolute;margin-left:319.75pt;margin-top:780.5pt;width:12.85pt;height:14pt;z-index:-16067584;visibility:visible;mso-wrap-style:square;mso-wrap-distance-left:0;mso-wrap-distance-top:0;mso-wrap-distance-right:0;mso-wrap-distance-bottom:0;mso-position-horizontal:absolute;mso-position-horizontal-relative:page;mso-position-vertical:absolute;mso-position-vertical-relative:page;v-text-anchor:top" o:gfxdata="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" filled="f" stroked="f">
               <v:textbox inset="0,0,0,0">
                 <w:txbxContent>
                   <w:p>
@@ -19675,7 +18956,7 @@
               <v:stroke joinstyle="miter"/>
               <v:path gradientshapeok="t" o:connecttype="rect"/>
             </v:shapetype>
-            <v:shape id="Textbox 34" o:spid="_x0000_s1046" type="#_x0000_t202" style="position:absolute;margin-left:319.75pt;margin-top:780.5pt;width:12.85pt;height:14pt;z-index:-16065536;visibility:visible;mso-wrap-style:square;mso-wrap-distance-left:0;mso-wrap-distance-top:0;mso-wrap-distance-right:0;mso-wrap-distance-bottom:0;mso-position-horizontal:absolute;mso-position-horizontal-relative:page;mso-position-vertical:absolute;mso-position-vertical-relative:page;v-text-anchor:top" o:gfxdata="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" filled="f" stroked="f">
+            <v:shape id="Textbox 34" o:spid="_x0000_s1046" type="#_x0000_t202" style="position:absolute;margin-left:319.75pt;margin-top:780.5pt;width:12.85pt;height:14pt;z-index:-16065536;visibility:visible;mso-wrap-style:square;mso-wrap-distance-left:0;mso-wrap-distance-top:0;mso-wrap-distance-right:0;mso-wrap-distance-bottom:0;mso-position-horizontal:absolute;mso-position-horizontal-relative:page;mso-position-vertical:absolute;mso-position-vertical-relative:page;v-text-anchor:top" o:gfxdata="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" filled="f" stroked="f">
               <v:textbox inset="0,0,0,0">
                 <w:txbxContent>
                   <w:p>
@@ -19831,7 +19112,7 @@
               <v:stroke joinstyle="miter"/>
               <v:path gradientshapeok="t" o:connecttype="rect"/>
             </v:shapetype>
-            <v:shape id="Textbox 117" o:spid="_x0000_s1047" type="#_x0000_t202" style="position:absolute;margin-left:319.75pt;margin-top:780.5pt;width:12.85pt;height:14pt;z-index:-16062976;visibility:visible;mso-wrap-style:square;mso-wrap-distance-left:0;mso-wrap-distance-top:0;mso-wrap-distance-right:0;mso-wrap-distance-bottom:0;mso-position-horizontal:absolute;mso-position-horizontal-relative:page;mso-position-vertical:absolute;mso-position-vertical-relative:page;v-text-anchor:top" o:gfxdata="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" filled="f" stroked="f">
+            <v:shape id="Textbox 117" o:spid="_x0000_s1047" type="#_x0000_t202" style="position:absolute;margin-left:319.75pt;margin-top:780.5pt;width:12.85pt;height:14pt;z-index:-16062976;visibility:visible;mso-wrap-style:square;mso-wrap-distance-left:0;mso-wrap-distance-top:0;mso-wrap-distance-right:0;mso-wrap-distance-bottom:0;mso-position-horizontal:absolute;mso-position-horizontal-relative:page;mso-position-vertical:absolute;mso-position-vertical-relative:page;v-text-anchor:top" o:gfxdata="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" filled="f" stroked="f">
               <v:textbox inset="0,0,0,0">
                 <w:txbxContent>
                   <w:p>
@@ -19987,7 +19268,7 @@
               <v:stroke joinstyle="miter"/>
               <v:path gradientshapeok="t" o:connecttype="rect"/>
             </v:shapetype>
-            <v:shape id="Textbox 121" o:spid="_x0000_s1048" type="#_x0000_t202" style="position:absolute;margin-left:319.75pt;margin-top:780.5pt;width:12.85pt;height:14pt;z-index:-16060928;visibility:visible;mso-wrap-style:square;mso-wrap-distance-left:0;mso-wrap-distance-top:0;mso-wrap-distance-right:0;mso-wrap-distance-bottom:0;mso-position-horizontal:absolute;mso-position-horizontal-relative:page;mso-position-vertical:absolute;mso-position-vertical-relative:page;v-text-anchor:top" o:gfxdata="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" filled="f" stroked="f">
+            <v:shape id="Textbox 121" o:spid="_x0000_s1048" type="#_x0000_t202" style="position:absolute;margin-left:319.75pt;margin-top:780.5pt;width:12.85pt;height:14pt;z-index:-16060928;visibility:visible;mso-wrap-style:square;mso-wrap-distance-left:0;mso-wrap-distance-top:0;mso-wrap-distance-right:0;mso-wrap-distance-bottom:0;mso-position-horizontal:absolute;mso-position-horizontal-relative:page;mso-position-vertical:absolute;mso-position-vertical-relative:page;v-text-anchor:top" o:gfxdata="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" filled="f" stroked="f">
               <v:textbox inset="0,0,0,0">
                 <w:txbxContent>
                   <w:p>
@@ -20314,7 +19595,7 @@
               <v:stroke joinstyle="miter"/>
               <v:path gradientshapeok="t" o:connecttype="rect"/>
             </v:shapetype>
-            <v:shape id="Textbox 4" o:spid="_x0000_s1037" type="#_x0000_t202" style="position:absolute;margin-left:251.6pt;margin-top:138.05pt;width:148.2pt;height:19.25pt;z-index:-251666432;visibility:visible;mso-wrap-style:square;mso-wrap-distance-left:0;mso-wrap-distance-top:0;mso-wrap-distance-right:0;mso-wrap-distance-bottom:0;mso-position-horizontal:absolute;mso-position-horizontal-relative:page;mso-position-vertical:absolute;mso-position-vertical-relative:page;v-text-anchor:top" o:gfxdata="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" filled="f" stroked="f">
+            <v:shape id="Textbox 4" o:spid="_x0000_s1037" type="#_x0000_t202" style="position:absolute;margin-left:251.6pt;margin-top:138.05pt;width:148.2pt;height:19.25pt;z-index:-251666432;visibility:visible;mso-wrap-style:square;mso-wrap-distance-left:0;mso-wrap-distance-top:0;mso-wrap-distance-right:0;mso-wrap-distance-bottom:0;mso-position-horizontal:absolute;mso-position-horizontal-relative:page;mso-position-vertical:absolute;mso-position-vertical-relative:page;v-text-anchor:top" o:gfxdata="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" filled="f" stroked="f">
               <v:textbox inset="0,0,0,0">
                 <w:txbxContent>
                   <w:p>
@@ -20615,7 +19896,7 @@
               <v:stroke joinstyle="miter"/>
               <v:path gradientshapeok="t" o:connecttype="rect"/>
             </v:shapetype>
-            <v:shape id="Textbox 131" o:spid="_x0000_s1050" type="#_x0000_t202" style="position:absolute;margin-left:288.45pt;margin-top:138.05pt;width:74.55pt;height:19.25pt;z-index:-16057344;visibility:visible;mso-wrap-style:square;mso-wrap-distance-left:0;mso-wrap-distance-top:0;mso-wrap-distance-right:0;mso-wrap-distance-bottom:0;mso-position-horizontal:absolute;mso-position-horizontal-relative:page;mso-position-vertical:absolute;mso-position-vertical-relative:page;v-text-anchor:top" o:gfxdata="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" filled="f" stroked="f">
+            <v:shape id="Textbox 131" o:spid="_x0000_s1050" type="#_x0000_t202" style="position:absolute;margin-left:288.45pt;margin-top:138.05pt;width:74.55pt;height:19.25pt;z-index:-16057344;visibility:visible;mso-wrap-style:square;mso-wrap-distance-left:0;mso-wrap-distance-top:0;mso-wrap-distance-right:0;mso-wrap-distance-bottom:0;mso-position-horizontal:absolute;mso-position-horizontal-relative:page;mso-position-vertical:absolute;mso-position-vertical-relative:page;v-text-anchor:top" o:gfxdata="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" filled="f" stroked="f">
               <v:textbox inset="0,0,0,0">
                 <w:txbxContent>
                   <w:p>
@@ -20889,7 +20170,7 @@
               <v:stroke joinstyle="miter"/>
               <v:path gradientshapeok="t" o:connecttype="rect"/>
             </v:shapetype>
-            <v:shape id="Textbox 135" o:spid="_x0000_s1052" type="#_x0000_t202" style="position:absolute;margin-left:291.1pt;margin-top:138.05pt;width:69.25pt;height:19.25pt;z-index:-16055296;visibility:visible;mso-wrap-style:square;mso-wrap-distance-left:0;mso-wrap-distance-top:0;mso-wrap-distance-right:0;mso-wrap-distance-bottom:0;mso-position-horizontal:absolute;mso-position-horizontal-relative:page;mso-position-vertical:absolute;mso-position-vertical-relative:page;v-text-anchor:top" o:gfxdata="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" filled="f" stroked="f">
+            <v:shape id="Textbox 135" o:spid="_x0000_s1052" type="#_x0000_t202" style="position:absolute;margin-left:291.1pt;margin-top:138.05pt;width:69.25pt;height:19.25pt;z-index:-16055296;visibility:visible;mso-wrap-style:square;mso-wrap-distance-left:0;mso-wrap-distance-top:0;mso-wrap-distance-right:0;mso-wrap-distance-bottom:0;mso-position-horizontal:absolute;mso-position-horizontal-relative:page;mso-position-vertical:absolute;mso-position-vertical-relative:page;v-text-anchor:top" o:gfxdata="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" filled="f" stroked="f">
               <v:textbox inset="0,0,0,0">
                 <w:txbxContent>
                   <w:p>
@@ -21164,7 +20445,7 @@
               <v:stroke joinstyle="miter"/>
               <v:path gradientshapeok="t" o:connecttype="rect"/>
             </v:shapetype>
-            <v:shape id="Textbox 12" o:spid="_x0000_s1039" type="#_x0000_t202" style="position:absolute;margin-left:294.65pt;margin-top:138.05pt;width:62.1pt;height:19.25pt;z-index:-251644928;visibility:visible;mso-wrap-style:square;mso-wrap-distance-left:0;mso-wrap-distance-top:0;mso-wrap-distance-right:0;mso-wrap-distance-bottom:0;mso-position-horizontal:absolute;mso-position-horizontal-relative:page;mso-position-vertical:absolute;mso-position-vertical-relative:page;v-text-anchor:top" o:gfxdata="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" filled="f" stroked="f">
+            <v:shape id="Textbox 12" o:spid="_x0000_s1039" type="#_x0000_t202" style="position:absolute;margin-left:294.65pt;margin-top:138.05pt;width:62.1pt;height:19.25pt;z-index:-251644928;visibility:visible;mso-wrap-style:square;mso-wrap-distance-left:0;mso-wrap-distance-top:0;mso-wrap-distance-right:0;mso-wrap-distance-bottom:0;mso-position-horizontal:absolute;mso-position-horizontal-relative:page;mso-position-vertical:absolute;mso-position-vertical-relative:page;v-text-anchor:top" o:gfxdata="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" filled="f" stroked="f">
               <v:textbox inset="0,0,0,0">
                 <w:txbxContent>
                   <w:p>
@@ -21439,7 +20720,7 @@
               <v:stroke joinstyle="miter"/>
               <v:path gradientshapeok="t" o:connecttype="rect"/>
             </v:shapetype>
-            <v:shape id="Textbox 17" o:spid="_x0000_s1041" type="#_x0000_t202" style="position:absolute;margin-left:293.95pt;margin-top:138.05pt;width:63.5pt;height:19.25pt;z-index:-16074240;visibility:visible;mso-wrap-style:square;mso-wrap-distance-left:0;mso-wrap-distance-top:0;mso-wrap-distance-right:0;mso-wrap-distance-bottom:0;mso-position-horizontal:absolute;mso-position-horizontal-relative:page;mso-position-vertical:absolute;mso-position-vertical-relative:page;v-text-anchor:top" o:gfxdata="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" filled="f" stroked="f">
+            <v:shape id="Textbox 17" o:spid="_x0000_s1041" type="#_x0000_t202" style="position:absolute;margin-left:293.95pt;margin-top:138.05pt;width:63.5pt;height:19.25pt;z-index:-16074240;visibility:visible;mso-wrap-style:square;mso-wrap-distance-left:0;mso-wrap-distance-top:0;mso-wrap-distance-right:0;mso-wrap-distance-bottom:0;mso-position-horizontal:absolute;mso-position-horizontal-relative:page;mso-position-vertical:absolute;mso-position-vertical-relative:page;v-text-anchor:top" o:gfxdata="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" filled="f" stroked="f">
               <v:textbox inset="0,0,0,0">
                 <w:txbxContent>
                   <w:p>

</xml_diff>